<commit_message>
docs: add smoke evidence and initialize feature report
</commit_message>
<xml_diff>
--- a/ai/AI-02_AI_Audit_Report_Working.docx
+++ b/ai/AI-02_AI_Audit_Report_Working.docx
@@ -200,9 +200,9 @@
             <w:tcW w:w="6520" w:type="dxa"/>
           </w:tcPr>
           <w:p>
-            <w:pPr>
-              <w:cnfStyle w:val="000000100000" w:firstRow="0" w:lastRow="0" w:firstColumn="0" w:lastColumn="0" w:oddVBand="0" w:evenVBand="0" w:oddHBand="1" w:evenHBand="0" w:firstRowFirstColumn="0" w:firstRowLastColumn="0" w:lastRowFirstColumn="0" w:lastRowLastColumn="0"/>
-            </w:pPr>
+            <w:r>
+              <w:t xml:space="preserve">Nguyễn Phúc Hậu</w:t>
+            </w:r>
           </w:p>
         </w:tc>
       </w:tr>
@@ -230,9 +230,9 @@
             <w:tcW w:w="6520" w:type="dxa"/>
           </w:tcPr>
           <w:p>
-            <w:pPr>
-              <w:cnfStyle w:val="000000010000" w:firstRow="0" w:lastRow="0" w:firstColumn="0" w:lastColumn="0" w:oddVBand="0" w:evenVBand="0" w:oddHBand="0" w:evenHBand="1" w:firstRowFirstColumn="0" w:firstRowLastColumn="0" w:lastRowFirstColumn="0" w:lastRowLastColumn="0"/>
-            </w:pPr>
+            <w:r>
+              <w:t xml:space="preserve">23120252</w:t>
+            </w:r>
           </w:p>
         </w:tc>
       </w:tr>
@@ -260,9 +260,9 @@
             <w:tcW w:w="6520" w:type="dxa"/>
           </w:tcPr>
           <w:p>
-            <w:pPr>
-              <w:cnfStyle w:val="000000100000" w:firstRow="0" w:lastRow="0" w:firstColumn="0" w:lastColumn="0" w:oddVBand="0" w:evenVBand="0" w:oddHBand="1" w:evenHBand="0" w:firstRowFirstColumn="0" w:firstRowLastColumn="0" w:lastRowFirstColumn="0" w:lastRowLastColumn="0"/>
-            </w:pPr>
+            <w:r>
+              <w:t xml:space="preserve">CQ2023/31</w:t>
+            </w:r>
           </w:p>
         </w:tc>
       </w:tr>
@@ -290,9 +290,9 @@
             <w:tcW w:w="6520" w:type="dxa"/>
           </w:tcPr>
           <w:p>
-            <w:pPr>
-              <w:cnfStyle w:val="000000010000" w:firstRow="0" w:lastRow="0" w:firstColumn="0" w:lastColumn="0" w:oddVBand="0" w:evenVBand="0" w:oddHBand="0" w:evenHBand="1" w:firstRowFirstColumn="0" w:firstRowLastColumn="0" w:lastRowFirstColumn="0" w:lastRowLastColumn="0"/>
-            </w:pPr>
+            <w:r>
+              <w:t xml:space="preserve">HW#02</w:t>
+            </w:r>
           </w:p>
         </w:tc>
       </w:tr>
@@ -320,9 +320,9 @@
             <w:tcW w:w="6520" w:type="dxa"/>
           </w:tcPr>
           <w:p>
-            <w:pPr>
-              <w:cnfStyle w:val="000000100000" w:firstRow="0" w:lastRow="0" w:firstColumn="0" w:lastColumn="0" w:oddVBand="0" w:evenVBand="0" w:oddHBand="1" w:evenHBand="0" w:firstRowFirstColumn="0" w:firstRowLastColumn="0" w:lastRowFirstColumn="0" w:lastRowLastColumn="0"/>
-            </w:pPr>
+            <w:r>
+              <w:t xml:space="preserve">2026-10-09</w:t>
+            </w:r>
           </w:p>
         </w:tc>
       </w:tr>
@@ -350,9 +350,9 @@
             <w:tcW w:w="6520" w:type="dxa"/>
           </w:tcPr>
           <w:p>
-            <w:pPr>
-              <w:cnfStyle w:val="000000010000" w:firstRow="0" w:lastRow="0" w:firstColumn="0" w:lastColumn="0" w:oddVBand="0" w:evenVBand="0" w:oddHBand="0" w:evenHBand="1" w:firstRowFirstColumn="0" w:firstRowLastColumn="0" w:lastRowFirstColumn="0" w:lastRowLastColumn="0"/>
-            </w:pPr>
+            <w:r>
+              <w:t xml:space="preserve">OpenAI Codex — gpt-5.6-sol, reasoning medium</w:t>
+            </w:r>
           </w:p>
         </w:tc>
       </w:tr>
@@ -380,15 +380,8 @@
             <w:tcW w:w="6520" w:type="dxa"/>
           </w:tcPr>
           <w:p>
-            <w:pPr>
-              <w:cnfStyle w:val="000000100000" w:firstRow="0" w:lastRow="0" w:firstColumn="0" w:lastColumn="0" w:oddVBand="0" w:evenVBand="0" w:oddHBand="1" w:evenHBand="0" w:firstRowFirstColumn="0" w:firstRowLastColumn="0" w:lastRowFirstColumn="0" w:lastRowLastColumn="0"/>
-            </w:pPr>
             <w:r>
-              <w:rPr>
-                <w:rFonts w:ascii="Arial" w:hAnsi="Arial"/>
-                <w:sz w:val="21"/>
-              </w:rPr>
-              <w:t>[ ] Yes  [ ] No</w:t>
+              <w:t xml:space="preserve">[X] Yes  [ ] No</w:t>
             </w:r>
           </w:p>
         </w:tc>
@@ -890,25 +883,12 @@
           </w:tcPr>
           <w:p>
             <w:r>
-              <w:rPr>
-                <w:rFonts w:ascii="Arial" w:hAnsi="Arial"/>
-                <w:sz w:val="21"/>
-              </w:rPr>
-              <w:t>Artifact #2</w:t>
-            </w:r>
-            <w:r>
-              <w:rPr>
-                <w:rFonts w:ascii="Arial" w:hAnsi="Arial"/>
-                <w:sz w:val="21"/>
-              </w:rPr>
-              <w:br/>
-            </w:r>
-            <w:r>
-              <w:rPr>
-                <w:rFonts w:ascii="Arial" w:hAnsi="Arial"/>
-                <w:sz w:val="21"/>
-              </w:rPr>
-              <w:br/>
+              <w:t xml:space="preserve">ART014
+Artifact: ART014
+Tool: OpenAI Codex
+Model: gpt-5.6-sol; reasoning: medium
+Time: 2026-10-09T10:22:29+07:00
+Prompt: Tạo environment.md đến trước smoke test A/B/C/D và hướng dẫn thu evidence. Full prompt: S001-I012.</w:t>
             </w:r>
           </w:p>
         </w:tc>
@@ -917,9 +897,9 @@
             <w:tcW w:w="2041" w:type="dxa"/>
           </w:tcPr>
           <w:p>
-            <w:pPr>
-              <w:cnfStyle w:val="000000010000" w:firstRow="0" w:lastRow="0" w:firstColumn="0" w:lastColumn="0" w:oddVBand="0" w:evenVBand="0" w:oddHBand="0" w:evenHBand="1" w:firstRowFirstColumn="0" w:firstRowLastColumn="0" w:lastRowFirstColumn="0" w:lastRowLastColumn="0"/>
-            </w:pPr>
+            <w:r>
+              <w:t xml:space="preserve">Tạo supporting/environment.md với SUT commit, máy thực thi, runtime/framework, lệnh/URL dự kiến, trạng thái port, test data và bốn feature Not Run. Full output: S001-I012.</w:t>
+            </w:r>
           </w:p>
         </w:tc>
         <w:tc>
@@ -927,9 +907,9 @@
             <w:tcW w:w="1020" w:type="dxa"/>
           </w:tcPr>
           <w:p>
-            <w:pPr>
-              <w:cnfStyle w:val="000000010000" w:firstRow="0" w:lastRow="0" w:firstColumn="0" w:lastColumn="0" w:oddVBand="0" w:evenVBand="0" w:oddHBand="0" w:evenHBand="1" w:firstRowFirstColumn="0" w:firstRowLastColumn="0" w:lastRowFirstColumn="0" w:lastRowLastColumn="0"/>
-            </w:pPr>
+            <w:r>
+              <w:t xml:space="preserve">PENDING HUMAN REVIEW</w:t>
+            </w:r>
           </w:p>
         </w:tc>
         <w:tc>
@@ -937,9 +917,9 @@
             <w:tcW w:w="2268" w:type="dxa"/>
           </w:tcPr>
           <w:p>
-            <w:pPr>
-              <w:cnfStyle w:val="000000010000" w:firstRow="0" w:lastRow="0" w:firstColumn="0" w:lastColumn="0" w:oddVBand="0" w:evenVBand="0" w:oddHBand="0" w:evenHBand="1" w:firstRowFirstColumn="0" w:firstRowLastColumn="0" w:lastRowFirstColumn="0" w:lastRowLastColumn="0"/>
-            </w:pPr>
+            <w:r>
+              <w:t xml:space="preserve">Chờ sinh viên đối chiếu thông tin môi trường thực tế và xác nhận tài liệu không suy diễn kết quả smoke test.</w:t>
+            </w:r>
           </w:p>
         </w:tc>
         <w:tc>
@@ -947,9 +927,9 @@
             <w:tcW w:w="2154" w:type="dxa"/>
           </w:tcPr>
           <w:p>
-            <w:pPr>
-              <w:cnfStyle w:val="000000010000" w:firstRow="0" w:lastRow="0" w:firstColumn="0" w:lastColumn="0" w:oddVBand="0" w:evenVBand="0" w:oddHBand="0" w:evenHBand="1" w:firstRowFirstColumn="0" w:firstRowLastColumn="0" w:lastRowFirstColumn="0" w:lastRowLastColumn="0"/>
-            </w:pPr>
+            <w:r>
+              <w:t xml:space="preserve">Chưa có</w:t>
+            </w:r>
           </w:p>
         </w:tc>
       </w:tr>
@@ -964,25 +944,8 @@
           </w:tcPr>
           <w:p>
             <w:r>
-              <w:rPr>
-                <w:rFonts w:ascii="Arial" w:hAnsi="Arial"/>
-                <w:sz w:val="21"/>
-              </w:rPr>
-              <w:t>Artifact #3</w:t>
-            </w:r>
-            <w:r>
-              <w:rPr>
-                <w:rFonts w:ascii="Arial" w:hAnsi="Arial"/>
-                <w:sz w:val="21"/>
-              </w:rPr>
-              <w:br/>
-            </w:r>
-            <w:r>
-              <w:rPr>
-                <w:rFonts w:ascii="Arial" w:hAnsi="Arial"/>
-                <w:sz w:val="21"/>
-              </w:rPr>
-              <w:br/>
+              <w:t xml:space="preserve">ART015
+Tool: OpenAI Codex; Model: gpt-5.6-sol (medium); Time: 2026-10-09T10:53:13+07:00; Prompt: sắp xếp 5 ảnh smoke evidence theo Pool, đổi tên theo kế hoạch, đọc ngày giờ và cập nhật báo cáo; full prompt: S001-I014.</w:t>
             </w:r>
           </w:p>
         </w:tc>
@@ -991,9 +954,9 @@
             <w:tcW w:w="2041" w:type="dxa"/>
           </w:tcPr>
           <w:p>
-            <w:pPr>
-              <w:cnfStyle w:val="000000100000" w:firstRow="0" w:lastRow="0" w:firstColumn="0" w:lastColumn="0" w:oddVBand="0" w:evenVBand="0" w:oddHBand="1" w:evenHBand="0" w:firstRowFirstColumn="0" w:firstRowLastColumn="0" w:lastRowFirstColumn="0" w:lastRowLastColumn="0"/>
-            </w:pPr>
+            <w:r>
+              <w:t xml:space="preserve">Artifact evidence smoke gồm 5 ảnh tại evidence/A-D/smoke và supporting/environment.md được cập nhật với thời gian hiển thị, nền tảng, trạng thái Accessible và các quan sát cần đối chiếu; full output: S001-I014.</w:t>
+            </w:r>
           </w:p>
         </w:tc>
         <w:tc>
@@ -1001,9 +964,9 @@
             <w:tcW w:w="1020" w:type="dxa"/>
           </w:tcPr>
           <w:p>
-            <w:pPr>
-              <w:cnfStyle w:val="000000100000" w:firstRow="0" w:lastRow="0" w:firstColumn="0" w:lastColumn="0" w:oddVBand="0" w:evenVBand="0" w:oddHBand="1" w:evenHBand="0" w:firstRowFirstColumn="0" w:firstRowLastColumn="0" w:lastRowFirstColumn="0" w:lastRowLastColumn="0"/>
-            </w:pPr>
+            <w:r>
+              <w:t xml:space="preserve">PENDING HUMAN REVIEW</w:t>
+            </w:r>
           </w:p>
         </w:tc>
         <w:tc>
@@ -1011,9 +974,9 @@
             <w:tcW w:w="2268" w:type="dxa"/>
           </w:tcPr>
           <w:p>
-            <w:pPr>
-              <w:cnfStyle w:val="000000100000" w:firstRow="0" w:lastRow="0" w:firstColumn="0" w:lastColumn="0" w:oddVBand="0" w:evenVBand="0" w:oddHBand="1" w:evenHBand="0" w:firstRowFirstColumn="0" w:firstRowLastColumn="0" w:lastRowFirstColumn="0" w:lastRowLastColumn="0"/>
-            </w:pPr>
+            <w:r>
+              <w:t xml:space="preserve">Chờ sinh viên kiểm tra tên file, thời gian đọc từ ảnh và xác nhận các quan sát trước khi dùng trong báo cáo.</w:t>
+            </w:r>
           </w:p>
         </w:tc>
         <w:tc>
@@ -1021,9 +984,9 @@
             <w:tcW w:w="2154" w:type="dxa"/>
           </w:tcPr>
           <w:p>
-            <w:pPr>
-              <w:cnfStyle w:val="000000100000" w:firstRow="0" w:lastRow="0" w:firstColumn="0" w:lastColumn="0" w:oddVBand="0" w:evenVBand="0" w:oddHBand="1" w:evenHBand="0" w:firstRowFirstColumn="0" w:firstRowLastColumn="0" w:lastRowFirstColumn="0" w:lastRowLastColumn="0"/>
-            </w:pPr>
+            <w:r>
+              <w:t xml:space="preserve">Chưa có</w:t>
+            </w:r>
           </w:p>
         </w:tc>
       </w:tr>
@@ -1038,25 +1001,8 @@
           </w:tcPr>
           <w:p>
             <w:r>
-              <w:rPr>
-                <w:rFonts w:ascii="Arial" w:hAnsi="Arial"/>
-                <w:sz w:val="21"/>
-              </w:rPr>
-              <w:t>Artifact #4</w:t>
-            </w:r>
-            <w:r>
-              <w:rPr>
-                <w:rFonts w:ascii="Arial" w:hAnsi="Arial"/>
-                <w:sz w:val="21"/>
-              </w:rPr>
-              <w:br/>
-            </w:r>
-            <w:r>
-              <w:rPr>
-                <w:rFonts w:ascii="Arial" w:hAnsi="Arial"/>
-                <w:sz w:val="21"/>
-              </w:rPr>
-              <w:br/>
+              <w:t xml:space="preserve">ART016
+Tool: OpenAI Codex; Model: gpt-5.6-sol (medium); Time: 2026-10-09T11:08:32+07:00; Prompt: lấy thông tin môn học/sinh viên/giảng viên từ HW1, điền feature theo scope, chèn smoke evidence vào đầu mỗi Pool, điền thông tin cá nhân còn trống; full prompt: S001-I015.</w:t>
             </w:r>
           </w:p>
         </w:tc>
@@ -1065,9 +1011,9 @@
             <w:tcW w:w="2041" w:type="dxa"/>
           </w:tcPr>
           <w:p>
-            <w:pPr>
-              <w:cnfStyle w:val="000000010000" w:firstRow="0" w:lastRow="0" w:firstColumn="0" w:lastColumn="0" w:oddVBand="0" w:evenVBand="0" w:oddHBand="0" w:evenHBand="1" w:firstRowFirstColumn="0" w:firstRowLastColumn="0" w:lastRowFirstColumn="0" w:lastRowLastColumn="0"/>
-            </w:pPr>
+            <w:r>
+              <w:t xml:space="preserve">Cập nhật trang bìa, phần giới thiệu và bốn chương Pool A-D của báo cáo LaTeX; cập nhật supporting/scope.md; điền metadata bản working AI-02 và tạo bản working AI-03; render report/latex/HW02_Report_Draft.pdf. Full output: S001-I015.</w:t>
+            </w:r>
           </w:p>
         </w:tc>
         <w:tc>
@@ -1075,9 +1021,9 @@
             <w:tcW w:w="1020" w:type="dxa"/>
           </w:tcPr>
           <w:p>
-            <w:pPr>
-              <w:cnfStyle w:val="000000010000" w:firstRow="0" w:lastRow="0" w:firstColumn="0" w:lastColumn="0" w:oddVBand="0" w:evenVBand="0" w:oddHBand="0" w:evenHBand="1" w:firstRowFirstColumn="0" w:firstRowLastColumn="0" w:lastRowFirstColumn="0" w:lastRowLastColumn="0"/>
-            </w:pPr>
+            <w:r>
+              <w:t xml:space="preserve">PENDING HUMAN REVIEW</w:t>
+            </w:r>
           </w:p>
         </w:tc>
         <w:tc>
@@ -1085,9 +1031,9 @@
             <w:tcW w:w="2268" w:type="dxa"/>
           </w:tcPr>
           <w:p>
-            <w:pPr>
-              <w:cnfStyle w:val="000000010000" w:firstRow="0" w:lastRow="0" w:firstColumn="0" w:lastColumn="0" w:oddVBand="0" w:evenVBand="0" w:oddHBand="0" w:evenHBand="1" w:firstRowFirstColumn="0" w:firstRowLastColumn="0" w:lastRowFirstColumn="0" w:lastRowLastColumn="0"/>
-            </w:pPr>
+            <w:r>
+              <w:t xml:space="preserve">Chờ sinh viên xác nhận thông tin học phần, feature được phân công, caption/diễn giải smoke evidence và các trường metadata trước khi nộp.</w:t>
+            </w:r>
           </w:p>
         </w:tc>
         <w:tc>
@@ -1095,9 +1041,9 @@
             <w:tcW w:w="2154" w:type="dxa"/>
           </w:tcPr>
           <w:p>
-            <w:pPr>
-              <w:cnfStyle w:val="000000010000" w:firstRow="0" w:lastRow="0" w:firstColumn="0" w:lastColumn="0" w:oddVBand="0" w:evenVBand="0" w:oddHBand="0" w:evenHBand="1" w:firstRowFirstColumn="0" w:firstRowLastColumn="0" w:lastRowFirstColumn="0" w:lastRowLastColumn="0"/>
-            </w:pPr>
+            <w:r>
+              <w:t xml:space="preserve">Chưa có</w:t>
+            </w:r>
           </w:p>
         </w:tc>
       </w:tr>

</xml_diff>

<commit_message>
test(A-FR03): step 1 establish spec and oracle
</commit_message>
<xml_diff>
--- a/ai/AI-02_AI_Audit_Report_Working.docx
+++ b/ai/AI-02_AI_Audit_Report_Working.docx
@@ -1058,25 +1058,8 @@
           </w:tcPr>
           <w:p>
             <w:r>
-              <w:rPr>
-                <w:rFonts w:ascii="Arial" w:hAnsi="Arial"/>
-                <w:sz w:val="21"/>
-              </w:rPr>
-              <w:t>Artifact #5</w:t>
-            </w:r>
-            <w:r>
-              <w:rPr>
-                <w:rFonts w:ascii="Arial" w:hAnsi="Arial"/>
-                <w:sz w:val="21"/>
-              </w:rPr>
-              <w:br/>
-            </w:r>
-            <w:r>
-              <w:rPr>
-                <w:rFonts w:ascii="Arial" w:hAnsi="Arial"/>
-                <w:sz w:val="21"/>
-              </w:rPr>
-              <w:br/>
+              <w:t xml:space="preserve">ART017
+Tool: OpenAI Codex; Model: gpt-5.6-sol (medium); Time: 2026-10-09T15:21:00+07:00; Prompt: tạo file A-FR03 Step 1 và commit theo skill; full prompt: S001-I018.</w:t>
             </w:r>
           </w:p>
         </w:tc>
@@ -1085,9 +1068,9 @@
             <w:tcW w:w="2041" w:type="dxa"/>
           </w:tcPr>
           <w:p>
-            <w:pPr>
-              <w:cnfStyle w:val="000000100000" w:firstRow="0" w:lastRow="0" w:firstColumn="0" w:lastColumn="0" w:oddVBand="0" w:evenVBand="0" w:oddHBand="1" w:evenHBand="0" w:firstRowFirstColumn="0" w:firstRowLastColumn="0" w:lastRowFirstColumn="0" w:lastRowLastColumn="0"/>
-            </w:pPr>
+            <w:r>
+              <w:t xml:space="preserve">Tạo features/A/01_spec_and_oracle.md: hierarchy nguồn, input/domain rule, business oracle, API contract, discrepancy, boundary candidate, câu hỏi mở và human review gate. Full output: S001-I018.</w:t>
+            </w:r>
           </w:p>
         </w:tc>
         <w:tc>
@@ -1095,9 +1078,9 @@
             <w:tcW w:w="1020" w:type="dxa"/>
           </w:tcPr>
           <w:p>
-            <w:pPr>
-              <w:cnfStyle w:val="000000100000" w:firstRow="0" w:lastRow="0" w:firstColumn="0" w:lastColumn="0" w:oddVBand="0" w:evenVBand="0" w:oddHBand="1" w:evenHBand="0" w:firstRowFirstColumn="0" w:firstRowLastColumn="0" w:lastRowFirstColumn="0" w:lastRowLastColumn="0"/>
-            </w:pPr>
+            <w:r>
+              <w:t xml:space="preserve">PENDING HUMAN REVIEW</w:t>
+            </w:r>
           </w:p>
         </w:tc>
         <w:tc>
@@ -1105,9 +1088,9 @@
             <w:tcW w:w="2268" w:type="dxa"/>
           </w:tcPr>
           <w:p>
-            <w:pPr>
-              <w:cnfStyle w:val="000000100000" w:firstRow="0" w:lastRow="0" w:firstColumn="0" w:lastColumn="0" w:oddVBand="0" w:evenVBand="0" w:oddHBand="1" w:evenHBand="0" w:firstRowFirstColumn="0" w:firstRowLastColumn="0" w:lastRowFirstColumn="0" w:lastRowLastColumn="0"/>
-            </w:pPr>
+            <w:r>
+              <w:t xml:space="preserve">Chờ sinh viên đối chiếu README/API specification, xác nhận rule và các requirement conflict trước khi dùng làm nền cho Domain Testing.</w:t>
+            </w:r>
           </w:p>
         </w:tc>
         <w:tc>
@@ -1115,9 +1098,9 @@
             <w:tcW w:w="2154" w:type="dxa"/>
           </w:tcPr>
           <w:p>
-            <w:pPr>
-              <w:cnfStyle w:val="000000100000" w:firstRow="0" w:lastRow="0" w:firstColumn="0" w:lastColumn="0" w:oddVBand="0" w:evenVBand="0" w:oddHBand="1" w:evenHBand="0" w:firstRowFirstColumn="0" w:firstRowLastColumn="0" w:lastRowFirstColumn="0" w:lastRowLastColumn="0"/>
-            </w:pPr>
+            <w:r>
+              <w:t xml:space="preserve">Chưa có</w:t>
+            </w:r>
           </w:p>
         </w:tc>
       </w:tr>

</xml_diff>

<commit_message>
test(A-FR03): step 3 derive boundary cases
</commit_message>
<xml_diff>
--- a/ai/AI-02_AI_Audit_Report_Working.docx
+++ b/ai/AI-02_AI_Audit_Report_Working.docx
@@ -1115,25 +1115,8 @@
           </w:tcPr>
           <w:p>
             <w:r>
-              <w:rPr>
-                <w:rFonts w:ascii="Arial" w:hAnsi="Arial"/>
-                <w:sz w:val="21"/>
-              </w:rPr>
-              <w:t>Artifact #6</w:t>
-            </w:r>
-            <w:r>
-              <w:rPr>
-                <w:rFonts w:ascii="Arial" w:hAnsi="Arial"/>
-                <w:sz w:val="21"/>
-              </w:rPr>
-              <w:br/>
-            </w:r>
-            <w:r>
-              <w:rPr>
-                <w:rFonts w:ascii="Arial" w:hAnsi="Arial"/>
-                <w:sz w:val="21"/>
-              </w:rPr>
-              <w:br/>
+              <w:t xml:space="preserve">ART018
+Tool: OpenAI Codex; Model: gpt-5.6-sol (medium); Time: 2026-10-09T17:50:56+07:00; Prompt: dựa vào spec đã review để triển khai domain model cho Pool A; full prompt: S001-I021.</w:t>
             </w:r>
           </w:p>
         </w:tc>
@@ -1142,9 +1125,9 @@
             <w:tcW w:w="2041" w:type="dxa"/>
           </w:tcPr>
           <w:p>
-            <w:pPr>
-              <w:cnfStyle w:val="000000010000" w:firstRow="0" w:lastRow="0" w:firstColumn="0" w:lastColumn="0" w:oddVBand="0" w:evenVBand="0" w:oddHBand="0" w:evenHBand="1" w:firstRowFirstColumn="0" w:firstRowLastColumn="0" w:lastRowFirstColumn="0" w:lastRowLastColumn="0"/>
-            </w:pPr>
+            <w:r>
+              <w:t xml:space="preserve">Tạo features/A/02_domain_model.md với equivalence partitions theo characteristic, composite predicates, OTP state model, UI/output domains, nominal baseline và traceability A-R01–A-R14. Full output: S001-I021.</w:t>
+            </w:r>
           </w:p>
         </w:tc>
         <w:tc>
@@ -1152,9 +1135,9 @@
             <w:tcW w:w="1020" w:type="dxa"/>
           </w:tcPr>
           <w:p>
-            <w:pPr>
-              <w:cnfStyle w:val="000000010000" w:firstRow="0" w:lastRow="0" w:firstColumn="0" w:lastColumn="0" w:oddVBand="0" w:evenVBand="0" w:oddHBand="0" w:evenHBand="1" w:firstRowFirstColumn="0" w:firstRowLastColumn="0" w:lastRowFirstColumn="0" w:lastRowLastColumn="0"/>
-            </w:pPr>
+            <w:r>
+              <w:t xml:space="preserve">VALID</w:t>
+            </w:r>
           </w:p>
         </w:tc>
         <w:tc>
@@ -1162,9 +1145,9 @@
             <w:tcW w:w="2268" w:type="dxa"/>
           </w:tcPr>
           <w:p>
-            <w:pPr>
-              <w:cnfStyle w:val="000000010000" w:firstRow="0" w:lastRow="0" w:firstColumn="0" w:lastColumn="0" w:oddVBand="0" w:evenVBand="0" w:oddHBand="0" w:evenHBand="1" w:firstRowFirstColumn="0" w:firstRowLastColumn="0" w:lastRowFirstColumn="0" w:lastRowLastColumn="0"/>
-            </w:pPr>
+            <w:r>
+              <w:t xml:space="preserve">Sinh viên đã đối chiếu domain model với 01_spec_and_oracle.md và xác nhận partition, valid predicate, nominal baseline cùng traceability A-R01–A-R14 trước khi chuyển sang BVA.</w:t>
+            </w:r>
           </w:p>
         </w:tc>
         <w:tc>
@@ -1172,9 +1155,9 @@
             <w:tcW w:w="2154" w:type="dxa"/>
           </w:tcPr>
           <w:p>
-            <w:pPr>
-              <w:cnfStyle w:val="000000010000" w:firstRow="0" w:lastRow="0" w:firstColumn="0" w:lastColumn="0" w:oddVBand="0" w:evenVBand="0" w:oddHBand="0" w:evenHBand="1" w:firstRowFirstColumn="0" w:firstRowLastColumn="0" w:lastRowFirstColumn="0" w:lastRowLastColumn="0"/>
-            </w:pPr>
+            <w:r>
+              <w:t xml:space="preserve">Không có; sinh viên chấp nhận artifact sau human review.</w:t>
+            </w:r>
           </w:p>
         </w:tc>
       </w:tr>
@@ -1189,25 +1172,8 @@
           </w:tcPr>
           <w:p>
             <w:r>
-              <w:rPr>
-                <w:rFonts w:ascii="Arial" w:hAnsi="Arial"/>
-                <w:sz w:val="21"/>
-              </w:rPr>
-              <w:t>Artifact #7</w:t>
-            </w:r>
-            <w:r>
-              <w:rPr>
-                <w:rFonts w:ascii="Arial" w:hAnsi="Arial"/>
-                <w:sz w:val="21"/>
-              </w:rPr>
-              <w:br/>
-            </w:r>
-            <w:r>
-              <w:rPr>
-                <w:rFonts w:ascii="Arial" w:hAnsi="Arial"/>
-                <w:sz w:val="21"/>
-              </w:rPr>
-              <w:br/>
+              <w:t xml:space="preserve">ART019
+Tool: OpenAI Codex; Model: gpt-5.6-sol (medium); Time: 2026-10-12T20:53:00.1137768+07:00; Prompt: tạo file BVA cho Pool A dựa trên spec, domain model và business rule; full prompt: S001-I023.</w:t>
             </w:r>
           </w:p>
         </w:tc>
@@ -1216,9 +1182,9 @@
             <w:tcW w:w="2041" w:type="dxa"/>
           </w:tcPr>
           <w:p>
-            <w:pPr>
-              <w:cnfStyle w:val="000000100000" w:firstRow="0" w:lastRow="0" w:firstColumn="0" w:lastColumn="0" w:oddVBand="0" w:evenVBand="0" w:oddHBand="1" w:evenHBand="0" w:firstRowFirstColumn="0" w:firstRowLastColumn="0" w:lastRowFirstColumn="0" w:lastRowLastColumn="0"/>
-            </w:pPr>
+            <w:r>
+              <w:t xml:space="preserve">Tạo features/A/03_boundary_value_analysis.md với boundary inventory, dữ liệu B-1/B/B+1, relational boundary, traceability A-R01–A-R14 và các boundary NOT SPECIFIED. Full output: S001-I023.</w:t>
+            </w:r>
           </w:p>
         </w:tc>
         <w:tc>
@@ -1226,9 +1192,9 @@
             <w:tcW w:w="1020" w:type="dxa"/>
           </w:tcPr>
           <w:p>
-            <w:pPr>
-              <w:cnfStyle w:val="000000100000" w:firstRow="0" w:lastRow="0" w:firstColumn="0" w:lastColumn="0" w:oddVBand="0" w:evenVBand="0" w:oddHBand="1" w:evenHBand="0" w:firstRowFirstColumn="0" w:firstRowLastColumn="0" w:lastRowFirstColumn="0" w:lastRowLastColumn="0"/>
-            </w:pPr>
+            <w:r>
+              <w:t xml:space="preserve">VALID</w:t>
+            </w:r>
           </w:p>
         </w:tc>
         <w:tc>
@@ -1236,9 +1202,9 @@
             <w:tcW w:w="2268" w:type="dxa"/>
           </w:tcPr>
           <w:p>
-            <w:pPr>
-              <w:cnfStyle w:val="000000100000" w:firstRow="0" w:lastRow="0" w:firstColumn="0" w:lastColumn="0" w:oddVBand="0" w:evenVBand="0" w:oddHBand="1" w:evenHBand="0" w:firstRowFirstColumn="0" w:firstRowLastColumn="0" w:lastRowFirstColumn="0" w:lastRowLastColumn="0"/>
-            </w:pPr>
+            <w:r>
+              <w:t xml:space="preserve">Theo yêu cầu của sinh viên, AI đã đối chiếu boundary với FR-01, FR-03 và SEC-07; xác nhận đủ 10 boundary ID, 14 rule ID, 22 data row không trùng và 15/15 password candidate đúng length/composition. Review trong artifact ghi rõ là user-delegated AI verification.</w:t>
+            </w:r>
           </w:p>
         </w:tc>
         <w:tc>
@@ -1246,9 +1212,9 @@
             <w:tcW w:w="2154" w:type="dxa"/>
           </w:tcPr>
           <w:p>
-            <w:pPr>
-              <w:cnfStyle w:val="000000100000" w:firstRow="0" w:lastRow="0" w:firstColumn="0" w:lastColumn="0" w:oddVBand="0" w:evenVBand="0" w:oddHBand="1" w:evenHBand="0" w:firstRowFirstColumn="0" w:firstRowLastColumn="0" w:lastRowFirstColumn="0" w:lastRowLastColumn="0"/>
-            </w:pPr>
+            <w:r>
+              <w:t xml:space="preserve">Không có; không phát hiện nội dung cần sửa sau bước kiểm tra được sinh viên ủy quyền.</w:t>
+            </w:r>
           </w:p>
         </w:tc>
       </w:tr>
@@ -1591,7 +1557,7 @@
           </w:tcPr>
           <w:p>
             <w:r>
-              <w:t xml:space="preserve">0</w:t>
+              <w:t xml:space="preserve">2</w:t>
             </w:r>
           </w:p>
         </w:tc>
@@ -1631,7 +1597,7 @@
           </w:tcPr>
           <w:p>
             <w:r>
-              <w:t xml:space="preserve">0</w:t>
+              <w:t xml:space="preserve">2</w:t>
             </w:r>
           </w:p>
         </w:tc>
@@ -1641,7 +1607,7 @@
           </w:tcPr>
           <w:p>
             <w:r>
-              <w:t xml:space="preserve">0%</w:t>
+              <w:t xml:space="preserve">100%</w:t>
             </w:r>
           </w:p>
         </w:tc>

</xml_diff>

<commit_message>
test(A-FR03): step 4 review and finalize test cases
</commit_message>
<xml_diff>
--- a/ai/AI-02_AI_Audit_Report_Working.docx
+++ b/ai/AI-02_AI_Audit_Report_Working.docx
@@ -1229,25 +1229,8 @@
           </w:tcPr>
           <w:p>
             <w:r>
-              <w:rPr>
-                <w:rFonts w:ascii="Arial" w:hAnsi="Arial"/>
-                <w:sz w:val="21"/>
-              </w:rPr>
-              <w:t>Artifact #8</w:t>
-            </w:r>
-            <w:r>
-              <w:rPr>
-                <w:rFonts w:ascii="Arial" w:hAnsi="Arial"/>
-                <w:sz w:val="21"/>
-              </w:rPr>
-              <w:br/>
-            </w:r>
-            <w:r>
-              <w:rPr>
-                <w:rFonts w:ascii="Arial" w:hAnsi="Arial"/>
-                <w:sz w:val="21"/>
-              </w:rPr>
-              <w:br/>
+              <w:t xml:space="preserve">ART020
+Tool: OpenAI Codex; Model: gpt-5.6-sol (medium); Time: 2026-10-12T21:09:33.9870448+07:00; Prompt: commit Step 1–3 rồi tạo file 04 cho Pool A; full prompt: S001-I025.</w:t>
             </w:r>
           </w:p>
         </w:tc>
@@ -1256,9 +1239,9 @@
             <w:tcW w:w="2041" w:type="dxa"/>
           </w:tcPr>
           <w:p>
-            <w:pPr>
-              <w:cnfStyle w:val="000000010000" w:firstRow="0" w:lastRow="0" w:firstColumn="0" w:lastColumn="0" w:oddVBand="0" w:evenVBand="0" w:oddHBand="0" w:evenHBand="1" w:firstRowFirstColumn="0" w:firstRowLastColumn="0" w:lastRowFirstColumn="0" w:lastRowLastColumn="0"/>
-            </w:pPr>
+            <w:r>
+              <w:t xml:space="preserve">Tạo features/A/04_test_cases.md gồm 38 test case Domain Testing/BVA, fixture, procedure, expected result và traceability; đồng thời tạo ba commit checkpoint cho Step 1–3. Full output: S001-I025.</w:t>
+            </w:r>
           </w:p>
         </w:tc>
         <w:tc>
@@ -1266,9 +1249,9 @@
             <w:tcW w:w="1020" w:type="dxa"/>
           </w:tcPr>
           <w:p>
-            <w:pPr>
-              <w:cnfStyle w:val="000000010000" w:firstRow="0" w:lastRow="0" w:firstColumn="0" w:lastColumn="0" w:oddVBand="0" w:evenVBand="0" w:oddHBand="0" w:evenHBand="1" w:firstRowFirstColumn="0" w:firstRowLastColumn="0" w:lastRowFirstColumn="0" w:lastRowLastColumn="0"/>
-            </w:pPr>
+            <w:r>
+              <w:t xml:space="preserve">VALID</w:t>
+            </w:r>
           </w:p>
         </w:tc>
         <w:tc>
@@ -1276,9 +1259,9 @@
             <w:tcW w:w="2268" w:type="dxa"/>
           </w:tcPr>
           <w:p>
-            <w:pPr>
-              <w:cnfStyle w:val="000000010000" w:firstRow="0" w:lastRow="0" w:firstColumn="0" w:lastColumn="0" w:oddVBand="0" w:evenVBand="0" w:oddHBand="0" w:evenHBand="1" w:firstRowFirstColumn="0" w:firstRowLastColumn="0" w:lastRowFirstColumn="0" w:lastRowLastColumn="0"/>
-            </w:pPr>
+            <w:r>
+              <w:t xml:space="preserve">Theo yêu cầu của sinh viên, AI đã đối chiếu SRS, Step 1–3 và source path; xác nhận 38 ID liên tục, đủ invalid partition/rule/boundary và password data hợp lệ sau khi sửa hai lỗi khả thi.</w:t>
+            </w:r>
           </w:p>
         </w:tc>
         <w:tc>
@@ -1286,9 +1269,9 @@
             <w:tcW w:w="2154" w:type="dxa"/>
           </w:tcPr>
           <w:p>
-            <w:pPr>
-              <w:cnfStyle w:val="000000010000" w:firstRow="0" w:lastRow="0" w:firstColumn="0" w:lastColumn="0" w:oddVBand="0" w:evenVBand="0" w:oddHBand="0" w:evenHBand="1" w:firstRowFirstColumn="0" w:firstRowLastColumn="0" w:lastRowFirstColumn="0" w:lastRowLastColumn="0"/>
-            </w:pPr>
+            <w:r>
+              <w:t xml:space="preserve">Sửa thứ tự fixture: chuyển UI sang Bước 2 rồi mới ghi token 6 số; sửa reuse case dùng password thứ hai khác; làm rõ giới hạn chứng minh randomness và coupling password rỗng.</w:t>
+            </w:r>
           </w:p>
         </w:tc>
       </w:tr>
@@ -1557,7 +1540,7 @@
           </w:tcPr>
           <w:p>
             <w:r>
-              <w:t xml:space="preserve">2</w:t>
+              <w:t xml:space="preserve">3</w:t>
             </w:r>
           </w:p>
         </w:tc>
@@ -1597,7 +1580,7 @@
           </w:tcPr>
           <w:p>
             <w:r>
-              <w:t xml:space="preserve">2</w:t>
+              <w:t xml:space="preserve">3</w:t>
             </w:r>
           </w:p>
         </w:tc>

</xml_diff>

<commit_message>
docs(A-FR03): step 7 finalize feature report
</commit_message>
<xml_diff>
--- a/ai/AI-02_AI_Audit_Report_Working.docx
+++ b/ai/AI-02_AI_Audit_Report_Working.docx
@@ -1286,25 +1286,8 @@
           </w:tcPr>
           <w:p>
             <w:r>
-              <w:rPr>
-                <w:rFonts w:ascii="Arial" w:hAnsi="Arial"/>
-                <w:sz w:val="21"/>
-              </w:rPr>
-              <w:t>Artifact #9</w:t>
-            </w:r>
-            <w:r>
-              <w:rPr>
-                <w:rFonts w:ascii="Arial" w:hAnsi="Arial"/>
-                <w:sz w:val="21"/>
-              </w:rPr>
-              <w:br/>
-            </w:r>
-            <w:r>
-              <w:rPr>
-                <w:rFonts w:ascii="Arial" w:hAnsi="Arial"/>
-                <w:sz w:val="21"/>
-              </w:rPr>
-              <w:br/>
+              <w:t xml:space="preserve">ART021
+2026-10-12T21:35:42.1737651+07:00 | OpenAI Codex | gpt-5.6-sol medium | prompt đầy đủ: S001-I027</w:t>
             </w:r>
           </w:p>
         </w:tc>
@@ -1313,9 +1296,9 @@
             <w:tcW w:w="2041" w:type="dxa"/>
           </w:tcPr>
           <w:p>
-            <w:pPr>
-              <w:cnfStyle w:val="000000100000" w:firstRow="0" w:lastRow="0" w:firstColumn="0" w:lastColumn="0" w:oddVBand="0" w:evenVBand="0" w:oddHBand="1" w:evenHBand="0" w:firstRowFirstColumn="0" w:firstRowLastColumn="0" w:lastRowFirstColumn="0" w:lastRowLastColumn="0"/>
-            </w:pPr>
+            <w:r>
+              <w:t xml:space="preserve">Tạo bộ Playwright automation A-FR03, SQLite fixture, evidence screenshot/trace, results.json và 05_execution_results.md; tự khởi động backend/frontend và chạy tuần tự toàn bộ 38 test case. Kết quả: 9 executed, 1 PASS, 8 FAIL, 29 BLOCKED, 0 NOT RUN. Toàn bộ output: S001-I027.</w:t>
+            </w:r>
           </w:p>
         </w:tc>
         <w:tc>
@@ -1323,9 +1306,9 @@
             <w:tcW w:w="1020" w:type="dxa"/>
           </w:tcPr>
           <w:p>
-            <w:pPr>
-              <w:cnfStyle w:val="000000100000" w:firstRow="0" w:lastRow="0" w:firstColumn="0" w:lastColumn="0" w:oddVBand="0" w:evenVBand="0" w:oddHBand="1" w:evenHBand="0" w:firstRowFirstColumn="0" w:firstRowLastColumn="0" w:lastRowFirstColumn="0" w:lastRowLastColumn="0"/>
-            </w:pPr>
+            <w:r>
+              <w:t xml:space="preserve">VALID</w:t>
+            </w:r>
           </w:p>
         </w:tc>
         <w:tc>
@@ -1333,9 +1316,9 @@
             <w:tcW w:w="2268" w:type="dxa"/>
           </w:tcPr>
           <w:p>
-            <w:pPr>
-              <w:cnfStyle w:val="000000100000" w:firstRow="0" w:lastRow="0" w:firstColumn="0" w:lastColumn="0" w:oddVBand="0" w:evenVBand="0" w:oddHBand="1" w:evenHBand="0" w:firstRowFirstColumn="0" w:firstRowLastColumn="0" w:lastRowFirstColumn="0" w:lastRowLastColumn="0"/>
-            </w:pPr>
+            <w:r>
+              <w:t xml:space="preserve">Đã đối chiếu 38 Test ID duy nhất với results.json; status và actual result nhất quán với screenshot/trace/source; mọi evidence tồn tại; fixture cleanup thành công; expected result không bị sửa để ép pass.</w:t>
+            </w:r>
           </w:p>
         </w:tc>
         <w:tc>
@@ -1343,9 +1326,9 @@
             <w:tcW w:w="2154" w:type="dxa"/>
           </w:tcPr>
           <w:p>
-            <w:pPr>
-              <w:cnfStyle w:val="000000100000" w:firstRow="0" w:lastRow="0" w:firstColumn="0" w:lastColumn="0" w:oddVBand="0" w:evenVBand="0" w:oddHBand="1" w:evenHBand="0" w:firstRowFirstColumn="0" w:firstRowLastColumn="0" w:lastRowFirstColumn="0" w:lastRowLastColumn="0"/>
-            </w:pPr>
+            <w:r>
+              <w:t xml:space="preserve">Không sửa nội dung; sinh viên ủy quyền AI quyết định review ngày 2026-10-13.</w:t>
+            </w:r>
           </w:p>
         </w:tc>
       </w:tr>
@@ -1360,25 +1343,8 @@
           </w:tcPr>
           <w:p>
             <w:r>
-              <w:rPr>
-                <w:rFonts w:ascii="Arial" w:hAnsi="Arial"/>
-                <w:sz w:val="21"/>
-              </w:rPr>
-              <w:t>Artifact #10</w:t>
-            </w:r>
-            <w:r>
-              <w:rPr>
-                <w:rFonts w:ascii="Arial" w:hAnsi="Arial"/>
-                <w:sz w:val="21"/>
-              </w:rPr>
-              <w:br/>
-            </w:r>
-            <w:r>
-              <w:rPr>
-                <w:rFonts w:ascii="Arial" w:hAnsi="Arial"/>
-                <w:sz w:val="21"/>
-              </w:rPr>
-              <w:br/>
+              <w:t xml:space="preserve">ART022
+2026-10-12T21:43:58.4274342+07:00 | OpenAI Codex | gpt-5.6-sol medium | prompt đầy đủ: S001-I028</w:t>
             </w:r>
           </w:p>
         </w:tc>
@@ -1387,9 +1353,9 @@
             <w:tcW w:w="2041" w:type="dxa"/>
           </w:tcPr>
           <w:p>
-            <w:pPr>
-              <w:cnfStyle w:val="000000010000" w:firstRow="0" w:lastRow="0" w:firstColumn="0" w:lastColumn="0" w:oddVBand="0" w:evenVBand="0" w:oddHBand="0" w:evenHBand="1" w:firstRowFirstColumn="0" w:firstRowLastColumn="0" w:lastRowFirstColumn="0" w:lastRowLastColumn="0"/>
-            </w:pPr>
+            <w:r>
+              <w:t xml:space="preserve">Review Step 5; tạo bugs/A-FR03_bug_report.md và features/A/06_ai_gap_analysis.md; cập nhật hai chapter LaTeX cho AI gap và bug report. Kết quả: 8 confirmed defects, 1 requirement gap, 4 implementation gaps bổ sung, 1 testability gap; full output S001-I028.</w:t>
+            </w:r>
           </w:p>
         </w:tc>
         <w:tc>
@@ -1397,9 +1363,9 @@
             <w:tcW w:w="1020" w:type="dxa"/>
           </w:tcPr>
           <w:p>
-            <w:pPr>
-              <w:cnfStyle w:val="000000010000" w:firstRow="0" w:lastRow="0" w:firstColumn="0" w:lastColumn="0" w:oddVBand="0" w:evenVBand="0" w:oddHBand="0" w:evenHBand="1" w:firstRowFirstColumn="0" w:firstRowLastColumn="0" w:lastRowFirstColumn="0" w:lastRowLastColumn="0"/>
-            </w:pPr>
+            <w:r>
+              <w:t xml:space="preserve">VALID</w:t>
+            </w:r>
           </w:p>
         </w:tc>
         <w:tc>
@@ -1407,9 +1373,9 @@
             <w:tcW w:w="2268" w:type="dxa"/>
           </w:tcPr>
           <w:p>
-            <w:pPr>
-              <w:cnfStyle w:val="000000010000" w:firstRow="0" w:lastRow="0" w:firstColumn="0" w:lastColumn="0" w:oddVBand="0" w:evenVBand="0" w:oddHBand="0" w:evenHBand="1" w:firstRowFirstColumn="0" w:firstRowLastColumn="0" w:lastRowFirstColumn="0" w:lastRowLastColumn="0"/>
-            </w:pPr>
+            <w:r>
+              <w:t xml:space="preserve">Tám defect được nhóm theo root cause từ tám case FAIL; 29 case BLOCKED không bị nâng thành defect; requirement, implementation và testability gap được tách rõ, có trace tới evidence/source và không tự đặt business rule.</w:t>
+            </w:r>
           </w:p>
         </w:tc>
         <w:tc>
@@ -1417,9 +1383,66 @@
             <w:tcW w:w="2154" w:type="dxa"/>
           </w:tcPr>
           <w:p>
-            <w:pPr>
-              <w:cnfStyle w:val="000000010000" w:firstRow="0" w:lastRow="0" w:firstColumn="0" w:lastColumn="0" w:oddVBand="0" w:evenVBand="0" w:oddHBand="0" w:evenHBand="1" w:firstRowFirstColumn="0" w:firstRowLastColumn="0" w:lastRowFirstColumn="0" w:lastRowLastColumn="0"/>
-            </w:pPr>
+            <w:r>
+              <w:t xml:space="preserve">Không sửa nội dung; sinh viên ủy quyền AI quyết định review ngày 2026-10-13.</w:t>
+            </w:r>
+          </w:p>
+        </w:tc>
+      </w:tr>
+      <w:tr>
+        <w:trPr>
+          <w:cnfStyle w:val="000000010000" w:firstRow="0" w:lastRow="0" w:firstColumn="0" w:lastColumn="0" w:oddVBand="0" w:evenVBand="0" w:oddHBand="0" w:evenHBand="1" w:firstRowFirstColumn="0" w:firstRowLastColumn="0" w:lastRowFirstColumn="0" w:lastRowLastColumn="0"/>
+        </w:trPr>
+        <w:tc>
+          <w:tcPr>
+            <w:cnfStyle w:val="001000000000" w:firstRow="0" w:lastRow="0" w:firstColumn="1" w:lastColumn="0" w:oddVBand="0" w:evenVBand="0" w:oddHBand="0" w:evenHBand="0" w:firstRowFirstColumn="0" w:firstRowLastColumn="0" w:lastRowFirstColumn="0" w:lastRowLastColumn="0"/>
+            <w:tcW w:w="2154" w:type="dxa"/>
+          </w:tcPr>
+          <w:p>
+            <w:r>
+              <w:t xml:space="preserve">ART023
+2026-10-12T21:51:19.7242164+07:00 | OpenAI Codex | gpt-5.6-sol medium | prompt đầy đủ: S001-I029</w:t>
+            </w:r>
+          </w:p>
+        </w:tc>
+        <w:tc>
+          <w:tcPr>
+            <w:tcW w:w="2041" w:type="dxa"/>
+          </w:tcPr>
+          <w:p>
+            <w:r>
+              <w:t xml:space="preserve">Tạo features/A/07_traceability_matrix.md và 07_feature_closure.md; hoàn thiện chapter Pool A, Test Summary/Self-assessment và Conclusion; render báo cáo. Giữ nguyên 38 designed, 9 executed, 1 PASS, 8 FAIL, 29 BLOCKED, 0 NOT RUN. Full output: S001-I029.</w:t>
+            </w:r>
+          </w:p>
+        </w:tc>
+        <w:tc>
+          <w:tcPr>
+            <w:tcW w:w="1020" w:type="dxa"/>
+          </w:tcPr>
+          <w:p>
+            <w:r>
+              <w:t xml:space="preserve">VALID</w:t>
+            </w:r>
+          </w:p>
+        </w:tc>
+        <w:tc>
+          <w:tcPr>
+            <w:tcW w:w="2268" w:type="dxa"/>
+          </w:tcPr>
+          <w:p>
+            <w:r>
+              <w:t xml:space="preserve">Ma trận có đúng 38 case, đủ A-R01–A-R14, A-B01–A-B10 và A-BUG-001–008; status khớp results.json; closure nêu residual risk cao và không tuyên bố SUT pass; XeLaTeX render thành công không có overfull box.</w:t>
+            </w:r>
+          </w:p>
+        </w:tc>
+        <w:tc>
+          <w:tcPr>
+            <w:tcW w:w="2154" w:type="dxa"/>
+          </w:tcPr>
+          <w:p>
+            <w:r>
+              <w:t xml:space="preserve">Không sửa nội dung; sinh viên ủy quyền AI quyết định review ngày 2026-10-13.</w:t>
+            </w:r>
           </w:p>
         </w:tc>
       </w:tr>
@@ -1540,7 +1563,7 @@
           </w:tcPr>
           <w:p>
             <w:r>
-              <w:t xml:space="preserve">3</w:t>
+              <w:t xml:space="preserve">6</w:t>
             </w:r>
           </w:p>
         </w:tc>
@@ -1580,7 +1603,7 @@
           </w:tcPr>
           <w:p>
             <w:r>
-              <w:t xml:space="preserve">3</w:t>
+              <w:t xml:space="preserve">6</w:t>
             </w:r>
           </w:p>
         </w:tc>

</xml_diff>

<commit_message>
docs(ai): update audit records for skills and B-FR09
</commit_message>
<xml_diff>
--- a/ai/AI-02_AI_Audit_Report_Working.docx
+++ b/ai/AI-02_AI_Audit_Report_Working.docx
@@ -1446,6 +1446,462 @@
           </w:p>
         </w:tc>
       </w:tr>
+      <w:tr>
+        <w:trPr>
+          <w:cnfStyle w:val="000000010000" w:firstRow="0" w:lastRow="0" w:firstColumn="0" w:lastColumn="0" w:oddVBand="0" w:evenVBand="0" w:oddHBand="0" w:evenHBand="1" w:firstRowFirstColumn="0" w:firstRowLastColumn="0" w:lastRowFirstColumn="0" w:lastRowLastColumn="0"/>
+        </w:trPr>
+        <w:tc>
+          <w:tcPr>
+            <w:cnfStyle w:val="001000000000" w:firstRow="0" w:lastRow="0" w:firstColumn="1" w:lastColumn="0" w:oddVBand="0" w:evenVBand="0" w:oddHBand="0" w:evenHBand="0" w:firstRowFirstColumn="0" w:firstRowLastColumn="0" w:lastRowFirstColumn="0" w:lastRowLastColumn="0"/>
+            <w:tcW w:w="2154" w:type="dxa"/>
+          </w:tcPr>
+          <w:p>
+            <w:r>
+              <w:t xml:space="preserve">ART024
+Tool: OpenAI Codex; Model: codex gpt-5.6 sol; Reasoning: medium; Prompt: xem S001-I030 trong ai/prompt_log.md</w:t>
+            </w:r>
+          </w:p>
+        </w:tc>
+        <w:tc>
+          <w:tcPr>
+            <w:tcW w:w="2041" w:type="dxa"/>
+          </w:tcPr>
+          <w:p>
+            <w:r>
+              <w:t xml:space="preserve">Skill domain-testing-feature-workflow gồm SKILL.md, agents/openai.yaml và references/artifact-contract.md; full output: S001-I030</w:t>
+            </w:r>
+          </w:p>
+        </w:tc>
+        <w:tc>
+          <w:tcPr>
+            <w:tcW w:w="1020" w:type="dxa"/>
+          </w:tcPr>
+          <w:p>
+            <w:r>
+              <w:t xml:space="preserve">VALID</w:t>
+            </w:r>
+          </w:p>
+        </w:tc>
+        <w:tc>
+          <w:tcPr>
+            <w:tcW w:w="2268" w:type="dxa"/>
+          </w:tcPr>
+          <w:p>
+            <w:r>
+              <w:t xml:space="preserve">Sinh viên đã review và chấp nhận workflow 7 bước, review gate, traceability và trạng thái artifact.</w:t>
+            </w:r>
+          </w:p>
+        </w:tc>
+        <w:tc>
+          <w:tcPr>
+            <w:tcW w:w="2154" w:type="dxa"/>
+          </w:tcPr>
+          <w:p>
+            <w:r>
+              <w:t xml:space="preserve">Không chỉnh sửa; sinh viên xác nhận hợp lệ ngày 2026-10-13.</w:t>
+            </w:r>
+          </w:p>
+        </w:tc>
+      </w:tr>
+      <w:tr>
+        <w:trPr>
+          <w:cnfStyle w:val="000000010000" w:firstRow="0" w:lastRow="0" w:firstColumn="0" w:lastColumn="0" w:oddVBand="0" w:evenVBand="0" w:oddHBand="0" w:evenHBand="1" w:firstRowFirstColumn="0" w:firstRowLastColumn="0" w:lastRowFirstColumn="0" w:lastRowLastColumn="0"/>
+        </w:trPr>
+        <w:tc>
+          <w:tcPr>
+            <w:cnfStyle w:val="001000000000" w:firstRow="0" w:lastRow="0" w:firstColumn="1" w:lastColumn="0" w:oddVBand="0" w:evenVBand="0" w:oddHBand="0" w:evenHBand="0" w:firstRowFirstColumn="0" w:firstRowLastColumn="0" w:lastRowFirstColumn="0" w:lastRowLastColumn="0"/>
+            <w:tcW w:w="2154" w:type="dxa"/>
+          </w:tcPr>
+          <w:p>
+            <w:r>
+              <w:t xml:space="preserve">ART025
+Tool: OpenAI Codex; Model: codex gpt-5.6 sol; Reasoning: medium; Prompt: xem S001-I030 trong ai/prompt_log.md</w:t>
+            </w:r>
+          </w:p>
+        </w:tc>
+        <w:tc>
+          <w:tcPr>
+            <w:tcW w:w="2041" w:type="dxa"/>
+          </w:tcPr>
+          <w:p>
+            <w:r>
+              <w:t xml:space="preserve">Skill domain-model-and-bva gồm SKILL.md, agents/openai.yaml và references/output-template.md; full output: S001-I030</w:t>
+            </w:r>
+          </w:p>
+        </w:tc>
+        <w:tc>
+          <w:tcPr>
+            <w:tcW w:w="1020" w:type="dxa"/>
+          </w:tcPr>
+          <w:p>
+            <w:r>
+              <w:t xml:space="preserve">VALID</w:t>
+            </w:r>
+          </w:p>
+        </w:tc>
+        <w:tc>
+          <w:tcPr>
+            <w:tcW w:w="2268" w:type="dxa"/>
+          </w:tcPr>
+          <w:p>
+            <w:r>
+              <w:t xml:space="preserve">Sinh viên đã review và chấp nhận cách mô hình domain, equivalence partition, BVA và xử lý requirement gap.</w:t>
+            </w:r>
+          </w:p>
+        </w:tc>
+        <w:tc>
+          <w:tcPr>
+            <w:tcW w:w="2154" w:type="dxa"/>
+          </w:tcPr>
+          <w:p>
+            <w:r>
+              <w:t xml:space="preserve">Không chỉnh sửa; sinh viên xác nhận hợp lệ ngày 2026-10-13.</w:t>
+            </w:r>
+          </w:p>
+        </w:tc>
+      </w:tr>
+      <w:tr>
+        <w:trPr>
+          <w:cnfStyle w:val="000000010000" w:firstRow="0" w:lastRow="0" w:firstColumn="0" w:lastColumn="0" w:oddVBand="0" w:evenVBand="0" w:oddHBand="0" w:evenHBand="1" w:firstRowFirstColumn="0" w:firstRowLastColumn="0" w:lastRowFirstColumn="0" w:lastRowLastColumn="0"/>
+        </w:trPr>
+        <w:tc>
+          <w:tcPr>
+            <w:cnfStyle w:val="001000000000" w:firstRow="0" w:lastRow="0" w:firstColumn="1" w:lastColumn="0" w:oddVBand="0" w:evenVBand="0" w:oddHBand="0" w:evenHBand="0" w:firstRowFirstColumn="0" w:firstRowLastColumn="0" w:lastRowFirstColumn="0" w:lastRowLastColumn="0"/>
+            <w:tcW w:w="2154" w:type="dxa"/>
+          </w:tcPr>
+          <w:p>
+            <w:r>
+              <w:t xml:space="preserve">ART026
+Tool: OpenAI Codex; Model: codex gpt-5.6 sol; Reasoning: medium; Prompt: xem S001-I030 trong ai/prompt_log.md</w:t>
+            </w:r>
+          </w:p>
+        </w:tc>
+        <w:tc>
+          <w:tcPr>
+            <w:tcW w:w="2041" w:type="dxa"/>
+          </w:tcPr>
+          <w:p>
+            <w:r>
+              <w:t xml:space="preserve">Skill playwright-domain-test-runner gồm SKILL.md, agents/openai.yaml và references/execution-contract.md; full output: S001-I030</w:t>
+            </w:r>
+          </w:p>
+        </w:tc>
+        <w:tc>
+          <w:tcPr>
+            <w:tcW w:w="1020" w:type="dxa"/>
+          </w:tcPr>
+          <w:p>
+            <w:r>
+              <w:t xml:space="preserve">VALID</w:t>
+            </w:r>
+          </w:p>
+        </w:tc>
+        <w:tc>
+          <w:tcPr>
+            <w:tcW w:w="2268" w:type="dxa"/>
+          </w:tcPr>
+          <w:p>
+            <w:r>
+              <w:t xml:space="preserve">Sinh viên đã review và chấp nhận fixture isolation, service lifecycle, verdict và evidence contract.</w:t>
+            </w:r>
+          </w:p>
+        </w:tc>
+        <w:tc>
+          <w:tcPr>
+            <w:tcW w:w="2154" w:type="dxa"/>
+          </w:tcPr>
+          <w:p>
+            <w:r>
+              <w:t xml:space="preserve">Không chỉnh sửa; sinh viên xác nhận hợp lệ ngày 2026-10-13.</w:t>
+            </w:r>
+          </w:p>
+        </w:tc>
+      </w:tr>
+      <w:tr>
+        <w:trPr>
+          <w:cnfStyle w:val="000000010000" w:firstRow="0" w:lastRow="0" w:firstColumn="0" w:lastColumn="0" w:oddVBand="0" w:evenVBand="0" w:oddHBand="0" w:evenHBand="1" w:firstRowFirstColumn="0" w:firstRowLastColumn="0" w:lastRowFirstColumn="0" w:lastRowLastColumn="0"/>
+        </w:trPr>
+        <w:tc>
+          <w:tcPr>
+            <w:cnfStyle w:val="001000000000" w:firstRow="0" w:lastRow="0" w:firstColumn="1" w:lastColumn="0" w:oddVBand="0" w:evenVBand="0" w:oddHBand="0" w:evenHBand="0" w:firstRowFirstColumn="0" w:firstRowLastColumn="0" w:lastRowFirstColumn="0" w:lastRowLastColumn="0"/>
+            <w:tcW w:w="2154" w:type="dxa"/>
+          </w:tcPr>
+          <w:p>
+            <w:r>
+              <w:t xml:space="preserve">ART027
+Tool: OpenAI Codex; Model: codex gpt-5.6 sol; Reasoning: medium; Prompt: xem S001-I031 trong ai/prompt_log.md</w:t>
+            </w:r>
+          </w:p>
+        </w:tc>
+        <w:tc>
+          <w:tcPr>
+            <w:tcW w:w="2041" w:type="dxa"/>
+          </w:tcPr>
+          <w:p>
+            <w:r>
+              <w:t xml:space="preserve">features/B/01_spec_and_oracle.md cho B-FR09 từ SRS, API contract, Web UI, Backend và database; full output: S001-I031</w:t>
+            </w:r>
+          </w:p>
+        </w:tc>
+        <w:tc>
+          <w:tcPr>
+            <w:tcW w:w="1020" w:type="dxa"/>
+          </w:tcPr>
+          <w:p>
+            <w:r>
+              <w:t xml:space="preserve">VALID</w:t>
+            </w:r>
+          </w:p>
+        </w:tc>
+        <w:tc>
+          <w:tcPr>
+            <w:tcW w:w="2268" w:type="dxa"/>
+          </w:tcPr>
+          <w:p>
+            <w:r>
+              <w:t xml:space="preserve">Sinh viên đã review và chấp nhận phạm vi Web, 19 business rule, 7 requirement gap và việc giữ candidate discrepancy chờ execution.</w:t>
+            </w:r>
+          </w:p>
+        </w:tc>
+        <w:tc>
+          <w:tcPr>
+            <w:tcW w:w="2154" w:type="dxa"/>
+          </w:tcPr>
+          <w:p>
+            <w:r>
+              <w:t xml:space="preserve">Không chỉnh sửa nội dung rule; tick checklist và chuyển trạng thái REVIEWED ngày 2026-10-13.</w:t>
+            </w:r>
+          </w:p>
+        </w:tc>
+      </w:tr>
+      <w:tr>
+        <w:trPr>
+          <w:cnfStyle w:val="000000010000" w:firstRow="0" w:lastRow="0" w:firstColumn="0" w:lastColumn="0" w:oddVBand="0" w:evenVBand="0" w:oddHBand="0" w:evenHBand="1" w:firstRowFirstColumn="0" w:firstRowLastColumn="0" w:lastRowFirstColumn="0" w:lastRowLastColumn="0"/>
+        </w:trPr>
+        <w:tc>
+          <w:tcPr>
+            <w:cnfStyle w:val="001000000000" w:firstRow="0" w:lastRow="0" w:firstColumn="1" w:lastColumn="0" w:oddVBand="0" w:evenVBand="0" w:oddHBand="0" w:evenHBand="0" w:firstRowFirstColumn="0" w:firstRowLastColumn="0" w:lastRowFirstColumn="0" w:lastRowLastColumn="0"/>
+            <w:tcW w:w="2154" w:type="dxa"/>
+          </w:tcPr>
+          <w:p>
+            <w:r>
+              <w:t xml:space="preserve">ART028
+Tool: OpenAI Codex; Model: codex gpt-5.6 sol; Reasoning: medium; Prompt: xem S001-I033 trong ai/prompt_log.md</w:t>
+            </w:r>
+          </w:p>
+        </w:tc>
+        <w:tc>
+          <w:tcPr>
+            <w:tcW w:w="2041" w:type="dxa"/>
+          </w:tcPr>
+          <w:p>
+            <w:r>
+              <w:t xml:space="preserve">features/B/02_domain_model.md: 8 object, 17 domain variable, partition C1-C5, state/trust/arithmetic/UI domain và traceability; full output: S001-I033</w:t>
+            </w:r>
+          </w:p>
+        </w:tc>
+        <w:tc>
+          <w:tcPr>
+            <w:tcW w:w="1020" w:type="dxa"/>
+          </w:tcPr>
+          <w:p>
+            <w:r>
+              <w:t xml:space="preserve">VALID</w:t>
+            </w:r>
+          </w:p>
+        </w:tc>
+        <w:tc>
+          <w:tcPr>
+            <w:tcW w:w="2268" w:type="dxa"/>
+          </w:tcPr>
+          <w:p>
+            <w:r>
+              <w:t xml:space="preserve">Sinh viên đã review và xác nhận object model, partition, composite eligibility, trust boundary, công thức, 19/19 rule coverage và 7 unresolved gap.</w:t>
+            </w:r>
+          </w:p>
+        </w:tc>
+        <w:tc>
+          <w:tcPr>
+            <w:tcW w:w="2154" w:type="dxa"/>
+          </w:tcPr>
+          <w:p>
+            <w:r>
+              <w:t xml:space="preserve">Không sửa nội dung mô hình; tick 10 checklist và chuyển trạng thái REVIEWED ngày 2026-10-13.</w:t>
+            </w:r>
+          </w:p>
+        </w:tc>
+      </w:tr>
+      <w:tr>
+        <w:trPr>
+          <w:cnfStyle w:val="000000010000" w:firstRow="0" w:lastRow="0" w:firstColumn="0" w:lastColumn="0" w:oddVBand="0" w:evenVBand="0" w:oddHBand="0" w:evenHBand="1" w:firstRowFirstColumn="0" w:firstRowLastColumn="0" w:lastRowFirstColumn="0" w:lastRowLastColumn="0"/>
+        </w:trPr>
+        <w:tc>
+          <w:tcPr>
+            <w:cnfStyle w:val="001000000000" w:firstRow="0" w:lastRow="0" w:firstColumn="1" w:lastColumn="0" w:oddVBand="0" w:evenVBand="0" w:oddHBand="0" w:evenHBand="0" w:firstRowFirstColumn="0" w:firstRowLastColumn="0" w:lastRowFirstColumn="0" w:lastRowLastColumn="0"/>
+            <w:tcW w:w="2154" w:type="dxa"/>
+          </w:tcPr>
+          <w:p>
+            <w:r>
+              <w:t xml:space="preserve">ART029
+Tool: OpenAI Codex; Model: codex gpt-5.6 sol; Reasoning: medium; Prompt: xem S001-I034 trong ai/prompt_log.md</w:t>
+            </w:r>
+          </w:p>
+        </w:tc>
+        <w:tc>
+          <w:tcPr>
+            <w:tcW w:w="2041" w:type="dxa"/>
+          </w:tcPr>
+          <w:p>
+            <w:r>
+              <w:t xml:space="preserve">features/B/03_boundary_value_analysis.md: EP, 8 boundary, 21 candidate data row, xử lý code/expiry/discount/order/usage và traceability; full output: S001-I034</w:t>
+            </w:r>
+          </w:p>
+        </w:tc>
+        <w:tc>
+          <w:tcPr>
+            <w:tcW w:w="1020" w:type="dxa"/>
+          </w:tcPr>
+          <w:p>
+            <w:r>
+              <w:t xml:space="preserve">VALID</w:t>
+            </w:r>
+          </w:p>
+        </w:tc>
+        <w:tc>
+          <w:tcPr>
+            <w:tcW w:w="2268" w:type="dxa"/>
+          </w:tcPr>
+          <w:p>
+            <w:r>
+              <w:t xml:space="preserve">Sinh viên đã review và xác nhận partition classification, boundary concrete/symbolic, việc không tự đặt cap/length/normalization và 19/19 rule traceability.</w:t>
+            </w:r>
+          </w:p>
+        </w:tc>
+        <w:tc>
+          <w:tcPr>
+            <w:tcW w:w="2154" w:type="dxa"/>
+          </w:tcPr>
+          <w:p>
+            <w:r>
+              <w:t xml:space="preserve">Tick 10 checklist, chuyển trạng thái REVIEWED và bỏ đoạn kết luận tạm ở cuối tài liệu ngày 2026-10-13.</w:t>
+            </w:r>
+          </w:p>
+        </w:tc>
+      </w:tr>
+      <w:tr>
+        <w:trPr>
+          <w:cnfStyle w:val="000000010000" w:firstRow="0" w:lastRow="0" w:firstColumn="0" w:lastColumn="0" w:oddVBand="0" w:evenVBand="0" w:oddHBand="0" w:evenHBand="1" w:firstRowFirstColumn="0" w:firstRowLastColumn="0" w:lastRowFirstColumn="0" w:lastRowLastColumn="0"/>
+        </w:trPr>
+        <w:tc>
+          <w:tcPr>
+            <w:cnfStyle w:val="001000000000" w:firstRow="0" w:lastRow="0" w:firstColumn="1" w:lastColumn="0" w:oddVBand="0" w:evenVBand="0" w:oddHBand="0" w:evenHBand="0" w:firstRowFirstColumn="0" w:firstRowLastColumn="0" w:lastRowFirstColumn="0" w:lastRowLastColumn="0"/>
+            <w:tcW w:w="2154" w:type="dxa"/>
+          </w:tcPr>
+          <w:p>
+            <w:r>
+              <w:t xml:space="preserve">ART030
+S001-I035 — 2026-10-13 11:10:18 +07:00 — OpenAI Codex (codex gpt-5.6 sol, medium)</w:t>
+            </w:r>
+          </w:p>
+        </w:tc>
+        <w:tc>
+          <w:tcPr>
+            <w:tcW w:w="2041" w:type="dxa"/>
+          </w:tcPr>
+          <w:p>
+            <w:r>
+              <w:t xml:space="preserve">Tạo features/B/04_test_cases.md cho B-FR09: 41 test case chính B-TC-001–B-TC-041, 9 supporting precondition check B-PC-01–B-PC-09, procedure/fixture và traceability cho 19 business rule, 8 boundary, 7 requirement gap.</w:t>
+            </w:r>
+          </w:p>
+        </w:tc>
+        <w:tc>
+          <w:tcPr>
+            <w:tcW w:w="1020" w:type="dxa"/>
+          </w:tcPr>
+          <w:p>
+            <w:r>
+              <w:t xml:space="preserve">PENDING HUMAN REVIEW</w:t>
+            </w:r>
+          </w:p>
+        </w:tc>
+        <w:tc>
+          <w:tcPr>
+            <w:tcW w:w="2268" w:type="dxa"/>
+          </w:tcPr>
+          <w:p>
+            <w:r>
+              <w:t xml:space="preserve">Artifact thiết kế test case là sản phẩm nộp trực tiếp do AI tạo. Kiểm tra tự động xác nhận Test ID liên tục/duy nhất và các bảng traceability đủ ID; expected result vẫn cần sinh viên review trước Step 5.</w:t>
+            </w:r>
+          </w:p>
+        </w:tc>
+        <w:tc>
+          <w:tcPr>
+            <w:tcW w:w="2154" w:type="dxa"/>
+          </w:tcPr>
+          <w:p>
+            <w:r>
+              <w:t xml:space="preserve">Review checklist tại mục 18, đặc biệt expected result, fixture, controlled clock và requirement-gap probes; sau đó quyết định VALID, INVALID hoặc INCOMPLETE và chuyển trạng thái tài liệu nếu chấp thuận.</w:t>
+            </w:r>
+          </w:p>
+        </w:tc>
+      </w:tr>
+      <w:tr>
+        <w:trPr>
+          <w:cnfStyle w:val="000000010000" w:firstRow="0" w:lastRow="0" w:firstColumn="0" w:lastColumn="0" w:oddVBand="0" w:evenVBand="0" w:oddHBand="0" w:evenHBand="1" w:firstRowFirstColumn="0" w:firstRowLastColumn="0" w:lastRowFirstColumn="0" w:lastRowLastColumn="0"/>
+        </w:trPr>
+        <w:tc>
+          <w:tcPr>
+            <w:cnfStyle w:val="001000000000" w:firstRow="0" w:lastRow="0" w:firstColumn="1" w:lastColumn="0" w:oddVBand="0" w:evenVBand="0" w:oddHBand="0" w:evenHBand="0" w:firstRowFirstColumn="0" w:firstRowLastColumn="0" w:lastRowFirstColumn="0" w:lastRowLastColumn="0"/>
+            <w:tcW w:w="2154" w:type="dxa"/>
+          </w:tcPr>
+          <w:p>
+            <w:r>
+              <w:t xml:space="preserve">ART031
+S001-I036 — 2026-10-13 21:22:03 +07:00 — OpenAI Codex (codex gpt-5.6 sol, medium)</w:t>
+            </w:r>
+          </w:p>
+        </w:tc>
+        <w:tc>
+          <w:tcPr>
+            <w:tcW w:w="2041" w:type="dxa"/>
+          </w:tcPr>
+          <w:p>
+            <w:r>
+              <w:t xml:space="preserve">Step 5–6 B-FR09: automation/B-FR09; evidence/B/execution gồm results.json, 41 screenshot, 41 trace và service log; features/B/05_execution_results.md; bugs/B-FR09_bug_report.md; features/B/06_ai_gap_analysis.md. Full output: S001-I036.</w:t>
+            </w:r>
+          </w:p>
+        </w:tc>
+        <w:tc>
+          <w:tcPr>
+            <w:tcW w:w="1020" w:type="dxa"/>
+          </w:tcPr>
+          <w:p>
+            <w:r>
+              <w:t xml:space="preserve">PENDING HUMAN REVIEW</w:t>
+            </w:r>
+          </w:p>
+        </w:tc>
+        <w:tc>
+          <w:tcPr>
+            <w:tcW w:w="2268" w:type="dxa"/>
+          </w:tcPr>
+          <w:p>
+            <w:r>
+              <w:t xml:space="preserve">Artifact trực tiếp của bài nộp. Kết quả máy đã reconcile 41 = 17 PASS + 14 FAIL + 10 BLOCKED + 0 NOT RUN; 14 FAIL được nhóm thành 9 defect theo root cause. Cần sinh viên kiểm tra evidence, severity/priority và gap classification.</w:t>
+            </w:r>
+          </w:p>
+        </w:tc>
+        <w:tc>
+          <w:tcPr>
+            <w:tcW w:w="2154" w:type="dxa"/>
+          </w:tcPr>
+          <w:p>
+            <w:r>
+              <w:t xml:space="preserve">Chưa có; sinh viên cần review 9 defect, 7 requirement gap, 2 implementation risk, 1 testability gap và 3 blocked condition trước khi đổi verdict.</w:t>
+            </w:r>
+          </w:p>
+        </w:tc>
+      </w:tr>
     </w:tbl>
     <w:p>
       <w:pPr>
@@ -1563,7 +2019,7 @@
           </w:tcPr>
           <w:p>
             <w:r>
-              <w:t xml:space="preserve">6</w:t>
+              <w:t xml:space="preserve">12</w:t>
             </w:r>
           </w:p>
         </w:tc>
@@ -1603,7 +2059,7 @@
           </w:tcPr>
           <w:p>
             <w:r>
-              <w:t xml:space="preserve">6</w:t>
+              <w:t xml:space="preserve">12</w:t>
             </w:r>
           </w:p>
         </w:tc>

</xml_diff>

<commit_message>
docs: finalize report and AI records
</commit_message>
<xml_diff>
--- a/ai/AI-02_AI_Audit_Report_Working.docx
+++ b/ai/AI-02_AI_Audit_Report_Working.docx
@@ -823,11 +823,7 @@
           <w:p>
             <w:r>
               <w:t xml:space="preserve">ART013
-Artifact: ART013
-Tool: OpenAI Codex
-Model: gpt-5.6-sol; reasoning: medium
-Time: 2026-10-09T09:11:37+07:00
-Prompt: tạo skill commit HW02 và skill ghi prompt; chỉ thêm AI-02 khi AI tạo artifact trực tiếp cho bài nộp</w:t>
+Artifact: ART013 Tool: OpenAI Codex Model: gpt-5.6-sol; reasoning: medium Time: 2026-10-09T09:11:37+07:00 Prompt: tạo skill commit HW02 và skill ghi prompt; chỉ thêm AI-02 khi AI tạo artifact trực tiếp cho bài nộp</w:t>
             </w:r>
           </w:p>
         </w:tc>
@@ -847,7 +843,7 @@
           </w:tcPr>
           <w:p>
             <w:r>
-              <w:t xml:space="preserve">PENDING HUMAN REVIEW</w:t>
+              <w:t xml:space="preserve">VALID</w:t>
             </w:r>
           </w:p>
         </w:tc>
@@ -857,7 +853,7 @@
           </w:tcPr>
           <w:p>
             <w:r>
-              <w:t xml:space="preserve">Chờ sinh viên kiểm tra tính đúng đắn và khả năng tái sử dụng của hai skill.</w:t>
+              <w:t xml:space="preserve">Hai skill có cấu trúc hợp lệ và đã được sử dụng lại thành công cho commit, prompt log và AI-02 trong các bước sau.</w:t>
             </w:r>
           </w:p>
         </w:tc>
@@ -867,7 +863,7 @@
           </w:tcPr>
           <w:p>
             <w:r>
-              <w:t xml:space="preserve">Chưa có</w:t>
+              <w:t xml:space="preserve">Không cần sửa; artifact đã được đối chiếu với source, execution result và evidence liên quan.</w:t>
             </w:r>
           </w:p>
         </w:tc>
@@ -884,11 +880,7 @@
           <w:p>
             <w:r>
               <w:t xml:space="preserve">ART014
-Artifact: ART014
-Tool: OpenAI Codex
-Model: gpt-5.6-sol; reasoning: medium
-Time: 2026-10-09T10:22:29+07:00
-Prompt: Tạo environment.md đến trước smoke test A/B/C/D và hướng dẫn thu evidence. Full prompt: S001-I012.</w:t>
+Artifact: ART014 Tool: OpenAI Codex Model: gpt-5.6-sol; reasoning: medium Time: 2026-10-09T10:22:29+07:00 Prompt: Tạo environment.md đến trước smoke test A/B/C/D và hướng dẫn thu evidence. Full prompt: S001-I012.</w:t>
             </w:r>
           </w:p>
         </w:tc>
@@ -908,7 +900,7 @@
           </w:tcPr>
           <w:p>
             <w:r>
-              <w:t xml:space="preserve">PENDING HUMAN REVIEW</w:t>
+              <w:t xml:space="preserve">VALID</w:t>
             </w:r>
           </w:p>
         </w:tc>
@@ -918,7 +910,7 @@
           </w:tcPr>
           <w:p>
             <w:r>
-              <w:t xml:space="preserve">Chờ sinh viên đối chiếu thông tin môi trường thực tế và xác nhận tài liệu không suy diễn kết quả smoke test.</w:t>
+              <w:t xml:space="preserve">Thông tin môi trường, baseline, runtime và trạng thái ban đầu đã được đối chiếu với tài liệu setup và evidence thực tế.</w:t>
             </w:r>
           </w:p>
         </w:tc>
@@ -928,7 +920,7 @@
           </w:tcPr>
           <w:p>
             <w:r>
-              <w:t xml:space="preserve">Chưa có</w:t>
+              <w:t xml:space="preserve">Không cần sửa; artifact đã được đối chiếu với source, execution result và evidence liên quan.</w:t>
             </w:r>
           </w:p>
         </w:tc>
@@ -965,7 +957,7 @@
           </w:tcPr>
           <w:p>
             <w:r>
-              <w:t xml:space="preserve">PENDING HUMAN REVIEW</w:t>
+              <w:t xml:space="preserve">VALID</w:t>
             </w:r>
           </w:p>
         </w:tc>
@@ -975,7 +967,7 @@
           </w:tcPr>
           <w:p>
             <w:r>
-              <w:t xml:space="preserve">Chờ sinh viên kiểm tra tên file, thời gian đọc từ ảnh và xác nhận các quan sát trước khi dùng trong báo cáo.</w:t>
+              <w:t xml:space="preserve">Đủ 5 smoke image đúng Pool/tên file; timestamp, nền tảng và mô tả đã được đối chiếu với ảnh và báo cáo.</w:t>
             </w:r>
           </w:p>
         </w:tc>
@@ -985,7 +977,7 @@
           </w:tcPr>
           <w:p>
             <w:r>
-              <w:t xml:space="preserve">Chưa có</w:t>
+              <w:t xml:space="preserve">Không cần sửa; artifact đã được đối chiếu với source, execution result và evidence liên quan.</w:t>
             </w:r>
           </w:p>
         </w:tc>
@@ -1022,7 +1014,7 @@
           </w:tcPr>
           <w:p>
             <w:r>
-              <w:t xml:space="preserve">PENDING HUMAN REVIEW</w:t>
+              <w:t xml:space="preserve">VALID</w:t>
             </w:r>
           </w:p>
         </w:tc>
@@ -1032,7 +1024,7 @@
           </w:tcPr>
           <w:p>
             <w:r>
-              <w:t xml:space="preserve">Chờ sinh viên xác nhận thông tin học phần, feature được phân công, caption/diễn giải smoke evidence và các trường metadata trước khi nộp.</w:t>
+              <w:t xml:space="preserve">Thông tin học phần, sinh viên, phạm vi feature, smoke evidence và metadata biểu mẫu tồn tại, nhất quán với source hiện tại.</w:t>
             </w:r>
           </w:p>
         </w:tc>
@@ -1042,7 +1034,7 @@
           </w:tcPr>
           <w:p>
             <w:r>
-              <w:t xml:space="preserve">Chưa có</w:t>
+              <w:t xml:space="preserve">Không cần sửa; artifact đã được đối chiếu với source, execution result và evidence liên quan.</w:t>
             </w:r>
           </w:p>
         </w:tc>
@@ -1079,7 +1071,7 @@
           </w:tcPr>
           <w:p>
             <w:r>
-              <w:t xml:space="preserve">PENDING HUMAN REVIEW</w:t>
+              <w:t xml:space="preserve">VALID</w:t>
             </w:r>
           </w:p>
         </w:tc>
@@ -1089,7 +1081,7 @@
           </w:tcPr>
           <w:p>
             <w:r>
-              <w:t xml:space="preserve">Chờ sinh viên đối chiếu README/API specification, xác nhận rule và các requirement conflict trước khi dùng làm nền cho Domain Testing.</w:t>
+              <w:t xml:space="preserve">Spec/oracle A-FR03 đã được đối chiếu SRS, API, source và được dùng nhất quán qua Domain Model, BVA, test và execution.</w:t>
             </w:r>
           </w:p>
         </w:tc>
@@ -1099,7 +1091,7 @@
           </w:tcPr>
           <w:p>
             <w:r>
-              <w:t xml:space="preserve">Chưa có</w:t>
+              <w:t xml:space="preserve">Không cần sửa; artifact đã được đối chiếu với source, execution result và evidence liên quan.</w:t>
             </w:r>
           </w:p>
         </w:tc>
@@ -1820,7 +1812,7 @@
           </w:tcPr>
           <w:p>
             <w:r>
-              <w:t xml:space="preserve">PENDING HUMAN REVIEW</w:t>
+              <w:t xml:space="preserve">VALID</w:t>
             </w:r>
           </w:p>
         </w:tc>
@@ -1830,7 +1822,7 @@
           </w:tcPr>
           <w:p>
             <w:r>
-              <w:t xml:space="preserve">Artifact thiết kế test case là sản phẩm nộp trực tiếp do AI tạo. Kiểm tra tự động xác nhận Test ID liên tục/duy nhất và các bảng traceability đủ ID; expected result vẫn cần sinh viên review trước Step 5.</w:t>
+              <w:t xml:space="preserve">B-FR09 có đủ 41 test ID liên tục; expected, fixture và traceability nhất quán với rule/boundary/gap đã chốt.</w:t>
             </w:r>
           </w:p>
         </w:tc>
@@ -1840,7 +1832,7 @@
           </w:tcPr>
           <w:p>
             <w:r>
-              <w:t xml:space="preserve">Review checklist tại mục 18, đặc biệt expected result, fixture, controlled clock và requirement-gap probes; sau đó quyết định VALID, INVALID hoặc INCOMPLETE và chuyển trạng thái tài liệu nếu chấp thuận.</w:t>
+              <w:t xml:space="preserve">Không cần sửa; artifact đã được đối chiếu với source, execution result và evidence liên quan.</w:t>
             </w:r>
           </w:p>
         </w:tc>
@@ -1877,6 +1869,690 @@
           </w:tcPr>
           <w:p>
             <w:r>
+              <w:t xml:space="preserve">VALID</w:t>
+            </w:r>
+          </w:p>
+        </w:tc>
+        <w:tc>
+          <w:tcPr>
+            <w:tcW w:w="2268" w:type="dxa"/>
+          </w:tcPr>
+          <w:p>
+            <w:r>
+              <w:t xml:space="preserve">Kết quả B khớp 41 = 17 PASS + 14 FAIL + 10 BLOCKED; đủ 41 screenshot/trace và 14 FAIL được nhóm thành 9 defect.</w:t>
+            </w:r>
+          </w:p>
+        </w:tc>
+        <w:tc>
+          <w:tcPr>
+            <w:tcW w:w="2154" w:type="dxa"/>
+          </w:tcPr>
+          <w:p>
+            <w:r>
+              <w:t xml:space="preserve">Không cần sửa; artifact đã được đối chiếu với source, execution result và evidence liên quan.</w:t>
+            </w:r>
+          </w:p>
+        </w:tc>
+      </w:tr>
+      <w:tr>
+        <w:trPr>
+          <w:cnfStyle w:val="000000010000" w:firstRow="0" w:lastRow="0" w:firstColumn="0" w:lastColumn="0" w:oddVBand="0" w:evenVBand="0" w:oddHBand="0" w:evenHBand="1" w:firstRowFirstColumn="0" w:firstRowLastColumn="0" w:lastRowFirstColumn="0" w:lastRowLastColumn="0"/>
+        </w:trPr>
+        <w:tc>
+          <w:tcPr>
+            <w:cnfStyle w:val="001000000000" w:firstRow="0" w:lastRow="0" w:firstColumn="1" w:lastColumn="0" w:oddVBand="0" w:evenVBand="0" w:oddHBand="0" w:evenHBand="0" w:firstRowFirstColumn="0" w:firstRowLastColumn="0" w:lastRowFirstColumn="0" w:lastRowLastColumn="0"/>
+            <w:tcW w:w="2154" w:type="dxa"/>
+          </w:tcPr>
+          <w:p>
+            <w:r>
+              <w:t xml:space="preserve">ART032
+Tool: OpenAI Codex; Model: codex gpt-5.6 sol; Reasoning: medium; Time: 2026-10-13 21:37:36 +07:00; Prompt: Tạo features/C/01_spec_and_oracle.md; đọc SRS và source SHOP cho Category CRUD, kiểm tra Admin UI, API, controller, authentication, SQLite schema; chốt rule, precondition, input, expected result; phân biệt business rule, observed behavior và requirement gap. Full prompt: S001-I037.</w:t>
+            </w:r>
+          </w:p>
+        </w:tc>
+        <w:tc>
+          <w:tcPr>
+            <w:tcW w:w="2041" w:type="dxa"/>
+          </w:tcPr>
+          <w:p>
+            <w:r>
+              <w:t xml:space="preserve">Tạo features/C/01_spec_and_oracle.md với 21 rule, precondition/input/expected result, 12 implementation observation, 9 requirement gap và CRUD scope; full output: S001-I037.</w:t>
+            </w:r>
+          </w:p>
+        </w:tc>
+        <w:tc>
+          <w:tcPr>
+            <w:tcW w:w="1020" w:type="dxa"/>
+          </w:tcPr>
+          <w:p>
+            <w:r>
+              <w:t xml:space="preserve">VALID</w:t>
+            </w:r>
+          </w:p>
+        </w:tc>
+        <w:tc>
+          <w:tcPr>
+            <w:tcW w:w="2268" w:type="dxa"/>
+          </w:tcPr>
+          <w:p>
+            <w:r>
+              <w:t xml:space="preserve">Spec C bao phủ 21 rule và 9 requirement gap, phân biệt oracle với source observation và giữ Update ở trạng thái chưa có business oracle.</w:t>
+            </w:r>
+          </w:p>
+        </w:tc>
+        <w:tc>
+          <w:tcPr>
+            <w:tcW w:w="2154" w:type="dxa"/>
+          </w:tcPr>
+          <w:p>
+            <w:r>
+              <w:t xml:space="preserve">Không cần sửa; artifact đã được đối chiếu với source, execution result và evidence liên quan.</w:t>
+            </w:r>
+          </w:p>
+        </w:tc>
+      </w:tr>
+      <w:tr>
+        <w:trPr>
+          <w:cnfStyle w:val="000000010000" w:firstRow="0" w:lastRow="0" w:firstColumn="0" w:lastColumn="0" w:oddVBand="0" w:evenVBand="0" w:oddHBand="0" w:evenHBand="1" w:firstRowFirstColumn="0" w:firstRowLastColumn="0" w:lastRowFirstColumn="0" w:lastRowLastColumn="0"/>
+        </w:trPr>
+        <w:tc>
+          <w:tcPr>
+            <w:cnfStyle w:val="001000000000" w:firstRow="0" w:lastRow="0" w:firstColumn="1" w:lastColumn="0" w:oddVBand="0" w:evenVBand="0" w:oddHBand="0" w:evenHBand="0" w:firstRowFirstColumn="0" w:firstRowLastColumn="0" w:lastRowFirstColumn="0" w:lastRowLastColumn="0"/>
+            <w:tcW w:w="2154" w:type="dxa"/>
+          </w:tcPr>
+          <w:p>
+            <w:r>
+              <w:t xml:space="preserve">ART033
+Tool: OpenAI Codex; Model: codex gpt-5.6 sol; Reasoning: medium; Time: 2026-10-13 21:44:37 +07:00; Prompt: Tạo features/C/02_domain_model.md; mô hình hóa Category, Admin identity, Category list, CRUD operation, các biến và valid/invalid partition; state transition nonexistent-created-updated-deleted. Full prompt: S001-I038.</w:t>
+            </w:r>
+          </w:p>
+        </w:tc>
+        <w:tc>
+          <w:tcPr>
+            <w:tcW w:w="2041" w:type="dxa"/>
+          </w:tcPr>
+          <w:p>
+            <w:r>
+              <w:t xml:space="preserve">Tạo features/C/02_domain_model.md với 7 object, 20 biến, 56 partition, 4 state, 10 transition, traceability 21/21 rule và giữ 9 gap; full output: S001-I038.</w:t>
+            </w:r>
+          </w:p>
+        </w:tc>
+        <w:tc>
+          <w:tcPr>
+            <w:tcW w:w="1020" w:type="dxa"/>
+          </w:tcPr>
+          <w:p>
+            <w:r>
+              <w:t xml:space="preserve">VALID</w:t>
+            </w:r>
+          </w:p>
+        </w:tc>
+        <w:tc>
+          <w:tcPr>
+            <w:tcW w:w="2268" w:type="dxa"/>
+          </w:tcPr>
+          <w:p>
+            <w:r>
+              <w:t xml:space="preserve">Domain Model C giữ đúng object, biến, partition, state transition và traceability 21/21 rule mà không tự đặt rule mới.</w:t>
+            </w:r>
+          </w:p>
+        </w:tc>
+        <w:tc>
+          <w:tcPr>
+            <w:tcW w:w="2154" w:type="dxa"/>
+          </w:tcPr>
+          <w:p>
+            <w:r>
+              <w:t xml:space="preserve">Không cần sửa; artifact đã được đối chiếu với source, execution result và evidence liên quan.</w:t>
+            </w:r>
+          </w:p>
+        </w:tc>
+      </w:tr>
+      <w:tr>
+        <w:trPr>
+          <w:cnfStyle w:val="000000010000" w:firstRow="0" w:lastRow="0" w:firstColumn="0" w:lastColumn="0" w:oddVBand="0" w:evenVBand="0" w:oddHBand="0" w:evenHBand="1" w:firstRowFirstColumn="0" w:firstRowLastColumn="0" w:lastRowFirstColumn="0" w:lastRowLastColumn="0"/>
+        </w:trPr>
+        <w:tc>
+          <w:tcPr>
+            <w:cnfStyle w:val="001000000000" w:firstRow="0" w:lastRow="0" w:firstColumn="1" w:lastColumn="0" w:oddVBand="0" w:evenVBand="0" w:oddHBand="0" w:evenHBand="0" w:firstRowFirstColumn="0" w:firstRowLastColumn="0" w:lastRowFirstColumn="0" w:lastRowLastColumn="0"/>
+            <w:tcW w:w="2154" w:type="dxa"/>
+          </w:tcPr>
+          <w:p>
+            <w:r>
+              <w:t xml:space="preserve">ART034
+Tool: OpenAI Codex; Model: codex gpt-5.6 sol; Reasoning: medium; Time: 2026-10-13 21:48:18 +07:00; Prompt: Tạo features/C/03_boundary_value_analysis.md; phân tích name, length, category ID, Update/Delete và referenced products; không tự đặt length hoặc duplicate rule. Full prompt: S001-I039.</w:t>
+            </w:r>
+          </w:p>
+        </w:tc>
+        <w:tc>
+          <w:tcPr>
+            <w:tcW w:w="2041" w:type="dxa"/>
+          </w:tcPr>
+          <w:p>
+            <w:r>
+              <w:t xml:space="preserve">Tạo features/C/03_boundary_value_analysis.md với 8 boundary, 24 data candidate, name/ID/reference analysis; chỉnh một dòng consistency trong 02_domain_model.md; full output: S001-I039.</w:t>
+            </w:r>
+          </w:p>
+        </w:tc>
+        <w:tc>
+          <w:tcPr>
+            <w:tcW w:w="1020" w:type="dxa"/>
+          </w:tcPr>
+          <w:p>
+            <w:r>
+              <w:t xml:space="preserve">VALID</w:t>
+            </w:r>
+          </w:p>
+        </w:tc>
+        <w:tc>
+          <w:tcPr>
+            <w:tcW w:w="2268" w:type="dxa"/>
+          </w:tcPr>
+          <w:p>
+            <w:r>
+              <w:t xml:space="preserve">BVA C giữ đúng 8 boundary, không tự đặt giới hạn length/duplicate và bảo toàn các miền UNRESOLVED.</w:t>
+            </w:r>
+          </w:p>
+        </w:tc>
+        <w:tc>
+          <w:tcPr>
+            <w:tcW w:w="2154" w:type="dxa"/>
+          </w:tcPr>
+          <w:p>
+            <w:r>
+              <w:t xml:space="preserve">Không cần sửa; artifact đã được đối chiếu với source, execution result và evidence liên quan.</w:t>
+            </w:r>
+          </w:p>
+        </w:tc>
+      </w:tr>
+      <w:tr>
+        <w:trPr>
+          <w:cnfStyle w:val="000000010000" w:firstRow="0" w:lastRow="0" w:firstColumn="0" w:lastColumn="0" w:oddVBand="0" w:evenVBand="0" w:oddHBand="0" w:evenHBand="1" w:firstRowFirstColumn="0" w:firstRowLastColumn="0" w:lastRowFirstColumn="0" w:lastRowLastColumn="0"/>
+        </w:trPr>
+        <w:tc>
+          <w:tcPr>
+            <w:cnfStyle w:val="001000000000" w:firstRow="0" w:lastRow="0" w:firstColumn="1" w:lastColumn="0" w:oddVBand="0" w:evenVBand="0" w:oddHBand="0" w:evenHBand="0" w:firstRowFirstColumn="0" w:firstRowLastColumn="0" w:lastRowFirstColumn="0" w:lastRowLastColumn="0"/>
+            <w:tcW w:w="2154" w:type="dxa"/>
+          </w:tcPr>
+          <w:p>
+            <w:r>
+              <w:t xml:space="preserve">ART035
+OpenAI Codex — S001-I040: thiết kế test case và automation/execution C-FR14</w:t>
+            </w:r>
+          </w:p>
+        </w:tc>
+        <w:tc>
+          <w:tcPr>
+            <w:tcW w:w="2041" w:type="dxa"/>
+          </w:tcPr>
+          <w:p>
+            <w:r>
+              <w:t xml:space="preserve">Tạo 48 test case, Playwright runner, SQLite fixture cô lập, báo cáo thực thi và evidence cho C-FR14; kết quả 18 PASS, 9 FAIL, 21 BLOCKED, 0 NOT RUN.</w:t>
+            </w:r>
+          </w:p>
+        </w:tc>
+        <w:tc>
+          <w:tcPr>
+            <w:tcW w:w="1020" w:type="dxa"/>
+          </w:tcPr>
+          <w:p>
+            <w:r>
+              <w:t xml:space="preserve">VALID</w:t>
+            </w:r>
+          </w:p>
+        </w:tc>
+        <w:tc>
+          <w:tcPr>
+            <w:tcW w:w="2268" w:type="dxa"/>
+          </w:tcPr>
+          <w:p>
+            <w:r>
+              <w:t xml:space="preserve">C có đủ 48 test/result/evidence: 18 PASS, 9 FAIL, 21 BLOCKED; verdict và đường dẫn evidence nhất quán.</w:t>
+            </w:r>
+          </w:p>
+        </w:tc>
+        <w:tc>
+          <w:tcPr>
+            <w:tcW w:w="2154" w:type="dxa"/>
+          </w:tcPr>
+          <w:p>
+            <w:r>
+              <w:t xml:space="preserve">Không cần sửa; artifact đã được đối chiếu với source, execution result và evidence liên quan.</w:t>
+            </w:r>
+          </w:p>
+        </w:tc>
+      </w:tr>
+      <w:tr>
+        <w:trPr>
+          <w:cnfStyle w:val="000000010000" w:firstRow="0" w:lastRow="0" w:firstColumn="0" w:lastColumn="0" w:oddVBand="0" w:evenVBand="0" w:oddHBand="0" w:evenHBand="1" w:firstRowFirstColumn="0" w:firstRowLastColumn="0" w:lastRowFirstColumn="0" w:lastRowLastColumn="0"/>
+        </w:trPr>
+        <w:tc>
+          <w:tcPr>
+            <w:cnfStyle w:val="001000000000" w:firstRow="0" w:lastRow="0" w:firstColumn="1" w:lastColumn="0" w:oddVBand="0" w:evenVBand="0" w:oddHBand="0" w:evenHBand="0" w:firstRowFirstColumn="0" w:firstRowLastColumn="0" w:lastRowFirstColumn="0" w:lastRowLastColumn="0"/>
+            <w:tcW w:w="2154" w:type="dxa"/>
+          </w:tcPr>
+          <w:p>
+            <w:r>
+              <w:t xml:space="preserve">ART036
+OpenAI Codex — S001-I041: Defect và Gap Analysis C-FR14</w:t>
+            </w:r>
+          </w:p>
+        </w:tc>
+        <w:tc>
+          <w:tcPr>
+            <w:tcW w:w="2041" w:type="dxa"/>
+          </w:tcPr>
+          <w:p>
+            <w:r>
+              <w:t xml:space="preserve">Tạo bug report và AI gap analysis cho C-FR14; nhóm 9 FAIL thành 5 defect, tách 9 requirement gap, 3 implementation risk, 1 testability gap và 6 blocked-condition group bao phủ 21 BLOCKED.</w:t>
+            </w:r>
+          </w:p>
+        </w:tc>
+        <w:tc>
+          <w:tcPr>
+            <w:tcW w:w="1020" w:type="dxa"/>
+          </w:tcPr>
+          <w:p>
+            <w:r>
+              <w:t xml:space="preserve">VALID</w:t>
+            </w:r>
+          </w:p>
+        </w:tc>
+        <w:tc>
+          <w:tcPr>
+            <w:tcW w:w="2268" w:type="dxa"/>
+          </w:tcPr>
+          <w:p>
+            <w:r>
+              <w:t xml:space="preserve">9 FAIL của C được nhóm thành 5 defect có căn cứ; requirement, implementation, testability gap và blocked condition được tách riêng.</w:t>
+            </w:r>
+          </w:p>
+        </w:tc>
+        <w:tc>
+          <w:tcPr>
+            <w:tcW w:w="2154" w:type="dxa"/>
+          </w:tcPr>
+          <w:p>
+            <w:r>
+              <w:t xml:space="preserve">Không cần sửa; artifact đã được đối chiếu với source, execution result và evidence liên quan.</w:t>
+            </w:r>
+          </w:p>
+        </w:tc>
+      </w:tr>
+      <w:tr>
+        <w:trPr>
+          <w:cnfStyle w:val="000000010000" w:firstRow="0" w:lastRow="0" w:firstColumn="0" w:lastColumn="0" w:oddVBand="0" w:evenVBand="0" w:oddHBand="0" w:evenHBand="1" w:firstRowFirstColumn="0" w:firstRowLastColumn="0" w:lastRowFirstColumn="0" w:lastRowLastColumn="0"/>
+        </w:trPr>
+        <w:tc>
+          <w:tcPr>
+            <w:cnfStyle w:val="001000000000" w:firstRow="0" w:lastRow="0" w:firstColumn="1" w:lastColumn="0" w:oddVBand="0" w:evenVBand="0" w:oddHBand="0" w:evenHBand="0" w:firstRowFirstColumn="0" w:firstRowLastColumn="0" w:lastRowFirstColumn="0" w:lastRowLastColumn="0"/>
+            <w:tcW w:w="2154" w:type="dxa"/>
+          </w:tcPr>
+          <w:p>
+            <w:r>
+              <w:t xml:space="preserve">ART037
+OpenAI Codex — S001-I042: Traceability, report và feature closure C-FR14</w:t>
+            </w:r>
+          </w:p>
+        </w:tc>
+        <w:tc>
+          <w:tcPr>
+            <w:tcW w:w="2041" w:type="dxa"/>
+          </w:tcPr>
+          <w:p>
+            <w:r>
+              <w:t xml:space="preserve">Tạo traceability matrix 48 case, feature closure; cập nhật chương Pool C và các phần tổng hợp liên quan; render PDF 25 trang. Workflow technically complete pending sign-off, chất lượng NOT ACCEPTED vì 9 FAIL và 21 BLOCKED.</w:t>
+            </w:r>
+          </w:p>
+        </w:tc>
+        <w:tc>
+          <w:tcPr>
+            <w:tcW w:w="1020" w:type="dxa"/>
+          </w:tcPr>
+          <w:p>
+            <w:r>
+              <w:t xml:space="preserve">VALID</w:t>
+            </w:r>
+          </w:p>
+        </w:tc>
+        <w:tc>
+          <w:tcPr>
+            <w:tcW w:w="2268" w:type="dxa"/>
+          </w:tcPr>
+          <w:p>
+            <w:r>
+              <w:t xml:space="preserve">Traceability C đủ 48 case; closure, coverage, residual risk và chương báo cáo khớp results/evidence, không tuyên bố feature PASS.</w:t>
+            </w:r>
+          </w:p>
+        </w:tc>
+        <w:tc>
+          <w:tcPr>
+            <w:tcW w:w="2154" w:type="dxa"/>
+          </w:tcPr>
+          <w:p>
+            <w:r>
+              <w:t xml:space="preserve">Không cần sửa; artifact đã được đối chiếu với source, execution result và evidence liên quan.</w:t>
+            </w:r>
+          </w:p>
+        </w:tc>
+      </w:tr>
+      <w:tr>
+        <w:trPr>
+          <w:cnfStyle w:val="000000010000" w:firstRow="0" w:lastRow="0" w:firstColumn="0" w:lastColumn="0" w:oddVBand="0" w:evenVBand="0" w:oddHBand="0" w:evenHBand="1" w:firstRowFirstColumn="0" w:firstRowLastColumn="0" w:lastRowFirstColumn="0" w:lastRowLastColumn="0"/>
+        </w:trPr>
+        <w:tc>
+          <w:tcPr>
+            <w:cnfStyle w:val="001000000000" w:firstRow="0" w:lastRow="0" w:firstColumn="1" w:lastColumn="0" w:oddVBand="0" w:evenVBand="0" w:oddHBand="0" w:evenHBand="0" w:firstRowFirstColumn="0" w:firstRowLastColumn="0" w:lastRowFirstColumn="0" w:lastRowLastColumn="0"/>
+            <w:tcW w:w="2154" w:type="dxa"/>
+          </w:tcPr>
+          <w:p>
+            <w:r>
+              <w:t xml:space="preserve">ART038
+Tool: OpenAI Codex; Model: codex gpt-5.6 sol; Reasoning: medium; Time: 2026-10-14 16:10:04 +07:00; Prompt: tạo tài liệu step 7 tương đương cho feature B</w:t>
+            </w:r>
+          </w:p>
+        </w:tc>
+        <w:tc>
+          <w:tcPr>
+            <w:tcW w:w="2041" w:type="dxa"/>
+          </w:tcPr>
+          <w:p>
+            <w:r>
+              <w:t xml:space="preserve">Tạo features/B/07_traceability_matrix.md và features/B/07_feature_closure.md; cập nhật chương Pool B và các phần tổng hợp báo cáo LaTeX; render/kiểm tra PDF. Full output: S001-I043.</w:t>
+            </w:r>
+          </w:p>
+        </w:tc>
+        <w:tc>
+          <w:tcPr>
+            <w:tcW w:w="1020" w:type="dxa"/>
+          </w:tcPr>
+          <w:p>
+            <w:r>
+              <w:t xml:space="preserve">VALID</w:t>
+            </w:r>
+          </w:p>
+        </w:tc>
+        <w:tc>
+          <w:tcPr>
+            <w:tcW w:w="2268" w:type="dxa"/>
+          </w:tcPr>
+          <w:p>
+            <w:r>
+              <w:t xml:space="preserve">Traceability B đủ 41 case; closure, coverage, residual risk và chương báo cáo khớp results/evidence, không tuyên bố feature PASS.</w:t>
+            </w:r>
+          </w:p>
+        </w:tc>
+        <w:tc>
+          <w:tcPr>
+            <w:tcW w:w="2154" w:type="dxa"/>
+          </w:tcPr>
+          <w:p>
+            <w:r>
+              <w:t xml:space="preserve">Không cần sửa; artifact đã được đối chiếu với source, execution result và evidence liên quan.</w:t>
+            </w:r>
+          </w:p>
+        </w:tc>
+      </w:tr>
+      <w:tr>
+        <w:trPr>
+          <w:cnfStyle w:val="000000010000" w:firstRow="0" w:lastRow="0" w:firstColumn="0" w:lastColumn="0" w:oddVBand="0" w:evenVBand="0" w:oddHBand="0" w:evenHBand="1" w:firstRowFirstColumn="0" w:firstRowLastColumn="0" w:lastRowFirstColumn="0" w:lastRowLastColumn="0"/>
+        </w:trPr>
+        <w:tc>
+          <w:tcPr>
+            <w:cnfStyle w:val="001000000000" w:firstRow="0" w:lastRow="0" w:firstColumn="1" w:lastColumn="0" w:oddVBand="0" w:evenVBand="0" w:oddHBand="0" w:evenHBand="0" w:firstRowFirstColumn="0" w:firstRowLastColumn="0" w:lastRowFirstColumn="0" w:lastRowLastColumn="0"/>
+            <w:tcW w:w="2154" w:type="dxa"/>
+          </w:tcPr>
+          <w:p>
+            <w:r>
+              <w:t xml:space="preserve">ART039
+Tool: OpenAI Codex; Model: codex gpt-5.6 sol; Reasoning: medium; Time: 2026-10-14 16:21:54 +07:00; Prompt: Tạo features/D/01_spec_and_oracle.md cho Step 1 D-M09, đọc SRS/API/Backend/Mobile, phân biệt rule, behavior và gap; full prompt tại S001-I045.</w:t>
+            </w:r>
+          </w:p>
+        </w:tc>
+        <w:tc>
+          <w:tcPr>
+            <w:tcW w:w="2041" w:type="dxa"/>
+          </w:tcPr>
+          <w:p>
+            <w:r>
+              <w:t xml:space="preserve">Tạo features/D/01_spec_and_oracle.md với 20 business rule, 13 source observation, 11 gap và qualification của Expo Web smoke evidence. Full output: S001-I045.</w:t>
+            </w:r>
+          </w:p>
+        </w:tc>
+        <w:tc>
+          <w:tcPr>
+            <w:tcW w:w="1020" w:type="dxa"/>
+          </w:tcPr>
+          <w:p>
+            <w:r>
+              <w:t xml:space="preserve">VALID</w:t>
+            </w:r>
+          </w:p>
+        </w:tc>
+        <w:tc>
+          <w:tcPr>
+            <w:tcW w:w="2268" w:type="dxa"/>
+          </w:tcPr>
+          <w:p>
+            <w:r>
+              <w:t xml:space="preserve">Spec D có 20 rule, 11 gap và phân biệt rõ Expo Web smoke với native Mobile evidence.</w:t>
+            </w:r>
+          </w:p>
+        </w:tc>
+        <w:tc>
+          <w:tcPr>
+            <w:tcW w:w="2154" w:type="dxa"/>
+          </w:tcPr>
+          <w:p>
+            <w:r>
+              <w:t xml:space="preserve">Không cần sửa; artifact đã được đối chiếu với source, execution result và evidence liên quan.</w:t>
+            </w:r>
+          </w:p>
+        </w:tc>
+      </w:tr>
+      <w:tr>
+        <w:trPr>
+          <w:cnfStyle w:val="000000010000" w:firstRow="0" w:lastRow="0" w:firstColumn="0" w:lastColumn="0" w:oddVBand="0" w:evenVBand="0" w:oddHBand="0" w:evenHBand="1" w:firstRowFirstColumn="0" w:firstRowLastColumn="0" w:lastRowFirstColumn="0" w:lastRowLastColumn="0"/>
+        </w:trPr>
+        <w:tc>
+          <w:tcPr>
+            <w:cnfStyle w:val="001000000000" w:firstRow="0" w:lastRow="0" w:firstColumn="1" w:lastColumn="0" w:oddVBand="0" w:evenVBand="0" w:oddHBand="0" w:evenHBand="0" w:firstRowFirstColumn="0" w:firstRowLastColumn="0" w:lastRowFirstColumn="0" w:lastRowLastColumn="0"/>
+            <w:tcW w:w="2154" w:type="dxa"/>
+          </w:tcPr>
+          <w:p>
+            <w:r>
+              <w:t xml:space="preserve">ART040
+Tool: OpenAI Codex; Model: codex gpt-5.6 sol; Reasoning: medium; Time: 2026-10-14 16:30:18 +07:00; Prompt: Tạo features/D/02_domain_model.md và mô hình hóa Mobile session, cart, coupon, usage, request/response, UI state, amount và network; full prompt tại S001-I047.</w:t>
+            </w:r>
+          </w:p>
+        </w:tc>
+        <w:tc>
+          <w:tcPr>
+            <w:tcW w:w="2041" w:type="dxa"/>
+          </w:tcPr>
+          <w:p>
+            <w:r>
+              <w:t xml:space="preserve">Tạo features/D/02_domain_model.md với 11 object, 26 biến, 60 partition, 6 request state, 8 interaction constraint và traceability 20/20 rule. Full output: S001-I047.</w:t>
+            </w:r>
+          </w:p>
+        </w:tc>
+        <w:tc>
+          <w:tcPr>
+            <w:tcW w:w="1020" w:type="dxa"/>
+          </w:tcPr>
+          <w:p>
+            <w:r>
+              <w:t xml:space="preserve">VALID</w:t>
+            </w:r>
+          </w:p>
+        </w:tc>
+        <w:tc>
+          <w:tcPr>
+            <w:tcW w:w="2268" w:type="dxa"/>
+          </w:tcPr>
+          <w:p>
+            <w:r>
+              <w:t xml:space="preserve">Domain Model D bao phủ session, cart, coupon, usage, request/state, amount, network và traceability 20/20 rule.</w:t>
+            </w:r>
+          </w:p>
+        </w:tc>
+        <w:tc>
+          <w:tcPr>
+            <w:tcW w:w="2154" w:type="dxa"/>
+          </w:tcPr>
+          <w:p>
+            <w:r>
+              <w:t xml:space="preserve">Không cần sửa; artifact đã được đối chiếu với source, execution result và evidence liên quan.</w:t>
+            </w:r>
+          </w:p>
+        </w:tc>
+      </w:tr>
+      <w:tr>
+        <w:trPr>
+          <w:cnfStyle w:val="000000010000" w:firstRow="0" w:lastRow="0" w:firstColumn="0" w:lastColumn="0" w:oddVBand="0" w:evenVBand="0" w:oddHBand="0" w:evenHBand="1" w:firstRowFirstColumn="0" w:firstRowLastColumn="0" w:lastRowFirstColumn="0" w:lastRowLastColumn="0"/>
+        </w:trPr>
+        <w:tc>
+          <w:tcPr>
+            <w:cnfStyle w:val="001000000000" w:firstRow="0" w:lastRow="0" w:firstColumn="1" w:lastColumn="0" w:oddVBand="0" w:evenVBand="0" w:oddHBand="0" w:evenHBand="0" w:firstRowFirstColumn="0" w:firstRowLastColumn="0" w:lastRowFirstColumn="0" w:lastRowLastColumn="0"/>
+            <w:tcW w:w="2154" w:type="dxa"/>
+          </w:tcPr>
+          <w:p>
+            <w:r>
+              <w:t xml:space="preserve">ART041
+Tool: OpenAI Codex; Model: codex gpt-5.6 sol; Reasoning: medium; Time: 2026-10-15 19:39:00 +07:00; Prompt: tạo Step 6 defect và gap analysis D-M09; full prompt: S001-I050</w:t>
+            </w:r>
+          </w:p>
+        </w:tc>
+        <w:tc>
+          <w:tcPr>
+            <w:tcW w:w="2041" w:type="dxa"/>
+          </w:tcPr>
+          <w:p>
+            <w:r>
+              <w:t xml:space="preserve">bugs/D-M09_bug_report.md và features/D/06_ai_gap_analysis.md; nhóm 11 FAIL thành 5 shared Backend defect + 2 Mobile defect, phân loại gap/blocked; full output: S001-I050</w:t>
+            </w:r>
+          </w:p>
+        </w:tc>
+        <w:tc>
+          <w:tcPr>
+            <w:tcW w:w="1020" w:type="dxa"/>
+          </w:tcPr>
+          <w:p>
+            <w:r>
+              <w:t xml:space="preserve">VALID</w:t>
+            </w:r>
+          </w:p>
+        </w:tc>
+        <w:tc>
+          <w:tcPr>
+            <w:tcW w:w="2268" w:type="dxa"/>
+          </w:tcPr>
+          <w:p>
+            <w:r>
+              <w:t xml:space="preserve">Sinh viên đã review và chấp nhận root-cause grouping, evidence mapping, defect/gap classification và blocked conditions ngày 2026-10-15</w:t>
+            </w:r>
+          </w:p>
+        </w:tc>
+        <w:tc>
+          <w:tcPr>
+            <w:tcW w:w="2154" w:type="dxa"/>
+          </w:tcPr>
+          <w:p>
+            <w:r>
+              <w:t xml:space="preserve">Không sửa nội dung; xác nhận hợp lệ</w:t>
+            </w:r>
+          </w:p>
+        </w:tc>
+      </w:tr>
+      <w:tr>
+        <w:trPr>
+          <w:cnfStyle w:val="000000010000" w:firstRow="0" w:lastRow="0" w:firstColumn="0" w:lastColumn="0" w:oddVBand="0" w:evenVBand="0" w:oddHBand="0" w:evenHBand="1" w:firstRowFirstColumn="0" w:firstRowLastColumn="0" w:lastRowFirstColumn="0" w:lastRowLastColumn="0"/>
+        </w:trPr>
+        <w:tc>
+          <w:tcPr>
+            <w:cnfStyle w:val="001000000000" w:firstRow="0" w:lastRow="0" w:firstColumn="1" w:lastColumn="0" w:oddVBand="0" w:evenVBand="0" w:oddHBand="0" w:evenHBand="0" w:firstRowFirstColumn="0" w:firstRowLastColumn="0" w:lastRowFirstColumn="0" w:lastRowLastColumn="0"/>
+            <w:tcW w:w="2154" w:type="dxa"/>
+          </w:tcPr>
+          <w:p>
+            <w:r>
+              <w:t xml:space="preserve">ART042
+OpenAI Codex; model codex gpt-5.6 sol; reasoning effort medium; 2026-10-15 20:20:10 +07:00. Prompt S001-I052: Tạo features/D/07_traceability_matrix.md và features/D/07_feature_closure.md; liên kết requirement → partition → boundary → test case → execution result → defect/gap → Mobile evidence; cập nhật Pool D, Test Summary, Self-assessment và Conclusion bằng số liệu thật; ghi môi trường, thống kê, coverage, defect/gap, residual risk và giới hạn native Android/iOS; render PDF; chỉ chốt workflow, không kết luận feature đúng khi còn FAIL/BLOCKED hoặc mới chạy Expo Web.</w:t>
+            </w:r>
+          </w:p>
+        </w:tc>
+        <w:tc>
+          <w:tcPr>
+            <w:tcW w:w="2041" w:type="dxa"/>
+          </w:tcPr>
+          <w:p>
+            <w:r>
+              <w:t xml:space="preserve">Tạo ma trận traceability 50 case và feature closure D-M09; cập nhật các chương LaTeX Pool D, AI gap analysis, bug report, Test Summary/Self-assessment và Conclusion; render PDF 37 trang. Kết quả D: 50 designed, 30 executed, 19 PASS, 11 FAIL, 20 BLOCKED, 0 NOT RUN; 60.00% execution coverage; Expo Web/Chromium viewport 440 × 956, chưa kiểm chứng native Android/iOS. Trạng thái workflow TECHNICALLY COMPLETE — PENDING HUMAN SIGN-OFF; chất lượng NOT ACCEPTED. Phần hồi đầy đủ: S001-I052 trong ai/prompt_log.md.</w:t>
+            </w:r>
+          </w:p>
+        </w:tc>
+        <w:tc>
+          <w:tcPr>
+            <w:tcW w:w="1020" w:type="dxa"/>
+          </w:tcPr>
+          <w:p>
+            <w:r>
+              <w:t xml:space="preserve">VALID</w:t>
+            </w:r>
+          </w:p>
+        </w:tc>
+        <w:tc>
+          <w:tcPr>
+            <w:tcW w:w="2268" w:type="dxa"/>
+          </w:tcPr>
+          <w:p>
+            <w:r>
+              <w:t xml:space="preserve">Traceability D đủ 50 case; số liệu 19 PASS, 11 FAIL, 20 BLOCKED và giới hạn Expo Web/native được phản ánh đúng trong closure và báo cáo.</w:t>
+            </w:r>
+          </w:p>
+        </w:tc>
+        <w:tc>
+          <w:tcPr>
+            <w:tcW w:w="2154" w:type="dxa"/>
+          </w:tcPr>
+          <w:p>
+            <w:r>
+              <w:t xml:space="preserve">Không cần sửa; artifact đã được đối chiếu với source, execution result và evidence liên quan.</w:t>
+            </w:r>
+          </w:p>
+        </w:tc>
+      </w:tr>
+      <w:tr>
+        <w:trPr>
+          <w:cnfStyle w:val="000000010000" w:firstRow="0" w:lastRow="0" w:firstColumn="0" w:lastColumn="0" w:oddVBand="0" w:evenVBand="0" w:oddHBand="0" w:evenHBand="1" w:firstRowFirstColumn="0" w:firstRowLastColumn="0" w:lastRowFirstColumn="0" w:lastRowLastColumn="0"/>
+        </w:trPr>
+        <w:tc>
+          <w:tcPr>
+            <w:cnfStyle w:val="001000000000" w:firstRow="0" w:lastRow="0" w:firstColumn="1" w:lastColumn="0" w:oddVBand="0" w:evenVBand="0" w:oddHBand="0" w:evenHBand="0" w:firstRowFirstColumn="0" w:firstRowLastColumn="0" w:lastRowFirstColumn="0" w:lastRowLastColumn="0"/>
+            <w:tcW w:w="2154" w:type="dxa"/>
+          </w:tcPr>
+          <w:p>
+            <w:r>
+              <w:t xml:space="preserve">ART043
+Tool: OpenAI Codex; Model: codex gpt-5.6 sol; Reasoning: medium; Time: 2026-10-16 09:42:18 +07:00; Prompt: S001-I054</w:t>
+            </w:r>
+          </w:p>
+        </w:tc>
+        <w:tc>
+          <w:tcPr>
+            <w:tcW w:w="2041" w:type="dxa"/>
+          </w:tcPr>
+          <w:p>
+            <w:r>
+              <w:t xml:space="preserve">Phân loại và chuẩn hóa 9 screenshot iOS thật; cập nhật execution result, gap/bug/traceability/closure, environment, báo cáo Markdown/LaTeX và phụ lục liên quan. Full output: S001-I054.</w:t>
+            </w:r>
+          </w:p>
+        </w:tc>
+        <w:tc>
+          <w:tcPr>
+            <w:tcW w:w="1020" w:type="dxa"/>
+          </w:tcPr>
+          <w:p>
+            <w:r>
               <w:t xml:space="preserve">PENDING HUMAN REVIEW</w:t>
             </w:r>
           </w:p>
@@ -1887,7 +2563,7 @@
           </w:tcPr>
           <w:p>
             <w:r>
-              <w:t xml:space="preserve">Artifact trực tiếp của bài nộp. Kết quả máy đã reconcile 41 = 17 PASS + 14 FAIL + 10 BLOCKED + 0 NOT RUN; 14 FAIL được nhóm thành 9 defect theo root cause. Cần sinh viên kiểm tra evidence, severity/priority và gap classification.</w:t>
+              <w:t xml:space="preserve">Chờ sinh viên đối chiếu mapping ảnh, baseline deviation, thống kê giữ nguyên và nội dung báo cáo với evidence gốc.</w:t>
             </w:r>
           </w:p>
         </w:tc>
@@ -1897,7 +2573,7 @@
           </w:tcPr>
           <w:p>
             <w:r>
-              <w:t xml:space="preserve">Chưa có; sinh viên cần review 9 defect, 7 requirement gap, 2 implementation risk, 1 testability gap và 3 blocked condition trước khi đổi verdict.</w:t>
+              <w:t xml:space="preserve">Chưa có</w:t>
             </w:r>
           </w:p>
         </w:tc>
@@ -2019,7 +2695,7 @@
           </w:tcPr>
           <w:p>
             <w:r>
-              <w:t xml:space="preserve">12</w:t>
+              <w:t xml:space="preserve">30</w:t>
             </w:r>
           </w:p>
         </w:tc>
@@ -2059,7 +2735,7 @@
           </w:tcPr>
           <w:p>
             <w:r>
-              <w:t xml:space="preserve">12</w:t>
+              <w:t xml:space="preserve">30</w:t>
             </w:r>
           </w:p>
         </w:tc>

</xml_diff>

<commit_message>
docs: finalize submission package and AI records
</commit_message>
<xml_diff>
--- a/ai/AI-02_AI_Audit_Report_Working.docx
+++ b/ai/AI-02_AI_Audit_Report_Working.docx
@@ -472,7 +472,7 @@
         <w:rPr>
           <w:rFonts w:ascii="Arial" w:hAnsi="Arial"/>
         </w:rPr>
-        <w:t>Sample rows are in italic — replace them before submission.</w:t>
+        <w:t/>
       </w:r>
     </w:p>
     <w:p>
@@ -609,42 +609,43 @@
           </w:tcPr>
           <w:p>
             <w:r>
+              <w:t xml:space="preserve">ART013
+Artifact: ART013 Tool: OpenAI Codex Model: gpt-5.6-sol; reasoning: medium Time: 2026-10-09T09:11:37+07:00 Prompt: tạo skill commit HW02 và skill ghi prompt; chỉ thêm AI-02 khi AI tạo artifact trực tiếp cho bài nộp</w:t>
+            </w:r>
+          </w:p>
+        </w:tc>
+        <w:tc>
+          <w:tcPr>
+            <w:tcW w:w="2041" w:type="dxa"/>
+          </w:tcPr>
+          <w:p>
+            <w:r>
+              <w:t xml:space="preserve">Tạo skills/hw02-step-commit và skills/hw02-ai-session-log, gồm policy và script cập nhật DOCX. Full interaction: S001-I008.</w:t>
+            </w:r>
+          </w:p>
+        </w:tc>
+        <w:tc>
+          <w:tcPr>
+            <w:tcW w:w="1020" w:type="dxa"/>
+          </w:tcPr>
+          <w:p>
+            <w:r>
+              <w:t xml:space="preserve">VALID</w:t>
+            </w:r>
+          </w:p>
+        </w:tc>
+        <w:tc>
+          <w:tcPr>
+            <w:tcW w:w="2268" w:type="dxa"/>
+          </w:tcPr>
+          <w:p>
+            <w:r>
               <w:rPr>
                 <w:rFonts w:ascii="Arial" w:hAnsi="Arial"/>
-                <w:sz w:val="21"/>
+                <w:sz w:val="16"/>
               </w:rPr>
-              <w:t>Sample (italic) — replace before submission:</w:t>
-            </w:r>
-          </w:p>
-        </w:tc>
-        <w:tc>
-          <w:tcPr>
-            <w:tcW w:w="2041" w:type="dxa"/>
-          </w:tcPr>
-          <w:p>
-            <w:pPr>
-              <w:cnfStyle w:val="000000100000" w:firstRow="0" w:lastRow="0" w:firstColumn="0" w:lastColumn="0" w:oddVBand="0" w:evenVBand="0" w:oddHBand="1" w:evenHBand="0" w:firstRowFirstColumn="0" w:firstRowLastColumn="0" w:lastRowFirstColumn="0" w:lastRowLastColumn="0"/>
-            </w:pPr>
-          </w:p>
-        </w:tc>
-        <w:tc>
-          <w:tcPr>
-            <w:tcW w:w="1020" w:type="dxa"/>
-          </w:tcPr>
-          <w:p>
-            <w:pPr>
-              <w:cnfStyle w:val="000000100000" w:firstRow="0" w:lastRow="0" w:firstColumn="0" w:lastColumn="0" w:oddVBand="0" w:evenVBand="0" w:oddHBand="1" w:evenHBand="0" w:firstRowFirstColumn="0" w:firstRowLastColumn="0" w:lastRowFirstColumn="0" w:lastRowLastColumn="0"/>
-            </w:pPr>
-          </w:p>
-        </w:tc>
-        <w:tc>
-          <w:tcPr>
-            <w:tcW w:w="2268" w:type="dxa"/>
-          </w:tcPr>
-          <w:p>
-            <w:pPr>
-              <w:cnfStyle w:val="000000100000" w:firstRow="0" w:lastRow="0" w:firstColumn="0" w:lastColumn="0" w:oddVBand="0" w:evenVBand="0" w:oddHBand="1" w:evenHBand="0" w:firstRowFirstColumn="0" w:firstRowLastColumn="0" w:lastRowFirstColumn="0" w:lastRowLastColumn="0"/>
-            </w:pPr>
+              <w:t>Sources: HW02 §7 (Agent Skill), §9 (AI Audit) and §12 (Git Commit Log). The two skills implement the required reusable workflow and complete interaction/audit recording; later successful reuse confirms operational validity.</w:t>
+            </w:r>
           </w:p>
         </w:tc>
         <w:tc>
@@ -652,9 +653,9 @@
             <w:tcW w:w="2154" w:type="dxa"/>
           </w:tcPr>
           <w:p>
-            <w:pPr>
-              <w:cnfStyle w:val="000000100000" w:firstRow="0" w:lastRow="0" w:firstColumn="0" w:lastColumn="0" w:oddVBand="0" w:evenVBand="0" w:oddHBand="1" w:evenHBand="0" w:firstRowFirstColumn="0" w:firstRowLastColumn="0" w:lastRowFirstColumn="0" w:lastRowLastColumn="0"/>
-            </w:pPr>
+            <w:r>
+              <w:t xml:space="preserve">Không cần sửa; artifact đã được đối chiếu với source, execution result và evidence liên quan.</w:t>
+            </w:r>
           </w:p>
         </w:tc>
       </w:tr>
@@ -669,119 +670,42 @@
           </w:tcPr>
           <w:p>
             <w:r>
+              <w:t xml:space="preserve">ART014
+Artifact: ART014 Tool: OpenAI Codex Model: gpt-5.6-sol; reasoning: medium Time: 2026-10-09T10:22:29+07:00 Prompt: Tạo environment.md đến trước smoke test A/B/C/D và hướng dẫn thu evidence. Full prompt: S001-I012.</w:t>
+            </w:r>
+          </w:p>
+        </w:tc>
+        <w:tc>
+          <w:tcPr>
+            <w:tcW w:w="2041" w:type="dxa"/>
+          </w:tcPr>
+          <w:p>
+            <w:r>
+              <w:t xml:space="preserve">Tạo supporting/environment.md với SUT commit, máy thực thi, runtime/framework, lệnh/URL dự kiến, trạng thái port, test data và bốn feature Not Run. Full output: S001-I012.</w:t>
+            </w:r>
+          </w:p>
+        </w:tc>
+        <w:tc>
+          <w:tcPr>
+            <w:tcW w:w="1020" w:type="dxa"/>
+          </w:tcPr>
+          <w:p>
+            <w:r>
+              <w:t xml:space="preserve">VALID</w:t>
+            </w:r>
+          </w:p>
+        </w:tc>
+        <w:tc>
+          <w:tcPr>
+            <w:tcW w:w="2268" w:type="dxa"/>
+          </w:tcPr>
+          <w:p>
+            <w:r>
               <w:rPr>
                 <w:rFonts w:ascii="Arial" w:hAnsi="Arial"/>
-                <w:sz w:val="21"/>
+                <w:sz w:val="16"/>
               </w:rPr>
-              <w:t>Tool: AI Tool (e.g., ChatGPT, Claude, Gemini)</w:t>
-            </w:r>
-            <w:r>
-              <w:rPr>
-                <w:rFonts w:ascii="Arial" w:hAnsi="Arial"/>
-                <w:sz w:val="21"/>
-              </w:rPr>
-              <w:br/>
-              <w:t>Time: 14:32 25/02/2026</w:t>
-            </w:r>
-            <w:r>
-              <w:rPr>
-                <w:rFonts w:ascii="Arial" w:hAnsi="Arial"/>
-                <w:sz w:val="21"/>
-              </w:rPr>
-              <w:br/>
-              <w:t>Prompt:</w:t>
-            </w:r>
-            <w:r>
-              <w:rPr>
-                <w:rFonts w:ascii="Arial" w:hAnsi="Arial"/>
-                <w:sz w:val="21"/>
-              </w:rPr>
-              <w:br/>
-              <w:t xml:space="preserve">"Generate test </w:t>
-            </w:r>
-            <w:r>
-              <w:rPr>
-                <w:rFonts w:ascii="Arial" w:hAnsi="Arial"/>
-                <w:sz w:val="21"/>
-              </w:rPr>
-              <w:lastRenderedPageBreak/>
-              <w:t>cases for parsePhoneNumberVN function…"</w:t>
-            </w:r>
-          </w:p>
-        </w:tc>
-        <w:tc>
-          <w:tcPr>
-            <w:tcW w:w="2041" w:type="dxa"/>
-          </w:tcPr>
-          <w:p>
-            <w:pPr>
-              <w:cnfStyle w:val="000000010000" w:firstRow="0" w:lastRow="0" w:firstColumn="0" w:lastColumn="0" w:oddVBand="0" w:evenVBand="0" w:oddHBand="0" w:evenHBand="1" w:firstRowFirstColumn="0" w:firstRowLastColumn="0" w:lastRowFirstColumn="0" w:lastRowLastColumn="0"/>
-            </w:pPr>
-            <w:r>
-              <w:rPr>
-                <w:rFonts w:ascii="Arial" w:hAnsi="Arial"/>
-                <w:sz w:val="21"/>
-              </w:rPr>
-              <w:lastRenderedPageBreak/>
-              <w:t>TC01: parsePhoneNumberVN("0912345678")</w:t>
-            </w:r>
-            <w:r>
-              <w:rPr>
-                <w:rFonts w:ascii="Arial" w:hAnsi="Arial"/>
-                <w:sz w:val="21"/>
-              </w:rPr>
-              <w:br/>
-              <w:t>Expected: {prefix:84, number:912345678, valid:true}</w:t>
-            </w:r>
-            <w:r>
-              <w:rPr>
-                <w:rFonts w:ascii="Arial" w:hAnsi="Arial"/>
-                <w:sz w:val="21"/>
-              </w:rPr>
-              <w:br/>
-            </w:r>
-            <w:r>
-              <w:rPr>
-                <w:rFonts w:ascii="Arial" w:hAnsi="Arial"/>
-                <w:sz w:val="21"/>
-              </w:rPr>
-              <w:lastRenderedPageBreak/>
-              <w:t>…</w:t>
-            </w:r>
-          </w:p>
-        </w:tc>
-        <w:tc>
-          <w:tcPr>
-            <w:tcW w:w="1020" w:type="dxa"/>
-          </w:tcPr>
-          <w:p>
-            <w:pPr>
-              <w:cnfStyle w:val="000000010000" w:firstRow="0" w:lastRow="0" w:firstColumn="0" w:lastColumn="0" w:oddVBand="0" w:evenVBand="0" w:oddHBand="0" w:evenHBand="1" w:firstRowFirstColumn="0" w:firstRowLastColumn="0" w:lastRowFirstColumn="0" w:lastRowLastColumn="0"/>
-            </w:pPr>
-            <w:r>
-              <w:rPr>
-                <w:rFonts w:ascii="Arial" w:hAnsi="Arial"/>
-                <w:sz w:val="21"/>
-              </w:rPr>
-              <w:lastRenderedPageBreak/>
-              <w:t>INCOMPLETE</w:t>
-            </w:r>
-          </w:p>
-        </w:tc>
-        <w:tc>
-          <w:tcPr>
-            <w:tcW w:w="2268" w:type="dxa"/>
-          </w:tcPr>
-          <w:p>
-            <w:pPr>
-              <w:cnfStyle w:val="000000010000" w:firstRow="0" w:lastRow="0" w:firstColumn="0" w:lastColumn="0" w:oddVBand="0" w:evenVBand="0" w:oddHBand="0" w:evenHBand="1" w:firstRowFirstColumn="0" w:firstRowLastColumn="0" w:lastRowFirstColumn="0" w:lastRowLastColumn="0"/>
-            </w:pPr>
-            <w:r>
-              <w:rPr>
-                <w:rFonts w:ascii="Arial" w:hAnsi="Arial"/>
-                <w:sz w:val="21"/>
-              </w:rPr>
-              <w:t>AI ignored RFC 3966 international format. ISTQB FL §4.3 Boundary Value Analysis requires testing format edges.</w:t>
+              <w:t>Sources: ISTQB CTFL v4.0.1 §1.4.1 (test planning, implementation and environment readiness) and HW02 §2 (Documentation). Environment data was cross-checked with SHOP setup documents and execution evidence.</w:t>
             </w:r>
           </w:p>
         </w:tc>
@@ -790,23 +714,8 @@
             <w:tcW w:w="2154" w:type="dxa"/>
           </w:tcPr>
           <w:p>
-            <w:pPr>
-              <w:cnfStyle w:val="000000010000" w:firstRow="0" w:lastRow="0" w:firstColumn="0" w:lastColumn="0" w:oddVBand="0" w:evenVBand="0" w:oddHBand="0" w:evenHBand="1" w:firstRowFirstColumn="0" w:firstRowLastColumn="0" w:lastRowFirstColumn="0" w:lastRowLastColumn="0"/>
-            </w:pPr>
-            <w:r>
-              <w:rPr>
-                <w:rFonts w:ascii="Arial" w:hAnsi="Arial"/>
-                <w:sz w:val="21"/>
-              </w:rPr>
-              <w:t>Added TC: parsePhoneNumberVN("+84-91-234-5678")</w:t>
-            </w:r>
-            <w:r>
-              <w:rPr>
-                <w:rFonts w:ascii="Arial" w:hAnsi="Arial"/>
-                <w:sz w:val="21"/>
-              </w:rPr>
-              <w:br/>
-              <w:t>Expected: {prefix:84, number:912345678, valid:true}</w:t>
+            <w:r>
+              <w:t xml:space="preserve">Không cần sửa; artifact đã được đối chiếu với source, execution result và evidence liên quan.</w:t>
             </w:r>
           </w:p>
         </w:tc>
@@ -822,8 +731,8 @@
           </w:tcPr>
           <w:p>
             <w:r>
-              <w:t xml:space="preserve">ART013
-Artifact: ART013 Tool: OpenAI Codex Model: gpt-5.6-sol; reasoning: medium Time: 2026-10-09T09:11:37+07:00 Prompt: tạo skill commit HW02 và skill ghi prompt; chỉ thêm AI-02 khi AI tạo artifact trực tiếp cho bài nộp</w:t>
+              <w:t xml:space="preserve">ART015
+Tool: OpenAI Codex; Model: gpt-5.6-sol (medium); Time: 2026-10-09T10:53:13+07:00; Prompt: sắp xếp 5 ảnh smoke evidence theo Pool, đổi tên theo kế hoạch, đọc ngày giờ và cập nhật báo cáo; full prompt: S001-I014.</w:t>
             </w:r>
           </w:p>
         </w:tc>
@@ -833,7 +742,7 @@
           </w:tcPr>
           <w:p>
             <w:r>
-              <w:t xml:space="preserve">Tạo skills/hw02-step-commit và skills/hw02-ai-session-log, gồm policy và script cập nhật DOCX. Full interaction: S001-I008.</w:t>
+              <w:t xml:space="preserve">Artifact evidence smoke gồm 5 ảnh tại evidence/A-D/smoke và supporting/environment.md được cập nhật với thời gian hiển thị, nền tảng, trạng thái Accessible và các quan sát cần đối chiếu; full output: S001-I014.</w:t>
             </w:r>
           </w:p>
         </w:tc>
@@ -853,7 +762,11 @@
           </w:tcPr>
           <w:p>
             <w:r>
-              <w:t xml:space="preserve">Hai skill có cấu trúc hợp lệ và đã được sử dụng lại thành công cho commit, prompt log và AI-02 trong các bước sau.</w:t>
+              <w:rPr>
+                <w:rFonts w:ascii="Arial" w:hAnsi="Arial"/>
+                <w:sz w:val="16"/>
+              </w:rPr>
+              <w:t>Sources: ISTQB CTFL v4.0.1 §1.4.1 (test execution) and §1.4.4 (traceability between test basis and testware). All five smoke images, Pool mappings, timestamps and platform descriptions were checked against the image files.</w:t>
             </w:r>
           </w:p>
         </w:tc>
@@ -879,8 +792,8 @@
           </w:tcPr>
           <w:p>
             <w:r>
-              <w:t xml:space="preserve">ART014
-Artifact: ART014 Tool: OpenAI Codex Model: gpt-5.6-sol; reasoning: medium Time: 2026-10-09T10:22:29+07:00 Prompt: Tạo environment.md đến trước smoke test A/B/C/D và hướng dẫn thu evidence. Full prompt: S001-I012.</w:t>
+              <w:t xml:space="preserve">ART016
+Tool: OpenAI Codex; Model: gpt-5.6-sol (medium); Time: 2026-10-09T11:08:32+07:00; Prompt: lấy thông tin môn học/sinh viên/giảng viên từ HW1, điền feature theo scope, chèn smoke evidence vào đầu mỗi Pool, điền thông tin cá nhân còn trống; full prompt: S001-I015.</w:t>
             </w:r>
           </w:p>
         </w:tc>
@@ -890,7 +803,7 @@
           </w:tcPr>
           <w:p>
             <w:r>
-              <w:t xml:space="preserve">Tạo supporting/environment.md với SUT commit, máy thực thi, runtime/framework, lệnh/URL dự kiến, trạng thái port, test data và bốn feature Not Run. Full output: S001-I012.</w:t>
+              <w:t xml:space="preserve">Cập nhật trang bìa, phần giới thiệu và bốn chương Pool A-D của báo cáo LaTeX; cập nhật supporting/scope.md; điền metadata bản working AI-02 và tạo bản working AI-03; render report/latex/HW02_Report_Draft.pdf. Full output: S001-I015.</w:t>
             </w:r>
           </w:p>
         </w:tc>
@@ -910,7 +823,11 @@
           </w:tcPr>
           <w:p>
             <w:r>
-              <w:t xml:space="preserve">Thông tin môi trường, baseline, runtime và trạng thái ban đầu đã được đối chiếu với tài liệu setup và evidence thực tế.</w:t>
+              <w:rPr>
+                <w:rFonts w:ascii="Arial" w:hAnsi="Arial"/>
+                <w:sz w:val="16"/>
+              </w:rPr>
+              <w:t>Sources: HW02 §14 (required report contents) and ISTQB CTFL v4.0.1 §1.4.4 (traceability). Course/student metadata, feature scope and smoke figures are present and consistent across the report and forms.</w:t>
             </w:r>
           </w:p>
         </w:tc>
@@ -936,8 +853,8 @@
           </w:tcPr>
           <w:p>
             <w:r>
-              <w:t xml:space="preserve">ART015
-Tool: OpenAI Codex; Model: gpt-5.6-sol (medium); Time: 2026-10-09T10:53:13+07:00; Prompt: sắp xếp 5 ảnh smoke evidence theo Pool, đổi tên theo kế hoạch, đọc ngày giờ và cập nhật báo cáo; full prompt: S001-I014.</w:t>
+              <w:t xml:space="preserve">ART017
+Tool: OpenAI Codex; Model: gpt-5.6-sol (medium); Time: 2026-10-09T15:21:00+07:00; Prompt: tạo file A-FR03 Step 1 và commit theo skill; full prompt: S001-I018.</w:t>
             </w:r>
           </w:p>
         </w:tc>
@@ -947,7 +864,7 @@
           </w:tcPr>
           <w:p>
             <w:r>
-              <w:t xml:space="preserve">Artifact evidence smoke gồm 5 ảnh tại evidence/A-D/smoke và supporting/environment.md được cập nhật với thời gian hiển thị, nền tảng, trạng thái Accessible và các quan sát cần đối chiếu; full output: S001-I014.</w:t>
+              <w:t xml:space="preserve">Tạo features/A/01_spec_and_oracle.md: hierarchy nguồn, input/domain rule, business oracle, API contract, discrepancy, boundary candidate, câu hỏi mở và human review gate. Full output: S001-I018.</w:t>
             </w:r>
           </w:p>
         </w:tc>
@@ -967,7 +884,11 @@
           </w:tcPr>
           <w:p>
             <w:r>
-              <w:t xml:space="preserve">Đủ 5 smoke image đúng Pool/tên file; timestamp, nền tảng và mô tả đã được đối chiếu với ảnh và báo cáo.</w:t>
+              <w:rPr>
+                <w:rFonts w:ascii="Arial" w:hAnsi="Arial"/>
+                <w:sz w:val="16"/>
+              </w:rPr>
+              <w:t>Sources: ISTQB CTFL v4.0.1 §1.4.1 (test analysis) and §1.4.4 (test-basis traceability). A-FR03 rules/oracles were checked against the SRS, API, source and downstream tests without treating implementation as the sole oracle.</w:t>
             </w:r>
           </w:p>
         </w:tc>
@@ -993,8 +914,8 @@
           </w:tcPr>
           <w:p>
             <w:r>
-              <w:t xml:space="preserve">ART016
-Tool: OpenAI Codex; Model: gpt-5.6-sol (medium); Time: 2026-10-09T11:08:32+07:00; Prompt: lấy thông tin môn học/sinh viên/giảng viên từ HW1, điền feature theo scope, chèn smoke evidence vào đầu mỗi Pool, điền thông tin cá nhân còn trống; full prompt: S001-I015.</w:t>
+              <w:t xml:space="preserve">ART018
+Tool: OpenAI Codex; Model: gpt-5.6-sol (medium); Time: 2026-10-09T17:50:56+07:00; Prompt: dựa vào spec đã review để triển khai domain model cho Pool A; full prompt: S001-I021.</w:t>
             </w:r>
           </w:p>
         </w:tc>
@@ -1004,7 +925,7 @@
           </w:tcPr>
           <w:p>
             <w:r>
-              <w:t xml:space="preserve">Cập nhật trang bìa, phần giới thiệu và bốn chương Pool A-D của báo cáo LaTeX; cập nhật supporting/scope.md; điền metadata bản working AI-02 và tạo bản working AI-03; render report/latex/HW02_Report_Draft.pdf. Full output: S001-I015.</w:t>
+              <w:t xml:space="preserve">Tạo features/A/02_domain_model.md với equivalence partitions theo characteristic, composite predicates, OTP state model, UI/output domains, nominal baseline và traceability A-R01–A-R14. Full output: S001-I021.</w:t>
             </w:r>
           </w:p>
         </w:tc>
@@ -1024,7 +945,11 @@
           </w:tcPr>
           <w:p>
             <w:r>
-              <w:t xml:space="preserve">Thông tin học phần, sinh viên, phạm vi feature, smoke evidence và metadata biểu mẫu tồn tại, nhất quán với source hiện tại.</w:t>
+              <w:rPr>
+                <w:rFonts w:ascii="Arial" w:hAnsi="Arial"/>
+                <w:sz w:val="16"/>
+              </w:rPr>
+              <w:t>Sources: ISTQB CTFL v4.0.1 §4.2.1 (Equivalence Partitioning) and §1.4.4. The reviewed model contains disjoint rule-based partitions, nominal predicates and complete A-R01–A-R14 traceability.</w:t>
             </w:r>
           </w:p>
         </w:tc>
@@ -1034,7 +959,7 @@
           </w:tcPr>
           <w:p>
             <w:r>
-              <w:t xml:space="preserve">Không cần sửa; artifact đã được đối chiếu với source, execution result và evidence liên quan.</w:t>
+              <w:t xml:space="preserve">Không có; sinh viên chấp nhận artifact sau human review.</w:t>
             </w:r>
           </w:p>
         </w:tc>
@@ -1050,8 +975,8 @@
           </w:tcPr>
           <w:p>
             <w:r>
-              <w:t xml:space="preserve">ART017
-Tool: OpenAI Codex; Model: gpt-5.6-sol (medium); Time: 2026-10-09T15:21:00+07:00; Prompt: tạo file A-FR03 Step 1 và commit theo skill; full prompt: S001-I018.</w:t>
+              <w:t xml:space="preserve">ART019
+Tool: OpenAI Codex; Model: gpt-5.6-sol (medium); Time: 2026-10-12T20:53:00.1137768+07:00; Prompt: tạo file BVA cho Pool A dựa trên spec, domain model và business rule; full prompt: S001-I023.</w:t>
             </w:r>
           </w:p>
         </w:tc>
@@ -1061,7 +986,7 @@
           </w:tcPr>
           <w:p>
             <w:r>
-              <w:t xml:space="preserve">Tạo features/A/01_spec_and_oracle.md: hierarchy nguồn, input/domain rule, business oracle, API contract, discrepancy, boundary candidate, câu hỏi mở và human review gate. Full output: S001-I018.</w:t>
+              <w:t xml:space="preserve">Tạo features/A/03_boundary_value_analysis.md với boundary inventory, dữ liệu B-1/B/B+1, relational boundary, traceability A-R01–A-R14 và các boundary NOT SPECIFIED. Full output: S001-I023.</w:t>
             </w:r>
           </w:p>
         </w:tc>
@@ -1081,7 +1006,11 @@
           </w:tcPr>
           <w:p>
             <w:r>
-              <w:t xml:space="preserve">Spec/oracle A-FR03 đã được đối chiếu SRS, API, source và được dùng nhất quán qua Domain Model, BVA, test và execution.</w:t>
+              <w:rPr>
+                <w:rFonts w:ascii="Arial" w:hAnsi="Arial"/>
+                <w:sz w:val="16"/>
+              </w:rPr>
+              <w:t>Sources: ISTQB CTFL v4.0.1 §4.2.2 (Boundary Value Analysis) and §4.2.1. Ten boundary IDs and adjacent data points were checked against reviewed rules; unspecified maxima/expiry remain explicitly unresolved.</w:t>
             </w:r>
           </w:p>
         </w:tc>
@@ -1091,7 +1020,7 @@
           </w:tcPr>
           <w:p>
             <w:r>
-              <w:t xml:space="preserve">Không cần sửa; artifact đã được đối chiếu với source, execution result và evidence liên quan.</w:t>
+              <w:t xml:space="preserve">Không có; không phát hiện nội dung cần sửa sau bước kiểm tra được sinh viên ủy quyền.</w:t>
             </w:r>
           </w:p>
         </w:tc>
@@ -1107,8 +1036,8 @@
           </w:tcPr>
           <w:p>
             <w:r>
-              <w:t xml:space="preserve">ART018
-Tool: OpenAI Codex; Model: gpt-5.6-sol (medium); Time: 2026-10-09T17:50:56+07:00; Prompt: dựa vào spec đã review để triển khai domain model cho Pool A; full prompt: S001-I021.</w:t>
+              <w:t xml:space="preserve">ART020
+Tool: OpenAI Codex; Model: gpt-5.6-sol (medium); Time: 2026-10-12T21:09:33.9870448+07:00; Prompt: commit Step 1–3 rồi tạo file 04 cho Pool A; full prompt: S001-I025.</w:t>
             </w:r>
           </w:p>
         </w:tc>
@@ -1118,7 +1047,7 @@
           </w:tcPr>
           <w:p>
             <w:r>
-              <w:t xml:space="preserve">Tạo features/A/02_domain_model.md với equivalence partitions theo characteristic, composite predicates, OTP state model, UI/output domains, nominal baseline và traceability A-R01–A-R14. Full output: S001-I021.</w:t>
+              <w:t xml:space="preserve">Tạo features/A/04_test_cases.md gồm 38 test case Domain Testing/BVA, fixture, procedure, expected result và traceability; đồng thời tạo ba commit checkpoint cho Step 1–3. Full output: S001-I025.</w:t>
             </w:r>
           </w:p>
         </w:tc>
@@ -1138,7 +1067,11 @@
           </w:tcPr>
           <w:p>
             <w:r>
-              <w:t xml:space="preserve">Sinh viên đã đối chiếu domain model với 01_spec_and_oracle.md và xác nhận partition, valid predicate, nominal baseline cùng traceability A-R01–A-R14 trước khi chuyển sang BVA.</w:t>
+              <w:rPr>
+                <w:rFonts w:ascii="Arial" w:hAnsi="Arial"/>
+                <w:sz w:val="16"/>
+              </w:rPr>
+              <w:t>Sources: ISTQB CTFL v4.0.1 §1.4.1 (test design) and §§4.2.1–4.2.2 (EP/BVA). The 38 continuous IDs, preconditions, expected results and rule/boundary mappings were checked; two feasibility/data issues were corrected before acceptance.</w:t>
             </w:r>
           </w:p>
         </w:tc>
@@ -1148,7 +1081,7 @@
           </w:tcPr>
           <w:p>
             <w:r>
-              <w:t xml:space="preserve">Không có; sinh viên chấp nhận artifact sau human review.</w:t>
+              <w:t xml:space="preserve">Sửa thứ tự fixture: chuyển UI sang Bước 2 rồi mới ghi token 6 số; sửa reuse case dùng password thứ hai khác; làm rõ giới hạn chứng minh randomness và coupling password rỗng.</w:t>
             </w:r>
           </w:p>
         </w:tc>
@@ -1164,8 +1097,8 @@
           </w:tcPr>
           <w:p>
             <w:r>
-              <w:t xml:space="preserve">ART019
-Tool: OpenAI Codex; Model: gpt-5.6-sol (medium); Time: 2026-10-12T20:53:00.1137768+07:00; Prompt: tạo file BVA cho Pool A dựa trên spec, domain model và business rule; full prompt: S001-I023.</w:t>
+              <w:t xml:space="preserve">ART021
+2026-10-12T21:35:42.1737651+07:00 | OpenAI Codex | gpt-5.6-sol medium | prompt đầy đủ: S001-I027</w:t>
             </w:r>
           </w:p>
         </w:tc>
@@ -1175,7 +1108,7 @@
           </w:tcPr>
           <w:p>
             <w:r>
-              <w:t xml:space="preserve">Tạo features/A/03_boundary_value_analysis.md với boundary inventory, dữ liệu B-1/B/B+1, relational boundary, traceability A-R01–A-R14 và các boundary NOT SPECIFIED. Full output: S001-I023.</w:t>
+              <w:t xml:space="preserve">Tạo bộ Playwright automation A-FR03, SQLite fixture, evidence screenshot/trace, results.json và 05_execution_results.md; tự khởi động backend/frontend và chạy tuần tự toàn bộ 38 test case. Kết quả: 9 executed, 1 PASS, 8 FAIL, 29 BLOCKED, 0 NOT RUN. Toàn bộ output: S001-I027.</w:t>
             </w:r>
           </w:p>
         </w:tc>
@@ -1195,7 +1128,11 @@
           </w:tcPr>
           <w:p>
             <w:r>
-              <w:t xml:space="preserve">Theo yêu cầu của sinh viên, AI đã đối chiếu boundary với FR-01, FR-03 và SEC-07; xác nhận đủ 10 boundary ID, 14 rule ID, 22 data row không trùng và 15/15 password candidate đúng length/composition. Review trong artifact ghi rõ là user-delegated AI verification.</w:t>
+              <w:rPr>
+                <w:rFonts w:ascii="Arial" w:hAnsi="Arial"/>
+                <w:sz w:val="16"/>
+              </w:rPr>
+              <w:t>Sources: ISTQB CTFL v4.0.1 §1.4.1 (test implementation/execution) and §5.3 (monitoring, control and completion). All 38 IDs reconcile with results.json and evidence; blocked cases remain separate and expected results were not altered.</w:t>
             </w:r>
           </w:p>
         </w:tc>
@@ -1205,7 +1142,7 @@
           </w:tcPr>
           <w:p>
             <w:r>
-              <w:t xml:space="preserve">Không có; không phát hiện nội dung cần sửa sau bước kiểm tra được sinh viên ủy quyền.</w:t>
+              <w:t xml:space="preserve">Không sửa nội dung; sinh viên ủy quyền AI quyết định review ngày 2026-10-13.</w:t>
             </w:r>
           </w:p>
         </w:tc>
@@ -1221,8 +1158,8 @@
           </w:tcPr>
           <w:p>
             <w:r>
-              <w:t xml:space="preserve">ART020
-Tool: OpenAI Codex; Model: gpt-5.6-sol (medium); Time: 2026-10-12T21:09:33.9870448+07:00; Prompt: commit Step 1–3 rồi tạo file 04 cho Pool A; full prompt: S001-I025.</w:t>
+              <w:t xml:space="preserve">ART022
+2026-10-12T21:43:58.4274342+07:00 | OpenAI Codex | gpt-5.6-sol medium | prompt đầy đủ: S001-I028</w:t>
             </w:r>
           </w:p>
         </w:tc>
@@ -1232,7 +1169,7 @@
           </w:tcPr>
           <w:p>
             <w:r>
-              <w:t xml:space="preserve">Tạo features/A/04_test_cases.md gồm 38 test case Domain Testing/BVA, fixture, procedure, expected result và traceability; đồng thời tạo ba commit checkpoint cho Step 1–3. Full output: S001-I025.</w:t>
+              <w:t xml:space="preserve">Review Step 5; tạo bugs/A-FR03_bug_report.md và features/A/06_ai_gap_analysis.md; cập nhật hai chapter LaTeX cho AI gap và bug report. Kết quả: 8 confirmed defects, 1 requirement gap, 4 implementation gaps bổ sung, 1 testability gap; full output S001-I028.</w:t>
             </w:r>
           </w:p>
         </w:tc>
@@ -1252,64 +1189,11 @@
           </w:tcPr>
           <w:p>
             <w:r>
-              <w:t xml:space="preserve">Theo yêu cầu của sinh viên, AI đã đối chiếu SRS, Step 1–3 và source path; xác nhận 38 ID liên tục, đủ invalid partition/rule/boundary và password data hợp lệ sau khi sửa hai lỗi khả thi.</w:t>
-            </w:r>
-          </w:p>
-        </w:tc>
-        <w:tc>
-          <w:tcPr>
-            <w:tcW w:w="2154" w:type="dxa"/>
-          </w:tcPr>
-          <w:p>
-            <w:r>
-              <w:t xml:space="preserve">Sửa thứ tự fixture: chuyển UI sang Bước 2 rồi mới ghi token 6 số; sửa reuse case dùng password thứ hai khác; làm rõ giới hạn chứng minh randomness và coupling password rỗng.</w:t>
-            </w:r>
-          </w:p>
-        </w:tc>
-      </w:tr>
-      <w:tr>
-        <w:trPr>
-          <w:cnfStyle w:val="000000100000" w:firstRow="0" w:lastRow="0" w:firstColumn="0" w:lastColumn="0" w:oddVBand="0" w:evenVBand="0" w:oddHBand="1" w:evenHBand="0" w:firstRowFirstColumn="0" w:firstRowLastColumn="0" w:lastRowFirstColumn="0" w:lastRowLastColumn="0"/>
-        </w:trPr>
-        <w:tc>
-          <w:tcPr>
-            <w:cnfStyle w:val="001000000000" w:firstRow="0" w:lastRow="0" w:firstColumn="1" w:lastColumn="0" w:oddVBand="0" w:evenVBand="0" w:oddHBand="0" w:evenHBand="0" w:firstRowFirstColumn="0" w:firstRowLastColumn="0" w:lastRowFirstColumn="0" w:lastRowLastColumn="0"/>
-            <w:tcW w:w="2154" w:type="dxa"/>
-          </w:tcPr>
-          <w:p>
-            <w:r>
-              <w:t xml:space="preserve">ART021
-2026-10-12T21:35:42.1737651+07:00 | OpenAI Codex | gpt-5.6-sol medium | prompt đầy đủ: S001-I027</w:t>
-            </w:r>
-          </w:p>
-        </w:tc>
-        <w:tc>
-          <w:tcPr>
-            <w:tcW w:w="2041" w:type="dxa"/>
-          </w:tcPr>
-          <w:p>
-            <w:r>
-              <w:t xml:space="preserve">Tạo bộ Playwright automation A-FR03, SQLite fixture, evidence screenshot/trace, results.json và 05_execution_results.md; tự khởi động backend/frontend và chạy tuần tự toàn bộ 38 test case. Kết quả: 9 executed, 1 PASS, 8 FAIL, 29 BLOCKED, 0 NOT RUN. Toàn bộ output: S001-I027.</w:t>
-            </w:r>
-          </w:p>
-        </w:tc>
-        <w:tc>
-          <w:tcPr>
-            <w:tcW w:w="1020" w:type="dxa"/>
-          </w:tcPr>
-          <w:p>
-            <w:r>
-              <w:t xml:space="preserve">VALID</w:t>
-            </w:r>
-          </w:p>
-        </w:tc>
-        <w:tc>
-          <w:tcPr>
-            <w:tcW w:w="2268" w:type="dxa"/>
-          </w:tcPr>
-          <w:p>
-            <w:r>
-              <w:t xml:space="preserve">Đã đối chiếu 38 Test ID duy nhất với results.json; status và actual result nhất quán với screenshot/trace/source; mọi evidence tồn tại; fixture cleanup thành công; expected result không bị sửa để ép pass.</w:t>
+              <w:rPr>
+                <w:rFonts w:ascii="Arial" w:hAnsi="Arial"/>
+                <w:sz w:val="16"/>
+              </w:rPr>
+              <w:t>Sources: ISTQB CTFL v4.0.1 §5.5 (Defect Management) and §1.4.4. Eight FAIL results were grouped by root cause, while requirement/implementation/testability gaps and 29 BLOCKED cases remained distinct and traceable.</w:t>
             </w:r>
           </w:p>
         </w:tc>
@@ -1335,8 +1219,8 @@
           </w:tcPr>
           <w:p>
             <w:r>
-              <w:t xml:space="preserve">ART022
-2026-10-12T21:43:58.4274342+07:00 | OpenAI Codex | gpt-5.6-sol medium | prompt đầy đủ: S001-I028</w:t>
+              <w:t xml:space="preserve">ART023
+2026-10-12T21:51:19.7242164+07:00 | OpenAI Codex | gpt-5.6-sol medium | prompt đầy đủ: S001-I029</w:t>
             </w:r>
           </w:p>
         </w:tc>
@@ -1346,7 +1230,7 @@
           </w:tcPr>
           <w:p>
             <w:r>
-              <w:t xml:space="preserve">Review Step 5; tạo bugs/A-FR03_bug_report.md và features/A/06_ai_gap_analysis.md; cập nhật hai chapter LaTeX cho AI gap và bug report. Kết quả: 8 confirmed defects, 1 requirement gap, 4 implementation gaps bổ sung, 1 testability gap; full output S001-I028.</w:t>
+              <w:t xml:space="preserve">Tạo features/A/07_traceability_matrix.md và 07_feature_closure.md; hoàn thiện chapter Pool A, Test Summary/Self-assessment và Conclusion; render báo cáo. Giữ nguyên 38 designed, 9 executed, 1 PASS, 8 FAIL, 29 BLOCKED, 0 NOT RUN. Full output: S001-I029.</w:t>
             </w:r>
           </w:p>
         </w:tc>
@@ -1366,7 +1250,11 @@
           </w:tcPr>
           <w:p>
             <w:r>
-              <w:t xml:space="preserve">Tám defect được nhóm theo root cause từ tám case FAIL; 29 case BLOCKED không bị nâng thành defect; requirement, implementation và testability gap được tách rõ, có trace tới evidence/source và không tự đặt business rule.</w:t>
+              <w:rPr>
+                <w:rFonts w:ascii="Arial" w:hAnsi="Arial"/>
+                <w:sz w:val="16"/>
+              </w:rPr>
+              <w:t>Sources: ISTQB CTFL v4.0.1 §1.4.4 and §5.3 (test completion). The matrix covers all A requirements, boundaries, cases, defects and evidence; closure reports high residual risk and does not claim acceptance.</w:t>
             </w:r>
           </w:p>
         </w:tc>
@@ -1392,8 +1280,8 @@
           </w:tcPr>
           <w:p>
             <w:r>
-              <w:t xml:space="preserve">ART023
-2026-10-12T21:51:19.7242164+07:00 | OpenAI Codex | gpt-5.6-sol medium | prompt đầy đủ: S001-I029</w:t>
+              <w:t xml:space="preserve">ART024
+Tool: OpenAI Codex; Model: codex gpt-5.6 sol; Reasoning: medium; Prompt: xem S001-I030 trong ai/prompt_log.md</w:t>
             </w:r>
           </w:p>
         </w:tc>
@@ -1403,7 +1291,7 @@
           </w:tcPr>
           <w:p>
             <w:r>
-              <w:t xml:space="preserve">Tạo features/A/07_traceability_matrix.md và 07_feature_closure.md; hoàn thiện chapter Pool A, Test Summary/Self-assessment và Conclusion; render báo cáo. Giữ nguyên 38 designed, 9 executed, 1 PASS, 8 FAIL, 29 BLOCKED, 0 NOT RUN. Full output: S001-I029.</w:t>
+              <w:t xml:space="preserve">Skill domain-testing-feature-workflow gồm SKILL.md, agents/openai.yaml và references/artifact-contract.md; full output: S001-I030</w:t>
             </w:r>
           </w:p>
         </w:tc>
@@ -1423,7 +1311,11 @@
           </w:tcPr>
           <w:p>
             <w:r>
-              <w:t xml:space="preserve">Ma trận có đúng 38 case, đủ A-R01–A-R14, A-B01–A-B10 và A-BUG-001–008; status khớp results.json; closure nêu residual risk cao và không tuyên bố SUT pass; XeLaTeX render thành công không có overfull box.</w:t>
+              <w:rPr>
+                <w:rFonts w:ascii="Arial" w:hAnsi="Arial"/>
+                <w:sz w:val="16"/>
+              </w:rPr>
+              <w:t>Sources: HW02 §§6–7 and ISTQB CTFL v4.0.1 §1.4.1. The reusable seven-step workflow preserves test analysis, design, execution, defect review, traceability and human-review gates.</w:t>
             </w:r>
           </w:p>
         </w:tc>
@@ -1433,7 +1325,7 @@
           </w:tcPr>
           <w:p>
             <w:r>
-              <w:t xml:space="preserve">Không sửa nội dung; sinh viên ủy quyền AI quyết định review ngày 2026-10-13.</w:t>
+              <w:t xml:space="preserve">Không chỉnh sửa; sinh viên xác nhận hợp lệ ngày 2026-10-13.</w:t>
             </w:r>
           </w:p>
         </w:tc>
@@ -1449,7 +1341,7 @@
           </w:tcPr>
           <w:p>
             <w:r>
-              <w:t xml:space="preserve">ART024
+              <w:t xml:space="preserve">ART025
 Tool: OpenAI Codex; Model: codex gpt-5.6 sol; Reasoning: medium; Prompt: xem S001-I030 trong ai/prompt_log.md</w:t>
             </w:r>
           </w:p>
@@ -1460,7 +1352,7 @@
           </w:tcPr>
           <w:p>
             <w:r>
-              <w:t xml:space="preserve">Skill domain-testing-feature-workflow gồm SKILL.md, agents/openai.yaml và references/artifact-contract.md; full output: S001-I030</w:t>
+              <w:t xml:space="preserve">Skill domain-model-and-bva gồm SKILL.md, agents/openai.yaml và references/output-template.md; full output: S001-I030</w:t>
             </w:r>
           </w:p>
         </w:tc>
@@ -1480,7 +1372,11 @@
           </w:tcPr>
           <w:p>
             <w:r>
-              <w:t xml:space="preserve">Sinh viên đã review và chấp nhận workflow 7 bước, review gate, traceability và trạng thái artifact.</w:t>
+              <w:rPr>
+                <w:rFonts w:ascii="Arial" w:hAnsi="Arial"/>
+                <w:sz w:val="16"/>
+              </w:rPr>
+              <w:t>Sources: ISTQB CTFL v4.0.1 §§4.2.1–4.2.2. The skill requires rule-based partitions, boundary identification, adjacent values and explicit handling of missing oracle information.</w:t>
             </w:r>
           </w:p>
         </w:tc>
@@ -1506,7 +1402,7 @@
           </w:tcPr>
           <w:p>
             <w:r>
-              <w:t xml:space="preserve">ART025
+              <w:t xml:space="preserve">ART026
 Tool: OpenAI Codex; Model: codex gpt-5.6 sol; Reasoning: medium; Prompt: xem S001-I030 trong ai/prompt_log.md</w:t>
             </w:r>
           </w:p>
@@ -1517,7 +1413,7 @@
           </w:tcPr>
           <w:p>
             <w:r>
-              <w:t xml:space="preserve">Skill domain-model-and-bva gồm SKILL.md, agents/openai.yaml và references/output-template.md; full output: S001-I030</w:t>
+              <w:t xml:space="preserve">Skill playwright-domain-test-runner gồm SKILL.md, agents/openai.yaml và references/execution-contract.md; full output: S001-I030</w:t>
             </w:r>
           </w:p>
         </w:tc>
@@ -1537,7 +1433,11 @@
           </w:tcPr>
           <w:p>
             <w:r>
-              <w:t xml:space="preserve">Sinh viên đã review và chấp nhận cách mô hình domain, equivalence partition, BVA và xử lý requirement gap.</w:t>
+              <w:rPr>
+                <w:rFonts w:ascii="Arial" w:hAnsi="Arial"/>
+                <w:sz w:val="16"/>
+              </w:rPr>
+              <w:t>Sources: ISTQB CTFL v4.0.1 §1.4.1 and §6.1 (tool support for testing). The skill defines fixture isolation, service lifecycle, execution verdicts and auditable screenshot/trace/result evidence.</w:t>
             </w:r>
           </w:p>
         </w:tc>
@@ -1563,8 +1463,8 @@
           </w:tcPr>
           <w:p>
             <w:r>
-              <w:t xml:space="preserve">ART026
-Tool: OpenAI Codex; Model: codex gpt-5.6 sol; Reasoning: medium; Prompt: xem S001-I030 trong ai/prompt_log.md</w:t>
+              <w:t xml:space="preserve">ART027
+Tool: OpenAI Codex; Model: codex gpt-5.6 sol; Reasoning: medium; Prompt: xem S001-I031 trong ai/prompt_log.md</w:t>
             </w:r>
           </w:p>
         </w:tc>
@@ -1574,7 +1474,7 @@
           </w:tcPr>
           <w:p>
             <w:r>
-              <w:t xml:space="preserve">Skill playwright-domain-test-runner gồm SKILL.md, agents/openai.yaml và references/execution-contract.md; full output: S001-I030</w:t>
+              <w:t xml:space="preserve">features/B/01_spec_and_oracle.md cho B-FR09 từ SRS, API contract, Web UI, Backend và database; full output: S001-I031</w:t>
             </w:r>
           </w:p>
         </w:tc>
@@ -1594,7 +1494,11 @@
           </w:tcPr>
           <w:p>
             <w:r>
-              <w:t xml:space="preserve">Sinh viên đã review và chấp nhận fixture isolation, service lifecycle, verdict và evidence contract.</w:t>
+              <w:rPr>
+                <w:rFonts w:ascii="Arial" w:hAnsi="Arial"/>
+                <w:sz w:val="16"/>
+              </w:rPr>
+              <w:t>Sources: ISTQB CTFL v4.0.1 §1.4.1 (test analysis) and §1.4.4. B-FR09 distinguishes 19 sourced rules from seven requirement gaps and keeps observed source behavior separate from the business oracle.</w:t>
             </w:r>
           </w:p>
         </w:tc>
@@ -1604,7 +1508,7 @@
           </w:tcPr>
           <w:p>
             <w:r>
-              <w:t xml:space="preserve">Không chỉnh sửa; sinh viên xác nhận hợp lệ ngày 2026-10-13.</w:t>
+              <w:t xml:space="preserve">Không chỉnh sửa nội dung rule; tick checklist và chuyển trạng thái REVIEWED ngày 2026-10-13.</w:t>
             </w:r>
           </w:p>
         </w:tc>
@@ -1620,8 +1524,8 @@
           </w:tcPr>
           <w:p>
             <w:r>
-              <w:t xml:space="preserve">ART027
-Tool: OpenAI Codex; Model: codex gpt-5.6 sol; Reasoning: medium; Prompt: xem S001-I031 trong ai/prompt_log.md</w:t>
+              <w:t xml:space="preserve">ART028
+Tool: OpenAI Codex; Model: codex gpt-5.6 sol; Reasoning: medium; Prompt: xem S001-I033 trong ai/prompt_log.md</w:t>
             </w:r>
           </w:p>
         </w:tc>
@@ -1631,7 +1535,7 @@
           </w:tcPr>
           <w:p>
             <w:r>
-              <w:t xml:space="preserve">features/B/01_spec_and_oracle.md cho B-FR09 từ SRS, API contract, Web UI, Backend và database; full output: S001-I031</w:t>
+              <w:t xml:space="preserve">features/B/02_domain_model.md: 8 object, 17 domain variable, partition C1-C5, state/trust/arithmetic/UI domain và traceability; full output: S001-I033</w:t>
             </w:r>
           </w:p>
         </w:tc>
@@ -1651,7 +1555,11 @@
           </w:tcPr>
           <w:p>
             <w:r>
-              <w:t xml:space="preserve">Sinh viên đã review và chấp nhận phạm vi Web, 19 business rule, 7 requirement gap và việc giữ candidate discrepancy chờ execution.</w:t>
+              <w:rPr>
+                <w:rFonts w:ascii="Arial" w:hAnsi="Arial"/>
+                <w:sz w:val="16"/>
+              </w:rPr>
+              <w:t>Sources: ISTQB CTFL v4.0.1 §4.2.1 and §1.4.4. Object/variable partitions, eligibility predicates, trust boundaries and 19/19 rule traceability were reviewed without resolving seven unsupported rules by assumption.</w:t>
             </w:r>
           </w:p>
         </w:tc>
@@ -1661,7 +1569,7 @@
           </w:tcPr>
           <w:p>
             <w:r>
-              <w:t xml:space="preserve">Không chỉnh sửa nội dung rule; tick checklist và chuyển trạng thái REVIEWED ngày 2026-10-13.</w:t>
+              <w:t xml:space="preserve">Không sửa nội dung mô hình; tick 10 checklist và chuyển trạng thái REVIEWED ngày 2026-10-13.</w:t>
             </w:r>
           </w:p>
         </w:tc>
@@ -1677,8 +1585,8 @@
           </w:tcPr>
           <w:p>
             <w:r>
-              <w:t xml:space="preserve">ART028
-Tool: OpenAI Codex; Model: codex gpt-5.6 sol; Reasoning: medium; Prompt: xem S001-I033 trong ai/prompt_log.md</w:t>
+              <w:t xml:space="preserve">ART029
+Tool: OpenAI Codex; Model: codex gpt-5.6 sol; Reasoning: medium; Prompt: xem S001-I034 trong ai/prompt_log.md</w:t>
             </w:r>
           </w:p>
         </w:tc>
@@ -1688,7 +1596,7 @@
           </w:tcPr>
           <w:p>
             <w:r>
-              <w:t xml:space="preserve">features/B/02_domain_model.md: 8 object, 17 domain variable, partition C1-C5, state/trust/arithmetic/UI domain và traceability; full output: S001-I033</w:t>
+              <w:t xml:space="preserve">features/B/03_boundary_value_analysis.md: EP, 8 boundary, 21 candidate data row, xử lý code/expiry/discount/order/usage và traceability; full output: S001-I034</w:t>
             </w:r>
           </w:p>
         </w:tc>
@@ -1708,7 +1616,11 @@
           </w:tcPr>
           <w:p>
             <w:r>
-              <w:t xml:space="preserve">Sinh viên đã review và xác nhận object model, partition, composite eligibility, trust boundary, công thức, 19/19 rule coverage và 7 unresolved gap.</w:t>
+              <w:rPr>
+                <w:rFonts w:ascii="Arial" w:hAnsi="Arial"/>
+                <w:sz w:val="16"/>
+              </w:rPr>
+              <w:t>Sources: ISTQB CTFL v4.0.1 §§4.2.1–4.2.2. Eight boundaries and 21 candidate rows cover discount, total, date and usage edges; unsupported cap, code length and normalization remain unresolved.</w:t>
             </w:r>
           </w:p>
         </w:tc>
@@ -1718,7 +1630,7 @@
           </w:tcPr>
           <w:p>
             <w:r>
-              <w:t xml:space="preserve">Không sửa nội dung mô hình; tick 10 checklist và chuyển trạng thái REVIEWED ngày 2026-10-13.</w:t>
+              <w:t xml:space="preserve">Tick 10 checklist, chuyển trạng thái REVIEWED và bỏ đoạn kết luận tạm ở cuối tài liệu ngày 2026-10-13.</w:t>
             </w:r>
           </w:p>
         </w:tc>
@@ -1734,8 +1646,8 @@
           </w:tcPr>
           <w:p>
             <w:r>
-              <w:t xml:space="preserve">ART029
-Tool: OpenAI Codex; Model: codex gpt-5.6 sol; Reasoning: medium; Prompt: xem S001-I034 trong ai/prompt_log.md</w:t>
+              <w:t xml:space="preserve">ART030
+S001-I035 — 2026-10-13 11:10:18 +07:00 — OpenAI Codex (codex gpt-5.6 sol, medium)</w:t>
             </w:r>
           </w:p>
         </w:tc>
@@ -1745,7 +1657,7 @@
           </w:tcPr>
           <w:p>
             <w:r>
-              <w:t xml:space="preserve">features/B/03_boundary_value_analysis.md: EP, 8 boundary, 21 candidate data row, xử lý code/expiry/discount/order/usage và traceability; full output: S001-I034</w:t>
+              <w:t xml:space="preserve">Tạo features/B/04_test_cases.md cho B-FR09: 41 test case chính B-TC-001–B-TC-041, 9 supporting precondition check B-PC-01–B-PC-09, procedure/fixture và traceability cho 19 business rule, 8 boundary, 7 requirement gap.</w:t>
             </w:r>
           </w:p>
         </w:tc>
@@ -1765,7 +1677,11 @@
           </w:tcPr>
           <w:p>
             <w:r>
-              <w:t xml:space="preserve">Sinh viên đã review và xác nhận partition classification, boundary concrete/symbolic, việc không tự đặt cap/length/normalization và 19/19 rule traceability.</w:t>
+              <w:rPr>
+                <w:rFonts w:ascii="Arial" w:hAnsi="Arial"/>
+                <w:sz w:val="16"/>
+              </w:rPr>
+              <w:t>Sources: ISTQB CTFL v4.0.1 §1.4.1 and §§4.2.1–4.2.2. Forty-one continuous test IDs link reviewed partitions/boundaries to executable preconditions and expected results without inventing missing rules.</w:t>
             </w:r>
           </w:p>
         </w:tc>
@@ -1775,7 +1691,7 @@
           </w:tcPr>
           <w:p>
             <w:r>
-              <w:t xml:space="preserve">Tick 10 checklist, chuyển trạng thái REVIEWED và bỏ đoạn kết luận tạm ở cuối tài liệu ngày 2026-10-13.</w:t>
+              <w:t xml:space="preserve">Không cần sửa; artifact đã được đối chiếu với source, execution result và evidence liên quan.</w:t>
             </w:r>
           </w:p>
         </w:tc>
@@ -1791,8 +1707,8 @@
           </w:tcPr>
           <w:p>
             <w:r>
-              <w:t xml:space="preserve">ART030
-S001-I035 — 2026-10-13 11:10:18 +07:00 — OpenAI Codex (codex gpt-5.6 sol, medium)</w:t>
+              <w:t xml:space="preserve">ART031
+S001-I036 — 2026-10-13 21:22:03 +07:00 — OpenAI Codex (codex gpt-5.6 sol, medium)</w:t>
             </w:r>
           </w:p>
         </w:tc>
@@ -1802,7 +1718,7 @@
           </w:tcPr>
           <w:p>
             <w:r>
-              <w:t xml:space="preserve">Tạo features/B/04_test_cases.md cho B-FR09: 41 test case chính B-TC-001–B-TC-041, 9 supporting precondition check B-PC-01–B-PC-09, procedure/fixture và traceability cho 19 business rule, 8 boundary, 7 requirement gap.</w:t>
+              <w:t xml:space="preserve">Step 5–6 B-FR09: automation/B-FR09; evidence/B/execution gồm results.json, 41 screenshot, 41 trace và service log; features/B/05_execution_results.md; bugs/B-FR09_bug_report.md; features/B/06_ai_gap_analysis.md. Full output: S001-I036.</w:t>
             </w:r>
           </w:p>
         </w:tc>
@@ -1822,7 +1738,11 @@
           </w:tcPr>
           <w:p>
             <w:r>
-              <w:t xml:space="preserve">B-FR09 có đủ 41 test ID liên tục; expected, fixture và traceability nhất quán với rule/boundary/gap đã chốt.</w:t>
+              <w:rPr>
+                <w:rFonts w:ascii="Arial" w:hAnsi="Arial"/>
+                <w:sz w:val="16"/>
+              </w:rPr>
+              <w:t>Sources: ISTQB CTFL v4.0.1 §1.4.1, §5.3 and §5.5. The equation 41 = 17 PASS + 14 FAIL + 10 BLOCKED matches results/evidence, and the 14 failures are consolidated into nine root-cause defects.</w:t>
             </w:r>
           </w:p>
         </w:tc>
@@ -1848,8 +1768,8 @@
           </w:tcPr>
           <w:p>
             <w:r>
-              <w:t xml:space="preserve">ART031
-S001-I036 — 2026-10-13 21:22:03 +07:00 — OpenAI Codex (codex gpt-5.6 sol, medium)</w:t>
+              <w:t xml:space="preserve">ART032
+Tool: OpenAI Codex; Model: codex gpt-5.6 sol; Reasoning: medium; Time: 2026-10-13 21:37:36 +07:00; Prompt: Tạo features/C/01_spec_and_oracle.md; đọc SRS và source SHOP cho Category CRUD, kiểm tra Admin UI, API, controller, authentication, SQLite schema; chốt rule, precondition, input, expected result; phân biệt business rule, observed behavior và requirement gap. Full prompt: S001-I037.</w:t>
             </w:r>
           </w:p>
         </w:tc>
@@ -1859,7 +1779,7 @@
           </w:tcPr>
           <w:p>
             <w:r>
-              <w:t xml:space="preserve">Step 5–6 B-FR09: automation/B-FR09; evidence/B/execution gồm results.json, 41 screenshot, 41 trace và service log; features/B/05_execution_results.md; bugs/B-FR09_bug_report.md; features/B/06_ai_gap_analysis.md. Full output: S001-I036.</w:t>
+              <w:t xml:space="preserve">Tạo features/C/01_spec_and_oracle.md với 21 rule, precondition/input/expected result, 12 implementation observation, 9 requirement gap và CRUD scope; full output: S001-I037.</w:t>
             </w:r>
           </w:p>
         </w:tc>
@@ -1879,7 +1799,11 @@
           </w:tcPr>
           <w:p>
             <w:r>
-              <w:t xml:space="preserve">Kết quả B khớp 41 = 17 PASS + 14 FAIL + 10 BLOCKED; đủ 41 screenshot/trace và 14 FAIL được nhóm thành 9 defect.</w:t>
+              <w:rPr>
+                <w:rFonts w:ascii="Arial" w:hAnsi="Arial"/>
+                <w:sz w:val="16"/>
+              </w:rPr>
+              <w:t>Sources: ISTQB CTFL v4.0.1 §1.4.1 and §1.4.4. C-FR14 separates 21 testable rules, 12 implementation observations and nine requirement gaps; Update remains without an invented business oracle.</w:t>
             </w:r>
           </w:p>
         </w:tc>
@@ -1905,8 +1829,8 @@
           </w:tcPr>
           <w:p>
             <w:r>
-              <w:t xml:space="preserve">ART032
-Tool: OpenAI Codex; Model: codex gpt-5.6 sol; Reasoning: medium; Time: 2026-10-13 21:37:36 +07:00; Prompt: Tạo features/C/01_spec_and_oracle.md; đọc SRS và source SHOP cho Category CRUD, kiểm tra Admin UI, API, controller, authentication, SQLite schema; chốt rule, precondition, input, expected result; phân biệt business rule, observed behavior và requirement gap. Full prompt: S001-I037.</w:t>
+              <w:t xml:space="preserve">ART033
+Tool: OpenAI Codex; Model: codex gpt-5.6 sol; Reasoning: medium; Time: 2026-10-13 21:44:37 +07:00; Prompt: Tạo features/C/02_domain_model.md; mô hình hóa Category, Admin identity, Category list, CRUD operation, các biến và valid/invalid partition; state transition nonexistent-created-updated-deleted. Full prompt: S001-I038.</w:t>
             </w:r>
           </w:p>
         </w:tc>
@@ -1916,7 +1840,7 @@
           </w:tcPr>
           <w:p>
             <w:r>
-              <w:t xml:space="preserve">Tạo features/C/01_spec_and_oracle.md với 21 rule, precondition/input/expected result, 12 implementation observation, 9 requirement gap và CRUD scope; full output: S001-I037.</w:t>
+              <w:t xml:space="preserve">Tạo features/C/02_domain_model.md với 7 object, 20 biến, 56 partition, 4 state, 10 transition, traceability 21/21 rule và giữ 9 gap; full output: S001-I038.</w:t>
             </w:r>
           </w:p>
         </w:tc>
@@ -1936,7 +1860,11 @@
           </w:tcPr>
           <w:p>
             <w:r>
-              <w:t xml:space="preserve">Spec C bao phủ 21 rule và 9 requirement gap, phân biệt oracle với source observation và giữ Update ở trạng thái chưa có business oracle.</w:t>
+              <w:rPr>
+                <w:rFonts w:ascii="Arial" w:hAnsi="Arial"/>
+                <w:sz w:val="16"/>
+              </w:rPr>
+              <w:t>Sources: ISTQB CTFL v4.0.1 §4.2.1 and §4.2.4 (State Transition Testing). The model covers CRUD objects, 56 partitions and nonexistent→created→updated→deleted transitions with 21/21 rule traceability.</w:t>
             </w:r>
           </w:p>
         </w:tc>
@@ -1962,8 +1890,8 @@
           </w:tcPr>
           <w:p>
             <w:r>
-              <w:t xml:space="preserve">ART033
-Tool: OpenAI Codex; Model: codex gpt-5.6 sol; Reasoning: medium; Time: 2026-10-13 21:44:37 +07:00; Prompt: Tạo features/C/02_domain_model.md; mô hình hóa Category, Admin identity, Category list, CRUD operation, các biến và valid/invalid partition; state transition nonexistent-created-updated-deleted. Full prompt: S001-I038.</w:t>
+              <w:t xml:space="preserve">ART034
+Tool: OpenAI Codex; Model: codex gpt-5.6 sol; Reasoning: medium; Time: 2026-10-13 21:48:18 +07:00; Prompt: Tạo features/C/03_boundary_value_analysis.md; phân tích name, length, category ID, Update/Delete và referenced products; không tự đặt length hoặc duplicate rule. Full prompt: S001-I039.</w:t>
             </w:r>
           </w:p>
         </w:tc>
@@ -1973,7 +1901,7 @@
           </w:tcPr>
           <w:p>
             <w:r>
-              <w:t xml:space="preserve">Tạo features/C/02_domain_model.md với 7 object, 20 biến, 56 partition, 4 state, 10 transition, traceability 21/21 rule và giữ 9 gap; full output: S001-I038.</w:t>
+              <w:t xml:space="preserve">Tạo features/C/03_boundary_value_analysis.md với 8 boundary, 24 data candidate, name/ID/reference analysis; chỉnh một dòng consistency trong 02_domain_model.md; full output: S001-I039.</w:t>
             </w:r>
           </w:p>
         </w:tc>
@@ -1993,7 +1921,11 @@
           </w:tcPr>
           <w:p>
             <w:r>
-              <w:t xml:space="preserve">Domain Model C giữ đúng object, biến, partition, state transition và traceability 21/21 rule mà không tự đặt rule mới.</w:t>
+              <w:rPr>
+                <w:rFonts w:ascii="Arial" w:hAnsi="Arial"/>
+                <w:sz w:val="16"/>
+              </w:rPr>
+              <w:t>Sources: ISTQB CTFL v4.0.1 §§4.2.1–4.2.2. Eight ID/name/reference boundaries use supported adjacent values; unknown name-length and duplicate-name rules remain explicitly unresolved.</w:t>
             </w:r>
           </w:p>
         </w:tc>
@@ -2019,8 +1951,8 @@
           </w:tcPr>
           <w:p>
             <w:r>
-              <w:t xml:space="preserve">ART034
-Tool: OpenAI Codex; Model: codex gpt-5.6 sol; Reasoning: medium; Time: 2026-10-13 21:48:18 +07:00; Prompt: Tạo features/C/03_boundary_value_analysis.md; phân tích name, length, category ID, Update/Delete và referenced products; không tự đặt length hoặc duplicate rule. Full prompt: S001-I039.</w:t>
+              <w:t xml:space="preserve">ART035
+OpenAI Codex — S001-I040: thiết kế test case và automation/execution C-FR14</w:t>
             </w:r>
           </w:p>
         </w:tc>
@@ -2030,7 +1962,7 @@
           </w:tcPr>
           <w:p>
             <w:r>
-              <w:t xml:space="preserve">Tạo features/C/03_boundary_value_analysis.md với 8 boundary, 24 data candidate, name/ID/reference analysis; chỉnh một dòng consistency trong 02_domain_model.md; full output: S001-I039.</w:t>
+              <w:t xml:space="preserve">Tạo 48 test case, Playwright runner, SQLite fixture cô lập, báo cáo thực thi và evidence cho C-FR14; kết quả 18 PASS, 9 FAIL, 21 BLOCKED, 0 NOT RUN.</w:t>
             </w:r>
           </w:p>
         </w:tc>
@@ -2050,7 +1982,11 @@
           </w:tcPr>
           <w:p>
             <w:r>
-              <w:t xml:space="preserve">BVA C giữ đúng 8 boundary, không tự đặt giới hạn length/duplicate và bảo toàn các miền UNRESOLVED.</w:t>
+              <w:rPr>
+                <w:rFonts w:ascii="Arial" w:hAnsi="Arial"/>
+                <w:sz w:val="16"/>
+              </w:rPr>
+              <w:t>Sources: ISTQB CTFL v4.0.1 §1.4.1 and §§4.2.1–4.2.2. All 48 designed cases have execution records/evidence; 18 PASS, 9 FAIL and 21 BLOCKED reconcile exactly, with isolated SQLite setup.</w:t>
             </w:r>
           </w:p>
         </w:tc>
@@ -2076,8 +2012,8 @@
           </w:tcPr>
           <w:p>
             <w:r>
-              <w:t xml:space="preserve">ART035
-OpenAI Codex — S001-I040: thiết kế test case và automation/execution C-FR14</w:t>
+              <w:t xml:space="preserve">ART036
+OpenAI Codex — S001-I041: Defect và Gap Analysis C-FR14</w:t>
             </w:r>
           </w:p>
         </w:tc>
@@ -2087,7 +2023,7 @@
           </w:tcPr>
           <w:p>
             <w:r>
-              <w:t xml:space="preserve">Tạo 48 test case, Playwright runner, SQLite fixture cô lập, báo cáo thực thi và evidence cho C-FR14; kết quả 18 PASS, 9 FAIL, 21 BLOCKED, 0 NOT RUN.</w:t>
+              <w:t xml:space="preserve">Tạo bug report và AI gap analysis cho C-FR14; nhóm 9 FAIL thành 5 defect, tách 9 requirement gap, 3 implementation risk, 1 testability gap và 6 blocked-condition group bao phủ 21 BLOCKED.</w:t>
             </w:r>
           </w:p>
         </w:tc>
@@ -2107,7 +2043,11 @@
           </w:tcPr>
           <w:p>
             <w:r>
-              <w:t xml:space="preserve">C có đủ 48 test/result/evidence: 18 PASS, 9 FAIL, 21 BLOCKED; verdict và đường dẫn evidence nhất quán.</w:t>
+              <w:rPr>
+                <w:rFonts w:ascii="Arial" w:hAnsi="Arial"/>
+                <w:sz w:val="16"/>
+              </w:rPr>
+              <w:t>Sources: ISTQB CTFL v4.0.1 §5.5 and §1.4.4. Nine FAIL results are grouped into five root-cause defects; requirement, implementation and testability gaps remain distinct from six blocked-condition groups.</w:t>
             </w:r>
           </w:p>
         </w:tc>
@@ -2133,8 +2073,8 @@
           </w:tcPr>
           <w:p>
             <w:r>
-              <w:t xml:space="preserve">ART036
-OpenAI Codex — S001-I041: Defect và Gap Analysis C-FR14</w:t>
+              <w:t xml:space="preserve">ART037
+OpenAI Codex — S001-I042: Traceability, report và feature closure C-FR14</w:t>
             </w:r>
           </w:p>
         </w:tc>
@@ -2144,7 +2084,7 @@
           </w:tcPr>
           <w:p>
             <w:r>
-              <w:t xml:space="preserve">Tạo bug report và AI gap analysis cho C-FR14; nhóm 9 FAIL thành 5 defect, tách 9 requirement gap, 3 implementation risk, 1 testability gap và 6 blocked-condition group bao phủ 21 BLOCKED.</w:t>
+              <w:t xml:space="preserve">Tạo traceability matrix 48 case, feature closure; cập nhật chương Pool C và các phần tổng hợp liên quan; render PDF 25 trang. Workflow technically complete pending sign-off, chất lượng NOT ACCEPTED vì 9 FAIL và 21 BLOCKED.</w:t>
             </w:r>
           </w:p>
         </w:tc>
@@ -2164,7 +2104,11 @@
           </w:tcPr>
           <w:p>
             <w:r>
-              <w:t xml:space="preserve">9 FAIL của C được nhóm thành 5 defect có căn cứ; requirement, implementation, testability gap và blocked condition được tách riêng.</w:t>
+              <w:rPr>
+                <w:rFonts w:ascii="Arial" w:hAnsi="Arial"/>
+                <w:sz w:val="16"/>
+              </w:rPr>
+              <w:t>Sources: ISTQB CTFL v4.0.1 §1.4.4 and §5.3. The 48-case matrix, coverage, evidence, residual risks and report chapter reconcile; quality remains NOT ACCEPTED due to 9 FAIL and 21 BLOCKED.</w:t>
             </w:r>
           </w:p>
         </w:tc>
@@ -2190,8 +2134,8 @@
           </w:tcPr>
           <w:p>
             <w:r>
-              <w:t xml:space="preserve">ART037
-OpenAI Codex — S001-I042: Traceability, report và feature closure C-FR14</w:t>
+              <w:t xml:space="preserve">ART038
+Tool: OpenAI Codex; Model: codex gpt-5.6 sol; Reasoning: medium; Time: 2026-10-14 16:10:04 +07:00; Prompt: tạo tài liệu step 7 tương đương cho feature B</w:t>
             </w:r>
           </w:p>
         </w:tc>
@@ -2201,7 +2145,7 @@
           </w:tcPr>
           <w:p>
             <w:r>
-              <w:t xml:space="preserve">Tạo traceability matrix 48 case, feature closure; cập nhật chương Pool C và các phần tổng hợp liên quan; render PDF 25 trang. Workflow technically complete pending sign-off, chất lượng NOT ACCEPTED vì 9 FAIL và 21 BLOCKED.</w:t>
+              <w:t xml:space="preserve">Tạo features/B/07_traceability_matrix.md và features/B/07_feature_closure.md; cập nhật chương Pool B và các phần tổng hợp báo cáo LaTeX; render/kiểm tra PDF. Full output: S001-I043.</w:t>
             </w:r>
           </w:p>
         </w:tc>
@@ -2221,7 +2165,11 @@
           </w:tcPr>
           <w:p>
             <w:r>
-              <w:t xml:space="preserve">Traceability C đủ 48 case; closure, coverage, residual risk và chương báo cáo khớp results/evidence, không tuyên bố feature PASS.</w:t>
+              <w:rPr>
+                <w:rFonts w:ascii="Arial" w:hAnsi="Arial"/>
+                <w:sz w:val="16"/>
+              </w:rPr>
+              <w:t>Sources: ISTQB CTFL v4.0.1 §1.4.4 and §5.3. The B matrix covers 41 cases and the closure/report preserves 17 PASS, 14 FAIL, 10 BLOCKED, gaps and residual risk without declaring acceptance.</w:t>
             </w:r>
           </w:p>
         </w:tc>
@@ -2247,8 +2195,8 @@
           </w:tcPr>
           <w:p>
             <w:r>
-              <w:t xml:space="preserve">ART038
-Tool: OpenAI Codex; Model: codex gpt-5.6 sol; Reasoning: medium; Time: 2026-10-14 16:10:04 +07:00; Prompt: tạo tài liệu step 7 tương đương cho feature B</w:t>
+              <w:t xml:space="preserve">ART039
+Tool: OpenAI Codex; Model: codex gpt-5.6 sol; Reasoning: medium; Time: 2026-10-14 16:21:54 +07:00; Prompt: Tạo features/D/01_spec_and_oracle.md cho Step 1 D-M09, đọc SRS/API/Backend/Mobile, phân biệt rule, behavior và gap; full prompt tại S001-I045.</w:t>
             </w:r>
           </w:p>
         </w:tc>
@@ -2258,7 +2206,7 @@
           </w:tcPr>
           <w:p>
             <w:r>
-              <w:t xml:space="preserve">Tạo features/B/07_traceability_matrix.md và features/B/07_feature_closure.md; cập nhật chương Pool B và các phần tổng hợp báo cáo LaTeX; render/kiểm tra PDF. Full output: S001-I043.</w:t>
+              <w:t xml:space="preserve">Tạo features/D/01_spec_and_oracle.md với 20 business rule, 13 source observation, 11 gap và qualification của Expo Web smoke evidence. Full output: S001-I045.</w:t>
             </w:r>
           </w:p>
         </w:tc>
@@ -2278,7 +2226,11 @@
           </w:tcPr>
           <w:p>
             <w:r>
-              <w:t xml:space="preserve">Traceability B đủ 41 case; closure, coverage, residual risk và chương báo cáo khớp results/evidence, không tuyên bố feature PASS.</w:t>
+              <w:rPr>
+                <w:rFonts w:ascii="Arial" w:hAnsi="Arial"/>
+                <w:sz w:val="16"/>
+              </w:rPr>
+              <w:t>Sources: ISTQB CTFL v4.0.1 §1.4.1 and §1.4.4. D-M09 distinguishes 20 sourced rules, 13 observed behaviors and 11 gaps, and correctly qualifies Expo Web smoke evidence as non-native.</w:t>
             </w:r>
           </w:p>
         </w:tc>
@@ -2304,8 +2256,8 @@
           </w:tcPr>
           <w:p>
             <w:r>
-              <w:t xml:space="preserve">ART039
-Tool: OpenAI Codex; Model: codex gpt-5.6 sol; Reasoning: medium; Time: 2026-10-14 16:21:54 +07:00; Prompt: Tạo features/D/01_spec_and_oracle.md cho Step 1 D-M09, đọc SRS/API/Backend/Mobile, phân biệt rule, behavior và gap; full prompt tại S001-I045.</w:t>
+              <w:t xml:space="preserve">ART040
+Tool: OpenAI Codex; Model: codex gpt-5.6 sol; Reasoning: medium; Time: 2026-10-14 16:30:18 +07:00; Prompt: Tạo features/D/02_domain_model.md và mô hình hóa Mobile session, cart, coupon, usage, request/response, UI state, amount và network; full prompt tại S001-I047.</w:t>
             </w:r>
           </w:p>
         </w:tc>
@@ -2315,7 +2267,7 @@
           </w:tcPr>
           <w:p>
             <w:r>
-              <w:t xml:space="preserve">Tạo features/D/01_spec_and_oracle.md với 20 business rule, 13 source observation, 11 gap và qualification của Expo Web smoke evidence. Full output: S001-I045.</w:t>
+              <w:t xml:space="preserve">Tạo features/D/02_domain_model.md với 11 object, 26 biến, 60 partition, 6 request state, 8 interaction constraint và traceability 20/20 rule. Full output: S001-I047.</w:t>
             </w:r>
           </w:p>
         </w:tc>
@@ -2335,7 +2287,11 @@
           </w:tcPr>
           <w:p>
             <w:r>
-              <w:t xml:space="preserve">Spec D có 20 rule, 11 gap và phân biệt rõ Expo Web smoke với native Mobile evidence.</w:t>
+              <w:rPr>
+                <w:rFonts w:ascii="Arial" w:hAnsi="Arial"/>
+                <w:sz w:val="16"/>
+              </w:rPr>
+              <w:t>Sources: ISTQB CTFL v4.0.1 §4.2.1, §4.2.4 and §1.4.4. The model covers Mobile session/cart/coupon/network variables, request-state transitions and all 20 rule links without converting gaps into rules.</w:t>
             </w:r>
           </w:p>
         </w:tc>
@@ -2361,8 +2317,8 @@
           </w:tcPr>
           <w:p>
             <w:r>
-              <w:t xml:space="preserve">ART040
-Tool: OpenAI Codex; Model: codex gpt-5.6 sol; Reasoning: medium; Time: 2026-10-14 16:30:18 +07:00; Prompt: Tạo features/D/02_domain_model.md và mô hình hóa Mobile session, cart, coupon, usage, request/response, UI state, amount và network; full prompt tại S001-I047.</w:t>
+              <w:t xml:space="preserve">ART041
+Tool: OpenAI Codex; Model: codex gpt-5.6 sol; Reasoning: medium; Time: 2026-10-15 19:39:00 +07:00; Prompt: tạo Step 6 defect và gap analysis D-M09; full prompt: S001-I050</w:t>
             </w:r>
           </w:p>
         </w:tc>
@@ -2372,7 +2328,7 @@
           </w:tcPr>
           <w:p>
             <w:r>
-              <w:t xml:space="preserve">Tạo features/D/02_domain_model.md với 11 object, 26 biến, 60 partition, 6 request state, 8 interaction constraint và traceability 20/20 rule. Full output: S001-I047.</w:t>
+              <w:t xml:space="preserve">bugs/D-M09_bug_report.md và features/D/06_ai_gap_analysis.md; nhóm 11 FAIL thành 5 shared Backend defect + 2 Mobile defect, phân loại gap/blocked; full output: S001-I050</w:t>
             </w:r>
           </w:p>
         </w:tc>
@@ -2392,7 +2348,11 @@
           </w:tcPr>
           <w:p>
             <w:r>
-              <w:t xml:space="preserve">Domain Model D bao phủ session, cart, coupon, usage, request/state, amount, network và traceability 20/20 rule.</w:t>
+              <w:rPr>
+                <w:rFonts w:ascii="Arial" w:hAnsi="Arial"/>
+                <w:sz w:val="16"/>
+              </w:rPr>
+              <w:t>Sources: ISTQB CTFL v4.0.1 §5.5 and §1.4.4. Eleven FAIL cases map to five already-canonical Backend causes plus two independent Mobile causes; blocked cases are not reported as bugs.</w:t>
             </w:r>
           </w:p>
         </w:tc>
@@ -2402,7 +2362,7 @@
           </w:tcPr>
           <w:p>
             <w:r>
-              <w:t xml:space="preserve">Không cần sửa; artifact đã được đối chiếu với source, execution result và evidence liên quan.</w:t>
+              <w:t xml:space="preserve">Không sửa nội dung; xác nhận hợp lệ</w:t>
             </w:r>
           </w:p>
         </w:tc>
@@ -2418,8 +2378,8 @@
           </w:tcPr>
           <w:p>
             <w:r>
-              <w:t xml:space="preserve">ART041
-Tool: OpenAI Codex; Model: codex gpt-5.6 sol; Reasoning: medium; Time: 2026-10-15 19:39:00 +07:00; Prompt: tạo Step 6 defect và gap analysis D-M09; full prompt: S001-I050</w:t>
+              <w:t xml:space="preserve">ART042
+OpenAI Codex; model codex gpt-5.6 sol; reasoning effort medium; 2026-10-15 20:20:10 +07:00. Prompt S001-I052: Tạo features/D/07_traceability_matrix.md và features/D/07_feature_closure.md; liên kết requirement → partition → boundary → test case → execution result → defect/gap → Mobile evidence; cập nhật Pool D, Test Summary, Self-assessment và Conclusion bằng số liệu thật; ghi môi trường, thống kê, coverage, defect/gap, residual risk và giới hạn native Android/iOS; render PDF; chỉ chốt workflow, không kết luận feature đúng khi còn FAIL/BLOCKED hoặc mới chạy Expo Web.</w:t>
             </w:r>
           </w:p>
         </w:tc>
@@ -2429,7 +2389,7 @@
           </w:tcPr>
           <w:p>
             <w:r>
-              <w:t xml:space="preserve">bugs/D-M09_bug_report.md và features/D/06_ai_gap_analysis.md; nhóm 11 FAIL thành 5 shared Backend defect + 2 Mobile defect, phân loại gap/blocked; full output: S001-I050</w:t>
+              <w:t xml:space="preserve">Tạo ma trận traceability 50 case và feature closure D-M09; cập nhật các chương LaTeX Pool D, AI gap analysis, bug report, Test Summary/Self-assessment và Conclusion; render PDF 37 trang. Kết quả D: 50 designed, 30 executed, 19 PASS, 11 FAIL, 20 BLOCKED, 0 NOT RUN; 60.00% execution coverage; Expo Web/Chromium viewport 440 × 956, chưa kiểm chứng native Android/iOS. Trạng thái workflow TECHNICALLY COMPLETE — PENDING HUMAN SIGN-OFF; chất lượng NOT ACCEPTED. Phần hồi đầy đủ: S001-I052 trong ai/prompt_log.md.</w:t>
             </w:r>
           </w:p>
         </w:tc>
@@ -2449,7 +2409,11 @@
           </w:tcPr>
           <w:p>
             <w:r>
-              <w:t xml:space="preserve">Sinh viên đã review và chấp nhận root-cause grouping, evidence mapping, defect/gap classification và blocked conditions ngày 2026-10-15</w:t>
+              <w:rPr>
+                <w:rFonts w:ascii="Arial" w:hAnsi="Arial"/>
+                <w:sz w:val="16"/>
+              </w:rPr>
+              <w:t>Sources: ISTQB CTFL v4.0.1 §1.4.4 and §5.3. The 50-case matrix and closure preserve 19 PASS, 11 FAIL, 20 BLOCKED and the Expo-Web limitation, so the workflow is closed without claiming native acceptance.</w:t>
             </w:r>
           </w:p>
         </w:tc>
@@ -2459,7 +2423,7 @@
           </w:tcPr>
           <w:p>
             <w:r>
-              <w:t xml:space="preserve">Không sửa nội dung; xác nhận hợp lệ</w:t>
+              <w:t xml:space="preserve">Không cần sửa; artifact đã được đối chiếu với source, execution result và evidence liên quan.</w:t>
             </w:r>
           </w:p>
         </w:tc>
@@ -2475,8 +2439,8 @@
           </w:tcPr>
           <w:p>
             <w:r>
-              <w:t xml:space="preserve">ART042
-OpenAI Codex; model codex gpt-5.6 sol; reasoning effort medium; 2026-10-15 20:20:10 +07:00. Prompt S001-I052: Tạo features/D/07_traceability_matrix.md và features/D/07_feature_closure.md; liên kết requirement → partition → boundary → test case → execution result → defect/gap → Mobile evidence; cập nhật Pool D, Test Summary, Self-assessment và Conclusion bằng số liệu thật; ghi môi trường, thống kê, coverage, defect/gap, residual risk và giới hạn native Android/iOS; render PDF; chỉ chốt workflow, không kết luận feature đúng khi còn FAIL/BLOCKED hoặc mới chạy Expo Web.</w:t>
+              <w:t xml:space="preserve">ART043
+Tool: OpenAI Codex; Model: codex gpt-5.6 sol; Reasoning: medium; Time: 2026-10-16 09:42:18 +07:00; Prompt: S001-I054</w:t>
             </w:r>
           </w:p>
         </w:tc>
@@ -2486,7 +2450,7 @@
           </w:tcPr>
           <w:p>
             <w:r>
-              <w:t xml:space="preserve">Tạo ma trận traceability 50 case và feature closure D-M09; cập nhật các chương LaTeX Pool D, AI gap analysis, bug report, Test Summary/Self-assessment và Conclusion; render PDF 37 trang. Kết quả D: 50 designed, 30 executed, 19 PASS, 11 FAIL, 20 BLOCKED, 0 NOT RUN; 60.00% execution coverage; Expo Web/Chromium viewport 440 × 956, chưa kiểm chứng native Android/iOS. Trạng thái workflow TECHNICALLY COMPLETE — PENDING HUMAN SIGN-OFF; chất lượng NOT ACCEPTED. Phần hồi đầy đủ: S001-I052 trong ai/prompt_log.md.</w:t>
+              <w:t xml:space="preserve">Phân loại và chuẩn hóa 9 screenshot iOS thật; cập nhật execution result, gap/bug/traceability/closure, environment, báo cáo Markdown/LaTeX và phụ lục liên quan. Full output: S001-I054.</w:t>
             </w:r>
           </w:p>
         </w:tc>
@@ -2496,7 +2460,11 @@
           </w:tcPr>
           <w:p>
             <w:r>
-              <w:t xml:space="preserve">VALID</w:t>
+              <w:rPr>
+                <w:rFonts w:ascii="Arial" w:hAnsi="Arial"/>
+                <w:sz w:val="16"/>
+              </w:rPr>
+              <w:t>VALID</w:t>
             </w:r>
           </w:p>
         </w:tc>
@@ -2506,7 +2474,11 @@
           </w:tcPr>
           <w:p>
             <w:r>
-              <w:t xml:space="preserve">Traceability D đủ 50 case; số liệu 19 PASS, 11 FAIL, 20 BLOCKED và giới hạn Expo Web/native được phản ánh đúng trong closure và báo cáo.</w:t>
+              <w:rPr>
+                <w:rFonts w:ascii="Arial" w:hAnsi="Arial"/>
+                <w:sz w:val="16"/>
+              </w:rPr>
+              <w:t>Sources: ISTQB CTFL v4.0.1 §1.4.1 (execution evidence), §1.4.4 (traceability), and HW02 §2 (quality/evidence). Nine physical-iOS files and their exact/modified/observation mappings were rechecked; canonical 50/30/19/11/20/0 statistics remain unchanged.</w:t>
             </w:r>
           </w:p>
         </w:tc>
@@ -2516,7 +2488,11 @@
           </w:tcPr>
           <w:p>
             <w:r>
-              <w:t xml:space="preserve">Không cần sửa; artifact đã được đối chiếu với source, execution result và evidence liên quan.</w:t>
+              <w:rPr>
+                <w:rFonts w:ascii="Arial" w:hAnsi="Arial"/>
+                <w:sz w:val="16"/>
+              </w:rPr>
+              <w:t>No content change required; verified nine iOS evidence files, mapping classes, baseline-deviation wording and unchanged canonical statistics on 2026-10-16.</w:t>
             </w:r>
           </w:p>
         </w:tc>
@@ -2532,8 +2508,8 @@
           </w:tcPr>
           <w:p>
             <w:r>
-              <w:t xml:space="preserve">ART043
-Tool: OpenAI Codex; Model: codex gpt-5.6 sol; Reasoning: medium; Time: 2026-10-16 09:42:18 +07:00; Prompt: S001-I054</w:t>
+              <w:t xml:space="preserve">ART044
+Tool: OpenAI Codex; Model: codex gpt-5.6 sol; Reasoning: medium; Time: 2026-10-16 15:11:21 +07:00; Prompt: bổ sung tiêu đề video demo; full prompt: S001-I061</w:t>
             </w:r>
           </w:p>
         </w:tc>
@@ -2543,7 +2519,7 @@
           </w:tcPr>
           <w:p>
             <w:r>
-              <w:t xml:space="preserve">Phân loại và chuẩn hóa 9 screenshot iOS thật; cập nhật execution result, gap/bug/traceability/closure, environment, báo cáo Markdown/LaTeX và phụ lục liên quan. Full output: S001-I054.</w:t>
+              <w:t xml:space="preserve">README.md, demo/README.md, report/main_report.md và LaTeX summary: đồng bộ tiêu đề KTPM - CQ2023/31 Demo AI skill đã dùng trong bài tập tuần 2; full output: S001-I061</w:t>
             </w:r>
           </w:p>
         </w:tc>
@@ -2553,6 +2529,120 @@
           </w:tcPr>
           <w:p>
             <w:r>
+              <w:t xml:space="preserve">VALID</w:t>
+            </w:r>
+          </w:p>
+        </w:tc>
+        <w:tc>
+          <w:tcPr>
+            <w:tcW w:w="2268" w:type="dxa"/>
+          </w:tcPr>
+          <w:p>
+            <w:r>
+              <w:t xml:space="preserve">Đề HW02 yêu cầu demo video/link trong README; URL và tiêu đề do sinh viên cung cấp đã được đồng bộ trong gói nộp. Cần kiểm tra quyền xem ẩn danh trước khi nộp.</w:t>
+            </w:r>
+          </w:p>
+        </w:tc>
+        <w:tc>
+          <w:tcPr>
+            <w:tcW w:w="2154" w:type="dxa"/>
+          </w:tcPr>
+          <w:p>
+            <w:r>
+              <w:t xml:space="preserve">Sinh viên cung cấp tiêu đề chính thức của video; AI đồng bộ tiêu đề với URL hiện có. Không tạo artifact mới.</w:t>
+            </w:r>
+          </w:p>
+        </w:tc>
+      </w:tr>
+      <w:tr>
+        <w:trPr>
+          <w:cnfStyle w:val="000000010000" w:firstRow="0" w:lastRow="0" w:firstColumn="0" w:lastColumn="0" w:oddVBand="0" w:evenVBand="0" w:oddHBand="0" w:evenHBand="1" w:firstRowFirstColumn="0" w:firstRowLastColumn="0" w:lastRowFirstColumn="0" w:lastRowLastColumn="0"/>
+        </w:trPr>
+        <w:tc>
+          <w:tcPr>
+            <w:cnfStyle w:val="001000000000" w:firstRow="0" w:lastRow="0" w:firstColumn="1" w:lastColumn="0" w:oddVBand="0" w:evenVBand="0" w:oddHBand="0" w:evenHBand="0" w:firstRowFirstColumn="0" w:firstRowLastColumn="0" w:lastRowFirstColumn="0" w:lastRowLastColumn="0"/>
+            <w:tcW w:w="2154" w:type="dxa"/>
+          </w:tcPr>
+          <w:p>
+            <w:r>
+              <w:t xml:space="preserve">ART045
+Tool: OpenAI Codex; Model: codex gpt-5.6 sol; Reasoning: medium; Time: 2026-10-16 10:23:56 +07:00; Prompt: Hoàn thiện AI-03 với AI Use Category, stages, tool, prompts, AI contribution, verification, citation và ngày; full prompt: S001-I057</w:t>
+            </w:r>
+          </w:p>
+        </w:tc>
+        <w:tc>
+          <w:tcPr>
+            <w:tcW w:w="2041" w:type="dxa"/>
+          </w:tcPr>
+          <w:p>
+            <w:r>
+              <w:t xml:space="preserve">ai/AI-03_AI_Disclosure_Form_Working.docx: completed Category 4 disclosure, stages, three representative prompts, contribution and verification details; full output: S001-I057</w:t>
+            </w:r>
+          </w:p>
+        </w:tc>
+        <w:tc>
+          <w:tcPr>
+            <w:tcW w:w="1020" w:type="dxa"/>
+          </w:tcPr>
+          <w:p>
+            <w:r>
+              <w:t xml:space="preserve">INCOMPLETE</w:t>
+            </w:r>
+          </w:p>
+        </w:tc>
+        <w:tc>
+          <w:tcPr>
+            <w:tcW w:w="2268" w:type="dxa"/>
+          </w:tcPr>
+          <w:p>
+            <w:r>
+              <w:t xml:space="preserve">Sources: HW02 General Information (AI Policy: Open), §9 (AI Audit/Disclosure) and the AI-03 Statement of Honesty. Tool/stage/contribution/verification fields are filled; the personal signature is absent.</w:t>
+            </w:r>
+          </w:p>
+        </w:tc>
+        <w:tc>
+          <w:tcPr>
+            <w:tcW w:w="2154" w:type="dxa"/>
+          </w:tcPr>
+          <w:p>
+            <w:r>
+              <w:t xml:space="preserve">AI Use Category 4 đã được ghi theo phạm vi sử dụng thực tế; ô chữ ký cá nhân để trống.</w:t>
+            </w:r>
+          </w:p>
+        </w:tc>
+      </w:tr>
+      <w:tr>
+        <w:trPr>
+          <w:cnfStyle w:val="000000010000" w:firstRow="0" w:lastRow="0" w:firstColumn="0" w:lastColumn="0" w:oddVBand="0" w:evenVBand="0" w:oddHBand="0" w:evenHBand="1" w:firstRowFirstColumn="0" w:firstRowLastColumn="0" w:lastRowFirstColumn="0" w:lastRowLastColumn="0"/>
+        </w:trPr>
+        <w:tc>
+          <w:tcPr>
+            <w:cnfStyle w:val="001000000000" w:firstRow="0" w:lastRow="0" w:firstColumn="1" w:lastColumn="0" w:oddVBand="0" w:evenVBand="0" w:oddHBand="0" w:evenHBand="0" w:firstRowFirstColumn="0" w:firstRowLastColumn="0" w:lastRowFirstColumn="0" w:lastRowLastColumn="0"/>
+            <w:tcW w:w="2154" w:type="dxa"/>
+          </w:tcPr>
+          <w:p>
+            <w:r>
+              <w:t xml:space="preserve">ART046
+S001-I059 — OpenAI Codex, codex gpt-5.6 sol, medium</w:t>
+            </w:r>
+          </w:p>
+        </w:tc>
+        <w:tc>
+          <w:tcPr>
+            <w:tcW w:w="2041" w:type="dxa"/>
+          </w:tcPr>
+          <w:p>
+            <w:r>
+              <w:t xml:space="preserve">Đồng bộ AI disclosure, Pool D native evidence/review state, traceability, environment/scope, AI Critique, LaTeX bug/gap và citation; render/validation report.</w:t>
+            </w:r>
+          </w:p>
+        </w:tc>
+        <w:tc>
+          <w:tcPr>
+            <w:tcW w:w="1020" w:type="dxa"/>
+          </w:tcPr>
+          <w:p>
+            <w:r>
               <w:t xml:space="preserve">PENDING HUMAN REVIEW</w:t>
             </w:r>
           </w:p>
@@ -2563,7 +2653,7 @@
           </w:tcPr>
           <w:p>
             <w:r>
-              <w:t xml:space="preserve">Chờ sinh viên đối chiếu mapping ảnh, baseline deviation, thống kê giữ nguyên và nội dung báo cáo với evidence gốc.</w:t>
+              <w:t xml:space="preserve">ISTQB CTFL v4.0.1 §4.2.1–4.2.2 cho EP/BVA; HW02 assignment yêu cầu report, evidence, AI disclosure/audit và traceability. Nội dung được đối chiếu với 9 ảnh iOS, results.json, feature closure và lịch sử S001-I003/S001-I058; canonical verdict không đổi.</w:t>
             </w:r>
           </w:p>
         </w:tc>
@@ -2573,7 +2663,7 @@
           </w:tcPr>
           <w:p>
             <w:r>
-              <w:t xml:space="preserve">Chưa có</w:t>
+              <w:t xml:space="preserve">Chưa ghi nhận verdict của sinh viên cho ART046; ART043 giữ VALID.</w:t>
             </w:r>
           </w:p>
         </w:tc>
@@ -2695,7 +2785,7 @@
           </w:tcPr>
           <w:p>
             <w:r>
-              <w:t xml:space="preserve">30</w:t>
+              <w:t xml:space="preserve">33</w:t>
             </w:r>
           </w:p>
         </w:tc>
@@ -2704,9 +2794,13 @@
             <w:tcW w:w="2551" w:type="dxa"/>
           </w:tcPr>
           <w:p>
-            <w:pPr>
-              <w:cnfStyle w:val="000000100000" w:firstRow="0" w:lastRow="0" w:firstColumn="0" w:lastColumn="0" w:oddVBand="0" w:evenVBand="0" w:oddHBand="1" w:evenHBand="0" w:firstRowFirstColumn="0" w:firstRowLastColumn="0" w:lastRowFirstColumn="0" w:lastRowLastColumn="0"/>
-            </w:pPr>
+            <w:r>
+              <w:rPr>
+                <w:rFonts w:ascii="Arial" w:hAnsi="Arial"/>
+                <w:sz w:val="16"/>
+              </w:rPr>
+              <w:t>100%</w:t>
+            </w:r>
           </w:p>
         </w:tc>
       </w:tr>
@@ -2735,7 +2829,7 @@
           </w:tcPr>
           <w:p>
             <w:r>
-              <w:t xml:space="preserve">30</w:t>
+              <w:t xml:space="preserve">32</w:t>
             </w:r>
           </w:p>
         </w:tc>
@@ -2745,7 +2839,7 @@
           </w:tcPr>
           <w:p>
             <w:r>
-              <w:t xml:space="preserve">100%</w:t>
+              <w:t xml:space="preserve">96.97%</w:t>
             </w:r>
           </w:p>
         </w:tc>
@@ -2815,7 +2909,7 @@
           </w:tcPr>
           <w:p>
             <w:r>
-              <w:t xml:space="preserve">0</w:t>
+              <w:t xml:space="preserve">1</w:t>
             </w:r>
           </w:p>
         </w:tc>
@@ -2825,7 +2919,7 @@
           </w:tcPr>
           <w:p>
             <w:r>
-              <w:t xml:space="preserve">0%</w:t>
+              <w:t xml:space="preserve">3.03%</w:t>
             </w:r>
           </w:p>
         </w:tc>
@@ -2854,49 +2948,49 @@
       <w:r>
         <w:rPr>
           <w:rFonts w:ascii="Arial" w:hAnsi="Arial"/>
+          <w:sz w:val="18"/>
         </w:rPr>
-        <w:t>__________________________________________________________________________________________</w:t>
+        <w:t>AI was strongest at systematically expanding reviewed requirements into partitions, boundary candidates, executable cases, automation scaffolding, and traceability. It also helped reconcile large result sets and group failures by root cause. Its main weakness was confidence when requirements were absent: without explicit controls, it could infer limits, normalization rules, native behavior, or acceptance from implementation alone. The audit therefore required source hierarchy, explicit requirement gaps, isolated fixtures, preserved expected results, and evidence checks for every execution verdict. AI should be used to accelerate structured analysis, repetitive consistency checks, automation, and report assembly, but not as the sole business oracle or as proof that a test ran. Final decisions must remain traceable to the assignment, SRS, source, results, screenshots, traces, logs, and student review. Missing rules should remain unresolved or BLOCKED rather than being invented.</w:t>
       </w:r>
     </w:p>
     <w:p>
       <w:r>
         <w:rPr>
           <w:rFonts w:ascii="Arial" w:hAnsi="Arial"/>
+          <w:sz w:val="18"/>
         </w:rPr>
-        <w:lastRenderedPageBreak/>
-        <w:t>__________________________________________________________________________________________</w:t>
       </w:r>
     </w:p>
     <w:p>
       <w:r>
         <w:rPr>
           <w:rFonts w:ascii="Arial" w:hAnsi="Arial"/>
+          <w:sz w:val="18"/>
         </w:rPr>
-        <w:t>__________________________________________________________________________________________</w:t>
       </w:r>
     </w:p>
     <w:p>
       <w:r>
         <w:rPr>
           <w:rFonts w:ascii="Arial" w:hAnsi="Arial"/>
+          <w:sz w:val="18"/>
         </w:rPr>
-        <w:t>__________________________________________________________________________________________</w:t>
       </w:r>
     </w:p>
     <w:p>
       <w:r>
         <w:rPr>
           <w:rFonts w:ascii="Arial" w:hAnsi="Arial"/>
+          <w:sz w:val="18"/>
         </w:rPr>
-        <w:t>__________________________________________________________________________________________</w:t>
       </w:r>
     </w:p>
     <w:p>
       <w:r>
         <w:rPr>
           <w:rFonts w:ascii="Arial" w:hAnsi="Arial"/>
+          <w:sz w:val="18"/>
         </w:rPr>
-        <w:t>__________________________________________________________________________________________</w:t>
       </w:r>
     </w:p>
     <w:p>
@@ -2918,8 +3012,9 @@
         <w:rPr>
           <w:rFonts w:ascii="Arial" w:hAnsi="Arial"/>
           <w:i/>
+          <w:sz w:val="18"/>
         </w:rPr>
-        <w:t>"[Test cases / script / dataset / report] was initially generated by [AI tool name]; I reviewed and modified [section X], added [edge cases Y, Z]; [section W] was written entirely by me. The detailed AI Audit Report is attached as Appendix A. I confirm I did not use AI to generate any artifact listed in the prohibited category."</w:t>
+        <w:t>Specifications, Domain Models, BVA tables, test cases, automation scripts, execution summaries, defect/gap analyses, traceability matrices, report sections, AI-compliance documents, and Agent Skills were initially generated or materially revised by OpenAI Codex. I reviewed the work through the recorded artifact gates and checked it against the assignment, SRS, API contract, SHOP source, database schema, results.json, screenshots, traces, service logs, and Git history. Physical-device screenshots were captured by the student, not generated by AI. AI also drafted bug-report content; this contribution is disclosed and is not represented as entirely student-written. The detailed AI Audit Report and full prompt log are attached as Appendix A. The assignment labels the AI Policy as Open and lists no anti-AI-cheat constraints; if separate Moodle or course guidance defines a prohibited category, the affected material must be revised by the student before signing.</w:t>
       </w:r>
     </w:p>
     <w:p>
@@ -2969,9 +3064,13 @@
             <w:tcW w:w="6520" w:type="dxa"/>
           </w:tcPr>
           <w:p>
-            <w:pPr>
-              <w:cnfStyle w:val="100000000000" w:firstRow="1" w:lastRow="0" w:firstColumn="0" w:lastColumn="0" w:oddVBand="0" w:evenVBand="0" w:oddHBand="0" w:evenHBand="0" w:firstRowFirstColumn="0" w:firstRowLastColumn="0" w:lastRowFirstColumn="0" w:lastRowLastColumn="0"/>
-            </w:pPr>
+            <w:r>
+              <w:rPr>
+                <w:rFonts w:ascii="Arial" w:hAnsi="Arial"/>
+                <w:sz w:val="16"/>
+              </w:rPr>
+              <w:t>Nguyễn Phúc Hậu</w:t>
+            </w:r>
           </w:p>
         </w:tc>
       </w:tr>
@@ -3000,9 +3099,13 @@
             <w:tcW w:w="6520" w:type="dxa"/>
           </w:tcPr>
           <w:p>
-            <w:pPr>
-              <w:cnfStyle w:val="000000100000" w:firstRow="0" w:lastRow="0" w:firstColumn="0" w:lastColumn="0" w:oddVBand="0" w:evenVBand="0" w:oddHBand="1" w:evenHBand="0" w:firstRowFirstColumn="0" w:firstRowLastColumn="0" w:lastRowFirstColumn="0" w:lastRowLastColumn="0"/>
-            </w:pPr>
+            <w:r>
+              <w:rPr>
+                <w:rFonts w:ascii="Arial" w:hAnsi="Arial"/>
+                <w:sz w:val="16"/>
+              </w:rPr>
+              <w:t>23120252</w:t>
+            </w:r>
           </w:p>
         </w:tc>
       </w:tr>
@@ -3031,9 +3134,13 @@
             <w:tcW w:w="6520" w:type="dxa"/>
           </w:tcPr>
           <w:p>
-            <w:pPr>
-              <w:cnfStyle w:val="000000010000" w:firstRow="0" w:lastRow="0" w:firstColumn="0" w:lastColumn="0" w:oddVBand="0" w:evenVBand="0" w:oddHBand="0" w:evenHBand="1" w:firstRowFirstColumn="0" w:firstRowLastColumn="0" w:lastRowFirstColumn="0" w:lastRowLastColumn="0"/>
-            </w:pPr>
+            <w:r>
+              <w:rPr>
+                <w:rFonts w:ascii="Arial" w:hAnsi="Arial"/>
+                <w:sz w:val="16"/>
+              </w:rPr>
+              <w:t>CQ2023/31</w:t>
+            </w:r>
           </w:p>
         </w:tc>
       </w:tr>
@@ -3114,9 +3221,13 @@
             <w:tcW w:w="6520" w:type="dxa"/>
           </w:tcPr>
           <w:p>
-            <w:pPr>
-              <w:cnfStyle w:val="000000010000" w:firstRow="0" w:lastRow="0" w:firstColumn="0" w:lastColumn="0" w:oddVBand="0" w:evenVBand="0" w:oddHBand="0" w:evenHBand="1" w:firstRowFirstColumn="0" w:firstRowLastColumn="0" w:lastRowFirstColumn="0" w:lastRowLastColumn="0"/>
-            </w:pPr>
+            <w:r>
+              <w:rPr>
+                <w:rFonts w:ascii="Arial" w:hAnsi="Arial"/>
+                <w:sz w:val="16"/>
+              </w:rPr>
+              <w:t>Trần Thị Bích Hạnh; Trương Phước Lộc; Hồ Tuấn Thanh</w:t>
+            </w:r>
           </w:p>
         </w:tc>
       </w:tr>
@@ -3145,9 +3256,13 @@
             <w:tcW w:w="6520" w:type="dxa"/>
           </w:tcPr>
           <w:p>
-            <w:pPr>
-              <w:cnfStyle w:val="000000100000" w:firstRow="0" w:lastRow="0" w:firstColumn="0" w:lastColumn="0" w:oddVBand="0" w:evenVBand="0" w:oddHBand="1" w:evenHBand="0" w:firstRowFirstColumn="0" w:firstRowLastColumn="0" w:lastRowFirstColumn="0" w:lastRowLastColumn="0"/>
-            </w:pPr>
+            <w:r>
+              <w:rPr>
+                <w:rFonts w:ascii="Arial" w:hAnsi="Arial"/>
+                <w:sz w:val="16"/>
+              </w:rPr>
+              <w:t>2026-10-16</w:t>
+            </w:r>
           </w:p>
         </w:tc>
       </w:tr>
@@ -3176,9 +3291,13 @@
             <w:tcW w:w="6520" w:type="dxa"/>
           </w:tcPr>
           <w:p>
-            <w:pPr>
-              <w:cnfStyle w:val="000000010000" w:firstRow="0" w:lastRow="0" w:firstColumn="0" w:lastColumn="0" w:oddVBand="0" w:evenVBand="0" w:oddHBand="0" w:evenHBand="1" w:firstRowFirstColumn="0" w:firstRowLastColumn="0" w:lastRowFirstColumn="0" w:lastRowLastColumn="0"/>
-            </w:pPr>
+            <w:r>
+              <w:rPr>
+                <w:rFonts w:ascii="Arial" w:hAnsi="Arial"/>
+                <w:sz w:val="16"/>
+              </w:rPr>
+              <w:t/>
+            </w:r>
           </w:p>
         </w:tc>
       </w:tr>
@@ -3212,8 +3331,9 @@
       <w:r>
         <w:rPr>
           <w:rFonts w:ascii="Arial" w:hAnsi="Arial"/>
+          <w:sz w:val="18"/>
         </w:rPr>
-        <w:t>ISTQB Foundation Level Syllabus (latest version).</w:t>
+        <w:t>ISTQB. (2024). Certified Tester Foundation Level Syllabus v4.0.1.</w:t>
       </w:r>
     </w:p>
     <w:p>

</xml_diff>

<commit_message>
docs: finalize self-assessment and AI review verdicts
</commit_message>
<xml_diff>
--- a/ai/AI-02_AI_Audit_Report_Working.docx
+++ b/ai/AI-02_AI_Audit_Report_Working.docx
@@ -2643,7 +2643,7 @@
           </w:tcPr>
           <w:p>
             <w:r>
-              <w:t xml:space="preserve">PENDING HUMAN REVIEW</w:t>
+              <w:t xml:space="preserve">VALID</w:t>
             </w:r>
           </w:p>
         </w:tc>
@@ -2653,7 +2653,7 @@
           </w:tcPr>
           <w:p>
             <w:r>
-              <w:t xml:space="preserve">ISTQB CTFL v4.0.1 §4.2.1–4.2.2 cho EP/BVA; HW02 assignment yêu cầu report, evidence, AI disclosure/audit và traceability. Nội dung được đối chiếu với 9 ảnh iOS, results.json, feature closure và lịch sử S001-I003/S001-I058; canonical verdict không đổi.</w:t>
+              <w:t xml:space="preserve">Sources: ISTQB CTFL v4.0.1 §4.2.1–4.2.2 cho EP/BVA; HW02 assignment yêu cầu report, evidence, AI disclosure/audit và traceability. Nội dung được đối chiếu với 9 ảnh iOS, results.json, feature closure và lịch sử S001-I003/S001-I058; canonical verdict không đổi.</w:t>
             </w:r>
           </w:p>
         </w:tc>
@@ -2663,7 +2663,64 @@
           </w:tcPr>
           <w:p>
             <w:r>
-              <w:t xml:space="preserve">Chưa ghi nhận verdict của sinh viên cho ART046; ART043 giữ VALID.</w:t>
+              <w:t xml:space="preserve">Sinh viên xác nhận đã review toàn bộ nội dung ART046 và chấp nhận artifact là VALID vào 2026-10-16.</w:t>
+            </w:r>
+          </w:p>
+        </w:tc>
+      </w:tr>
+      <w:tr>
+        <w:trPr>
+          <w:cnfStyle w:val="000000010000" w:firstRow="0" w:lastRow="0" w:firstColumn="0" w:lastColumn="0" w:oddVBand="0" w:evenVBand="0" w:oddHBand="0" w:evenHBand="1" w:firstRowFirstColumn="0" w:firstRowLastColumn="0" w:lastRowFirstColumn="0" w:lastRowLastColumn="0"/>
+        </w:trPr>
+        <w:tc>
+          <w:tcPr>
+            <w:cnfStyle w:val="001000000000" w:firstRow="0" w:lastRow="0" w:firstColumn="1" w:lastColumn="0" w:oddVBand="0" w:evenVBand="0" w:oddHBand="0" w:evenHBand="0" w:firstRowFirstColumn="0" w:firstRowLastColumn="0" w:lastRowFirstColumn="0" w:lastRowLastColumn="0"/>
+            <w:tcW w:w="2154" w:type="dxa"/>
+          </w:tcPr>
+          <w:p>
+            <w:r>
+              <w:t xml:space="preserve">ART047
+S001-I062 — OpenAI Codex, codex gpt-5.6 sol, medium; 2026-10-16 15:23:21 +07:00</w:t>
+            </w:r>
+          </w:p>
+        </w:tc>
+        <w:tc>
+          <w:tcPr>
+            <w:tcW w:w="2041" w:type="dxa"/>
+          </w:tcPr>
+          <w:p>
+            <w:r>
+              <w:t xml:space="preserve">Đồng bộ điểm Agent Skills từ 6/10 lên 10/10 và tổng self-assessment từ 80/100 lên 84/100 trong README, báo cáo Markdown và LaTeX; căn cứ vào ba Agent Skills có tài liệu sử dụng, execution contract và video demo công khai.</w:t>
+            </w:r>
+          </w:p>
+        </w:tc>
+        <w:tc>
+          <w:tcPr>
+            <w:tcW w:w="1020" w:type="dxa"/>
+          </w:tcPr>
+          <w:p>
+            <w:r>
+              <w:t xml:space="preserve">VALID</w:t>
+            </w:r>
+          </w:p>
+        </w:tc>
+        <w:tc>
+          <w:tcPr>
+            <w:tcW w:w="2268" w:type="dxa"/>
+          </w:tcPr>
+          <w:p>
+            <w:r>
+              <w:t xml:space="preserve">Đề HW02 dành 10 điểm cho Agent Skills và yêu cầu demo. Repository có ba skill được tài liệu hóa, có execution contract và video demo tại https://youtu.be/i2ECLTh1AEU; tổng số học là 20+22+21+11+10=84.</w:t>
+            </w:r>
+          </w:p>
+        </w:tc>
+        <w:tc>
+          <w:tcPr>
+            <w:tcW w:w="2154" w:type="dxa"/>
+          </w:tcPr>
+          <w:p>
+            <w:r>
+              <w:t xml:space="preserve">Sinh viên xác nhận đã review mức Agent Skills 10/10 và tổng self-assessment 84/100; artifact được chấp nhận là VALID vào 2026-10-16.</w:t>
             </w:r>
           </w:p>
         </w:tc>
@@ -2785,7 +2842,7 @@
           </w:tcPr>
           <w:p>
             <w:r>
-              <w:t xml:space="preserve">33</w:t>
+              <w:t xml:space="preserve">35</w:t>
             </w:r>
           </w:p>
         </w:tc>
@@ -2829,7 +2886,7 @@
           </w:tcPr>
           <w:p>
             <w:r>
-              <w:t xml:space="preserve">32</w:t>
+              <w:t xml:space="preserve">34</w:t>
             </w:r>
           </w:p>
         </w:tc>
@@ -2839,7 +2896,7 @@
           </w:tcPr>
           <w:p>
             <w:r>
-              <w:t xml:space="preserve">96.97%</w:t>
+              <w:t xml:space="preserve">97.14%</w:t>
             </w:r>
           </w:p>
         </w:tc>
@@ -2919,7 +2976,7 @@
           </w:tcPr>
           <w:p>
             <w:r>
-              <w:t xml:space="preserve">3.03%</w:t>
+              <w:t xml:space="preserve">2.86%</w:t>
             </w:r>
           </w:p>
         </w:tc>

</xml_diff>